<commit_message>
diploma pz translate abstract
</commit_message>
<xml_diff>
--- a/42D Dyplom/KNT-122_Onyshchenko_PZ.docx
+++ b/42D Dyplom/KNT-122_Onyshchenko_PZ.docx
@@ -5809,181 +5809,195 @@
       </w:pPr>
       <w:r>
         <w:rPr>
-          <w:lang w:val="uk-UA"/>
-        </w:rPr>
-        <w:t xml:space="preserve">Explanatory note to the diploma qualifying work of the </w:t>
-      </w:r>
-      <w:r>
-        <w:rPr>
           <w:lang w:val="en-US"/>
         </w:rPr>
-        <w:t>master</w:t>
-      </w:r>
-      <w:r>
-        <w:rPr>
-          <w:lang w:val="uk-UA"/>
-        </w:rPr>
-        <w:t xml:space="preserve">: </w:t>
-      </w:r>
+        <w:t>The explanatory note to the bachelor's thesis contains: 20 pages, 6 tables, 1 figure, 3 appendices, 5 sources.</w:t>
+      </w:r>
+    </w:p>
+    <w:p>
+      <w:pPr>
+        <w:pStyle w:val="Normal"/>
+        <w:rPr>
+          <w:lang w:val="uk-UA"/>
+        </w:rPr>
+      </w:pPr>
       <w:r>
         <w:rPr>
           <w:lang w:val="en-US"/>
         </w:rPr>
-        <w:t>72</w:t>
-      </w:r>
-      <w:r>
-        <w:rPr>
-          <w:lang w:val="uk-UA"/>
-        </w:rPr>
-        <w:t xml:space="preserve"> pages, 12 figures, 2 tables, 3 appendixes, 11 sources.</w:t>
-      </w:r>
-    </w:p>
-    <w:p>
-      <w:pPr>
-        <w:pStyle w:val="Normal"/>
-        <w:spacing w:lineRule="auto" w:line="336"/>
-        <w:rPr>
-          <w:lang w:val="uk-UA"/>
-        </w:rPr>
-      </w:pPr>
-      <w:r>
-        <w:rPr>
-          <w:lang w:val="uk-UA"/>
-        </w:rPr>
-      </w:r>
-    </w:p>
-    <w:p>
-      <w:pPr>
-        <w:pStyle w:val="Normal"/>
-        <w:spacing w:lineRule="auto" w:line="336"/>
-        <w:rPr>
-          <w:lang w:val="uk-UA"/>
-        </w:rPr>
-      </w:pPr>
-      <w:r>
-        <w:rPr>
-          <w:lang w:val="uk-UA"/>
-        </w:rPr>
-        <w:t>CEREBRAL PALSY, REHABILITATION, MICROSOFT KINECT, COMPUTER PROGRAM, INTERACTIVE GAME.</w:t>
-      </w:r>
-    </w:p>
-    <w:p>
-      <w:pPr>
-        <w:pStyle w:val="Normal"/>
-        <w:spacing w:lineRule="auto" w:line="336"/>
-        <w:rPr>
-          <w:lang w:val="uk-UA"/>
-        </w:rPr>
-      </w:pPr>
-      <w:r>
-        <w:rPr>
-          <w:lang w:val="uk-UA"/>
-        </w:rPr>
-      </w:r>
-    </w:p>
-    <w:p>
-      <w:pPr>
-        <w:pStyle w:val="Normal"/>
-        <w:spacing w:lineRule="auto" w:line="336"/>
-        <w:rPr>
-          <w:lang w:val="uk-UA"/>
-        </w:rPr>
-      </w:pPr>
-      <w:r>
-        <w:rPr>
-          <w:lang w:val="uk-UA"/>
-        </w:rPr>
-        <w:t>Object of study is a software for the rehabilitation of patients.</w:t>
-      </w:r>
-    </w:p>
-    <w:p>
-      <w:pPr>
-        <w:pStyle w:val="Normal"/>
-        <w:spacing w:lineRule="auto" w:line="336"/>
-        <w:rPr>
-          <w:lang w:val="uk-UA"/>
-        </w:rPr>
-      </w:pPr>
-      <w:r>
-        <w:rPr>
-          <w:lang w:val="uk-UA"/>
-        </w:rPr>
-        <w:t>Subject of study are computer programs for the rehabilitation of patients with cerebral palsy.</w:t>
-      </w:r>
-    </w:p>
-    <w:p>
-      <w:pPr>
-        <w:pStyle w:val="Normal"/>
-        <w:spacing w:lineRule="auto" w:line="336"/>
-        <w:rPr>
-          <w:lang w:val="uk-UA"/>
-        </w:rPr>
-      </w:pPr>
-      <w:r>
-        <w:rPr>
-          <w:lang w:val="uk-UA"/>
-        </w:rPr>
-        <w:t>The purpose of the work is to create a software system for the automation and acceleration of the rehabilitation of the child under the supervision of a physician or for home use under the parents supervision.</w:t>
-      </w:r>
-    </w:p>
-    <w:p>
-      <w:pPr>
-        <w:pStyle w:val="Normal"/>
-        <w:spacing w:lineRule="auto" w:line="336"/>
-        <w:rPr>
-          <w:lang w:val="uk-UA"/>
-        </w:rPr>
-      </w:pPr>
-      <w:r>
-        <w:rPr>
-          <w:lang w:val="uk-UA"/>
-        </w:rPr>
-        <w:t>Materials, methods, and tools: structured and object-oriented programming, Microsoft Kinect technology and device, programming languages C++, UnrealScript and ActionScript, integrated development environments Microsoft Visual Studio 2010, Unreal Development Kit, Adobe Flash Professional, IBM-compatible personal computer with an Intel Core 2 Duo processor under the control of the Microsoft Windows 7 operating system.</w:t>
-      </w:r>
-    </w:p>
-    <w:p>
-      <w:pPr>
-        <w:pStyle w:val="Normal"/>
-        <w:spacing w:lineRule="auto" w:line="336"/>
-        <w:rPr>
-          <w:lang w:val="uk-UA"/>
-        </w:rPr>
-      </w:pPr>
-      <w:r>
-        <w:rPr>
-          <w:lang w:val="uk-UA"/>
-        </w:rPr>
-        <w:t>Results. The Windows software application is created which powered by the Kinectdevice, which interacts with the child in the form of a three-dimensional interactive game and motivates it to motion.</w:t>
-      </w:r>
-    </w:p>
-    <w:p>
-      <w:pPr>
-        <w:pStyle w:val="Normal"/>
-        <w:spacing w:lineRule="auto" w:line="336"/>
-        <w:rPr>
-          <w:lang w:val="uk-UA"/>
-        </w:rPr>
-      </w:pPr>
-      <w:r>
-        <w:rPr>
-          <w:lang w:val="uk-UA"/>
-        </w:rPr>
-        <w:t>Conclusions A software system for the rehabilitation of children with cerebral palsy has been developed. It automates and accelerates the process of the child rehabilitation.</w:t>
-      </w:r>
-    </w:p>
-    <w:p>
-      <w:pPr>
-        <w:pStyle w:val="Normal"/>
-        <w:spacing w:lineRule="auto" w:line="336"/>
+      </w:r>
+    </w:p>
+    <w:p>
+      <w:pPr>
+        <w:pStyle w:val="Normal"/>
+        <w:rPr>
+          <w:lang w:val="uk-UA"/>
+        </w:rPr>
+      </w:pPr>
+      <w:r>
         <w:rPr>
           <w:lang w:val="en-US"/>
         </w:rPr>
-      </w:pPr>
-      <w:r>
-        <w:rPr>
-          <w:lang w:val="uk-UA"/>
-        </w:rPr>
-        <w:t>The field of use is a patients rehabilitation in medical institutions by neuropathologists or at home by parents.</w:t>
+        <w:t>INTERNET STORE FOR TRUCKS, STORE FOR GOODS, APPLICATION FOR DESKTOP COMPUTERS, WINFORMS, C</w:t>
+      </w:r>
+      <w:r>
+        <w:rPr>
+          <w:lang w:val="en-US"/>
+        </w:rPr>
+        <w:t>#</w:t>
+      </w:r>
+    </w:p>
+    <w:p>
+      <w:pPr>
+        <w:pStyle w:val="Normal"/>
+        <w:rPr>
+          <w:lang w:val="uk-UA"/>
+        </w:rPr>
+      </w:pPr>
+      <w:r>
+        <w:rPr>
+          <w:lang w:val="en-US"/>
+        </w:rPr>
+      </w:r>
+    </w:p>
+    <w:p>
+      <w:pPr>
+        <w:pStyle w:val="Normal"/>
+        <w:rPr>
+          <w:lang w:val="uk-UA"/>
+        </w:rPr>
+      </w:pPr>
+      <w:r>
+        <w:rPr>
+          <w:lang w:val="en-US"/>
+        </w:rPr>
+        <w:t>The object of research is software for selling trucks.</w:t>
+      </w:r>
+    </w:p>
+    <w:p>
+      <w:pPr>
+        <w:pStyle w:val="Normal"/>
+        <w:rPr>
+          <w:lang w:val="uk-UA"/>
+        </w:rPr>
+      </w:pPr>
+      <w:r>
+        <w:rPr>
+          <w:lang w:val="en-US"/>
+        </w:rPr>
+        <w:t>The subject of the study is computer programs for purchasing trucks.</w:t>
+      </w:r>
+    </w:p>
+    <w:p>
+      <w:pPr>
+        <w:pStyle w:val="Normal"/>
+        <w:rPr>
+          <w:lang w:val="uk-UA"/>
+        </w:rPr>
+      </w:pPr>
+      <w:r>
+        <w:rPr>
+          <w:lang w:val="en-US"/>
+        </w:rPr>
+        <w:t>The purpose of the work is to create a software system for ordering trucks.</w:t>
+      </w:r>
+    </w:p>
+    <w:p>
+      <w:pPr>
+        <w:pStyle w:val="Normal"/>
+        <w:rPr>
+          <w:lang w:val="uk-UA"/>
+        </w:rPr>
+      </w:pPr>
+      <w:r>
+        <w:rPr>
+          <w:lang w:val="en-US"/>
+        </w:rPr>
+        <w:t>Materials, methods, and technical means: use of open sources of information and well-known development tools: C#, WinForms.</w:t>
+      </w:r>
+    </w:p>
+    <w:p>
+      <w:pPr>
+        <w:pStyle w:val="Normal"/>
+        <w:rPr>
+          <w:lang w:val="uk-UA"/>
+        </w:rPr>
+      </w:pPr>
+      <w:r>
+        <w:rPr>
+          <w:lang w:val="en-US"/>
+        </w:rPr>
+        <w:t>The result of the work should be a finished program, an explanatory note, and a project presentation.</w:t>
+      </w:r>
+    </w:p>
+    <w:p>
+      <w:pPr>
+        <w:pStyle w:val="Normal"/>
+        <w:rPr>
+          <w:lang w:val="uk-UA"/>
+        </w:rPr>
+      </w:pPr>
+      <w:r>
+        <w:rPr>
+          <w:lang w:val="en-US"/>
+        </w:rPr>
+        <w:t>Success indicators:</w:t>
+      </w:r>
+    </w:p>
+    <w:p>
+      <w:pPr>
+        <w:pStyle w:val="Normal"/>
+        <w:rPr>
+          <w:lang w:val="uk-UA"/>
+        </w:rPr>
+      </w:pPr>
+      <w:r>
+        <w:rPr>
+          <w:lang w:val="en-US"/>
+        </w:rPr>
+        <w:t>- Explanatory note in accordance with requirements;</w:t>
+      </w:r>
+    </w:p>
+    <w:p>
+      <w:pPr>
+        <w:pStyle w:val="Normal"/>
+        <w:rPr>
+          <w:lang w:val="uk-UA"/>
+        </w:rPr>
+      </w:pPr>
+      <w:r>
+        <w:rPr>
+          <w:lang w:val="en-US"/>
+        </w:rPr>
+        <w:t>- Formatted presentation;</w:t>
+      </w:r>
+    </w:p>
+    <w:p>
+      <w:pPr>
+        <w:pStyle w:val="Normal"/>
+        <w:rPr>
+          <w:lang w:val="uk-UA"/>
+        </w:rPr>
+      </w:pPr>
+      <w:r>
+        <w:rPr>
+          <w:lang w:val="en-US"/>
+        </w:rPr>
+        <w:t>- Working program.</w:t>
+      </w:r>
+    </w:p>
+    <w:p>
+      <w:pPr>
+        <w:pStyle w:val="Normal"/>
+        <w:rPr>
+          <w:lang w:val="uk-UA"/>
+        </w:rPr>
+      </w:pPr>
+      <w:r>
+        <w:rPr>
+          <w:lang w:val="en-US"/>
+        </w:rPr>
+        <w:t>Conclusions — a software system for selling trucks has been developed.</w:t>
       </w:r>
       <w:r>
         <w:br w:type="page"/>

</xml_diff>

<commit_message>
more diploma work, praise King Jesus Christ our LORD
</commit_message>
<xml_diff>
--- a/42D Dyplom/KNT-122_Onyshchenko_PZ.docx
+++ b/42D Dyplom/KNT-122_Onyshchenko_PZ.docx
@@ -1450,19 +1450,18 @@
     </w:p>
     <w:p>
       <w:pPr>
-        <w:pStyle w:val="Heading1"/>
-        <w:jc w:val="start"/>
-        <w:rPr>
-          <w:b w:val="false"/>
-          <w:bCs w:val="false"/>
-          <w:szCs w:val="28"/>
-        </w:rPr>
-      </w:pPr>
-      <w:r>
-        <w:rPr>
-          <w:b w:val="false"/>
-          <w:bCs w:val="false"/>
-          <w:szCs w:val="28"/>
+        <w:pStyle w:val="Normal"/>
+        <w:spacing w:lineRule="auto" w:line="240"/>
+        <w:ind w:hanging="0"/>
+        <w:jc w:val="center"/>
+        <w:rPr>
+          <w:vertAlign w:val="superscript"/>
+          <w:lang w:val="uk-UA"/>
+        </w:rPr>
+      </w:pPr>
+      <w:r>
+        <w:rPr>
+          <w:lang w:val="uk-UA"/>
         </w:rPr>
       </w:r>
     </w:p>
@@ -5838,12 +5837,54 @@
         <w:rPr>
           <w:lang w:val="en-US"/>
         </w:rPr>
-        <w:t>INTERNET STORE FOR TRUCKS, STORE FOR GOODS, APPLICATION FOR DESKTOP COMPUTERS, WINFORMS, C</w:t>
+        <w:t>ONLINE</w:t>
       </w:r>
       <w:r>
         <w:rPr>
           <w:lang w:val="en-US"/>
         </w:rPr>
+        <w:t xml:space="preserve"> </w:t>
+      </w:r>
+      <w:r>
+        <w:rPr>
+          <w:lang w:val="en-US"/>
+        </w:rPr>
+        <w:t xml:space="preserve">TRUCKS </w:t>
+      </w:r>
+      <w:r>
+        <w:rPr>
+          <w:lang w:val="en-US"/>
+        </w:rPr>
+        <w:t xml:space="preserve">STORE, </w:t>
+      </w:r>
+      <w:r>
+        <w:rPr>
+          <w:lang w:val="en-US"/>
+        </w:rPr>
+        <w:t>E-</w:t>
+      </w:r>
+      <w:r>
+        <w:rPr>
+          <w:lang w:val="en-US"/>
+        </w:rPr>
+        <w:t xml:space="preserve">STORE, </w:t>
+      </w:r>
+      <w:r>
+        <w:rPr>
+          <w:lang w:val="en-US"/>
+        </w:rPr>
+        <w:t xml:space="preserve">DESKTOP </w:t>
+      </w:r>
+      <w:r>
+        <w:rPr>
+          <w:lang w:val="en-US"/>
+        </w:rPr>
+        <w:t>APPLICATION, WINFORMS, C</w:t>
+      </w:r>
+      <w:r>
+        <w:rPr>
+          <w:lang w:val="en-US"/>
+        </w:rPr>
         <w:t>#</w:t>
       </w:r>
     </w:p>
@@ -5969,7 +6010,19 @@
         <w:rPr>
           <w:lang w:val="en-US"/>
         </w:rPr>
-        <w:t>- Formatted presentation;</w:t>
+        <w:t>- Form</w:t>
+      </w:r>
+      <w:r>
+        <w:rPr>
+          <w:lang w:val="en-US"/>
+        </w:rPr>
+        <w:t>e</w:t>
+      </w:r>
+      <w:r>
+        <w:rPr>
+          <w:lang w:val="en-US"/>
+        </w:rPr>
+        <w:t>d presentation;</w:t>
       </w:r>
     </w:p>
     <w:p>
@@ -6942,15 +6995,17 @@
                 <w:tab w:val="clear" w:pos="709"/>
                 <w:tab w:val="left" w:pos="8010" w:leader="none"/>
               </w:tabs>
-              <w:rPr>
-                <w:lang w:val="uk-UA"/>
-              </w:rPr>
-            </w:pPr>
-            <w:r>
-              <w:rPr>
-                <w:lang w:val="uk-UA"/>
-              </w:rPr>
-              <w:t>API</w:t>
+              <w:spacing w:lineRule="auto" w:line="240"/>
+              <w:ind w:hanging="0" w:start="0"/>
+              <w:rPr>
+                <w:lang w:val="en-US"/>
+              </w:rPr>
+            </w:pPr>
+            <w:r>
+              <w:rPr>
+                <w:lang w:val="en-US"/>
+              </w:rPr>
+              <w:t>C#</w:t>
             </w:r>
           </w:p>
         </w:tc>
@@ -6967,6 +7022,7 @@
                 <w:tab w:val="clear" w:pos="709"/>
                 <w:tab w:val="left" w:pos="8010" w:leader="none"/>
               </w:tabs>
+              <w:spacing w:lineRule="auto" w:line="240"/>
               <w:ind w:hanging="0"/>
               <w:rPr>
                 <w:lang w:val="uk-UA"/>
@@ -6976,13 +7032,7 @@
               <w:rPr>
                 <w:lang w:val="uk-UA"/>
               </w:rPr>
-              <w:t>– </w:t>
-            </w:r>
-            <w:r>
-              <w:rPr>
-                <w:lang w:val="uk-UA"/>
-              </w:rPr>
-              <w:t>Application Programming Interface;</w:t>
+              <w:t>Мова програмування зі статичної типізацією</w:t>
             </w:r>
           </w:p>
         </w:tc>
@@ -6998,15 +7048,21 @@
           <w:p>
             <w:pPr>
               <w:pStyle w:val="Normal"/>
-              <w:rPr>
-                <w:lang w:val="uk-UA"/>
-              </w:rPr>
-            </w:pPr>
-            <w:r>
-              <w:rPr>
-                <w:lang w:val="uk-UA"/>
-              </w:rPr>
-              <w:t>CDMA</w:t>
+              <w:tabs>
+                <w:tab w:val="clear" w:pos="709"/>
+                <w:tab w:val="left" w:pos="8010" w:leader="none"/>
+              </w:tabs>
+              <w:spacing w:lineRule="auto" w:line="240"/>
+              <w:ind w:hanging="0" w:start="0"/>
+              <w:rPr>
+                <w:lang w:val="en-US"/>
+              </w:rPr>
+            </w:pPr>
+            <w:r>
+              <w:rPr>
+                <w:lang w:val="en-US"/>
+              </w:rPr>
+              <w:t>WinForms</w:t>
             </w:r>
           </w:p>
         </w:tc>
@@ -7019,869 +7075,11 @@
           <w:p>
             <w:pPr>
               <w:pStyle w:val="Normal"/>
-              <w:ind w:hanging="0"/>
-              <w:rPr>
-                <w:lang w:val="uk-UA"/>
-              </w:rPr>
-            </w:pPr>
-            <w:r>
-              <w:rPr>
-                <w:lang w:val="uk-UA"/>
-              </w:rPr>
-              <w:t>– </w:t>
-            </w:r>
-            <w:r>
-              <w:rPr>
-                <w:lang w:val="uk-UA"/>
-              </w:rPr>
-              <w:t>Codе Division Multiple Access;</w:t>
-            </w:r>
-          </w:p>
-        </w:tc>
-      </w:tr>
-      <w:tr>
-        <w:trPr/>
-        <w:tc>
-          <w:tcPr>
-            <w:tcW w:w="1799" w:type="dxa"/>
-            <w:tcBorders/>
-            <w:shd w:color="auto" w:fill="auto" w:val="clear"/>
-          </w:tcPr>
-          <w:p>
-            <w:pPr>
-              <w:pStyle w:val="Normal"/>
-              <w:rPr>
-                <w:lang w:val="uk-UA"/>
-              </w:rPr>
-            </w:pPr>
-            <w:r>
-              <w:rPr>
-                <w:lang w:val="uk-UA"/>
-              </w:rPr>
-              <w:t xml:space="preserve">IDE </w:t>
-            </w:r>
-          </w:p>
-        </w:tc>
-        <w:tc>
-          <w:tcPr>
-            <w:tcW w:w="7561" w:type="dxa"/>
-            <w:tcBorders/>
-            <w:shd w:color="auto" w:fill="auto" w:val="clear"/>
-          </w:tcPr>
-          <w:p>
-            <w:pPr>
-              <w:pStyle w:val="Normal"/>
-              <w:ind w:hanging="0"/>
-              <w:rPr>
-                <w:lang w:val="uk-UA"/>
-              </w:rPr>
-            </w:pPr>
-            <w:r>
-              <w:rPr>
-                <w:lang w:val="uk-UA"/>
-              </w:rPr>
-              <w:t>– </w:t>
-            </w:r>
-            <w:r>
-              <w:rPr>
-                <w:lang w:val="uk-UA"/>
-              </w:rPr>
-              <w:t>Integrated Development Environment,</w:t>
-            </w:r>
-          </w:p>
-        </w:tc>
-      </w:tr>
-      <w:tr>
-        <w:trPr/>
-        <w:tc>
-          <w:tcPr>
-            <w:tcW w:w="1799" w:type="dxa"/>
-            <w:tcBorders/>
-            <w:shd w:color="auto" w:fill="auto" w:val="clear"/>
-          </w:tcPr>
-          <w:p>
-            <w:pPr>
-              <w:pStyle w:val="Normal"/>
-              <w:rPr>
-                <w:lang w:val="uk-UA"/>
-              </w:rPr>
-            </w:pPr>
-            <w:r>
-              <w:rPr>
-                <w:lang w:val="uk-UA"/>
-              </w:rPr>
-              <w:t>PGA</w:t>
-            </w:r>
-          </w:p>
-        </w:tc>
-        <w:tc>
-          <w:tcPr>
-            <w:tcW w:w="7561" w:type="dxa"/>
-            <w:tcBorders/>
-            <w:shd w:color="auto" w:fill="auto" w:val="clear"/>
-          </w:tcPr>
-          <w:p>
-            <w:pPr>
-              <w:pStyle w:val="Normal"/>
-              <w:ind w:hanging="0"/>
-              <w:rPr>
-                <w:lang w:val="uk-UA"/>
-              </w:rPr>
-            </w:pPr>
-            <w:r>
-              <w:rPr>
-                <w:lang w:val="uk-UA"/>
-              </w:rPr>
-              <w:t>– </w:t>
-            </w:r>
-            <w:r>
-              <w:rPr>
-                <w:lang w:val="uk-UA"/>
-              </w:rPr>
-              <w:t>Programmable-Gain Amplifier;</w:t>
-            </w:r>
-          </w:p>
-        </w:tc>
-      </w:tr>
-      <w:tr>
-        <w:trPr/>
-        <w:tc>
-          <w:tcPr>
-            <w:tcW w:w="1799" w:type="dxa"/>
-            <w:tcBorders/>
-            <w:shd w:color="auto" w:fill="auto" w:val="clear"/>
-          </w:tcPr>
-          <w:p>
-            <w:pPr>
-              <w:pStyle w:val="Normal"/>
-              <w:rPr>
-                <w:lang w:val="uk-UA"/>
-              </w:rPr>
-            </w:pPr>
-            <w:r>
-              <w:rPr>
-                <w:lang w:val="uk-UA"/>
-              </w:rPr>
-              <w:t>PsoC</w:t>
-            </w:r>
-          </w:p>
-        </w:tc>
-        <w:tc>
-          <w:tcPr>
-            <w:tcW w:w="7561" w:type="dxa"/>
-            <w:tcBorders/>
-            <w:shd w:color="auto" w:fill="auto" w:val="clear"/>
-          </w:tcPr>
-          <w:p>
-            <w:pPr>
-              <w:pStyle w:val="Normal"/>
-              <w:ind w:hanging="0"/>
-              <w:rPr>
-                <w:lang w:val="uk-UA"/>
-              </w:rPr>
-            </w:pPr>
-            <w:r>
-              <w:rPr>
-                <w:lang w:val="uk-UA"/>
-              </w:rPr>
-              <w:t>– </w:t>
-            </w:r>
-            <w:r>
-              <w:rPr>
-                <w:lang w:val="uk-UA"/>
-              </w:rPr>
-              <w:t>Programmable System-on-Chip;</w:t>
-            </w:r>
-          </w:p>
-        </w:tc>
-      </w:tr>
-      <w:tr>
-        <w:trPr/>
-        <w:tc>
-          <w:tcPr>
-            <w:tcW w:w="1799" w:type="dxa"/>
-            <w:tcBorders/>
-            <w:shd w:color="auto" w:fill="auto" w:val="clear"/>
-          </w:tcPr>
-          <w:p>
-            <w:pPr>
-              <w:pStyle w:val="Normal"/>
-              <w:rPr>
-                <w:lang w:val="uk-UA"/>
-              </w:rPr>
-            </w:pPr>
-            <w:r>
-              <w:rPr>
-                <w:lang w:val="en-US"/>
-              </w:rPr>
-              <w:t xml:space="preserve">RTL </w:t>
-            </w:r>
-          </w:p>
-        </w:tc>
-        <w:tc>
-          <w:tcPr>
-            <w:tcW w:w="7561" w:type="dxa"/>
-            <w:tcBorders/>
-            <w:shd w:color="auto" w:fill="auto" w:val="clear"/>
-          </w:tcPr>
-          <w:p>
-            <w:pPr>
-              <w:pStyle w:val="Normal"/>
-              <w:ind w:hanging="0"/>
-              <w:rPr>
-                <w:lang w:val="en-US"/>
-              </w:rPr>
-            </w:pPr>
-            <w:r>
-              <w:rPr>
-                <w:lang w:val="uk-UA"/>
-              </w:rPr>
-              <w:t>– </w:t>
-            </w:r>
-            <w:r>
-              <w:rPr>
-                <w:lang w:val="uk-UA"/>
-              </w:rPr>
-              <w:t>Register Transfer Level</w:t>
-            </w:r>
-            <w:r>
-              <w:rPr>
-                <w:rFonts w:cs="Arial" w:ascii="Arial" w:hAnsi="Arial"/>
-                <w:color w:val="222222"/>
-                <w:sz w:val="21"/>
-                <w:szCs w:val="21"/>
-                <w:shd w:fill="FFFFFF" w:val="clear"/>
-                <w:lang w:val="en-US"/>
-              </w:rPr>
-              <w:t>;</w:t>
-            </w:r>
-          </w:p>
-        </w:tc>
-      </w:tr>
-      <w:tr>
-        <w:trPr/>
-        <w:tc>
-          <w:tcPr>
-            <w:tcW w:w="1799" w:type="dxa"/>
-            <w:tcBorders/>
-            <w:shd w:color="auto" w:fill="auto" w:val="clear"/>
-          </w:tcPr>
-          <w:p>
-            <w:pPr>
-              <w:pStyle w:val="Normal"/>
-              <w:rPr>
-                <w:lang w:val="uk-UA"/>
-              </w:rPr>
-            </w:pPr>
-            <w:r>
-              <w:rPr>
-                <w:lang w:val="uk-UA"/>
-              </w:rPr>
-              <w:t>SAR</w:t>
-            </w:r>
-          </w:p>
-        </w:tc>
-        <w:tc>
-          <w:tcPr>
-            <w:tcW w:w="7561" w:type="dxa"/>
-            <w:tcBorders/>
-            <w:shd w:color="auto" w:fill="auto" w:val="clear"/>
-          </w:tcPr>
-          <w:p>
-            <w:pPr>
-              <w:pStyle w:val="Normal"/>
-              <w:ind w:hanging="0"/>
-              <w:rPr>
-                <w:lang w:val="uk-UA"/>
-              </w:rPr>
-            </w:pPr>
-            <w:r>
-              <w:rPr>
-                <w:lang w:val="uk-UA"/>
-              </w:rPr>
-              <w:t>– </w:t>
-            </w:r>
-            <w:r>
-              <w:rPr>
-                <w:lang w:val="uk-UA"/>
-              </w:rPr>
-              <w:t>Successive Approximation Register;</w:t>
-            </w:r>
-          </w:p>
-        </w:tc>
-      </w:tr>
-      <w:tr>
-        <w:trPr/>
-        <w:tc>
-          <w:tcPr>
-            <w:tcW w:w="1799" w:type="dxa"/>
-            <w:tcBorders/>
-            <w:shd w:color="auto" w:fill="auto" w:val="clear"/>
-          </w:tcPr>
-          <w:p>
-            <w:pPr>
-              <w:pStyle w:val="Normal"/>
-              <w:rPr>
-                <w:lang w:val="uk-UA"/>
-              </w:rPr>
-            </w:pPr>
-            <w:r>
-              <w:rPr>
-                <w:lang w:val="uk-UA"/>
-              </w:rPr>
-              <w:t>SoC</w:t>
-            </w:r>
-          </w:p>
-        </w:tc>
-        <w:tc>
-          <w:tcPr>
-            <w:tcW w:w="7561" w:type="dxa"/>
-            <w:tcBorders/>
-            <w:shd w:color="auto" w:fill="auto" w:val="clear"/>
-          </w:tcPr>
-          <w:p>
-            <w:pPr>
-              <w:pStyle w:val="Normal"/>
-              <w:ind w:hanging="0"/>
-              <w:rPr>
-                <w:lang w:val="uk-UA"/>
-              </w:rPr>
-            </w:pPr>
-            <w:r>
-              <w:rPr>
-                <w:lang w:val="uk-UA"/>
-              </w:rPr>
-              <w:t>– </w:t>
-            </w:r>
-            <w:r>
-              <w:rPr>
-                <w:lang w:val="uk-UA"/>
-              </w:rPr>
-              <w:t>System-on-Chip;</w:t>
-            </w:r>
-          </w:p>
-        </w:tc>
-      </w:tr>
-      <w:tr>
-        <w:trPr/>
-        <w:tc>
-          <w:tcPr>
-            <w:tcW w:w="1799" w:type="dxa"/>
-            <w:tcBorders/>
-            <w:shd w:color="auto" w:fill="auto" w:val="clear"/>
-          </w:tcPr>
-          <w:p>
-            <w:pPr>
-              <w:pStyle w:val="Normal"/>
-              <w:rPr>
-                <w:lang w:val="uk-UA"/>
-              </w:rPr>
-            </w:pPr>
-            <w:r>
-              <w:rPr>
-                <w:lang w:val="uk-UA"/>
-              </w:rPr>
-              <w:t>TRM</w:t>
-            </w:r>
-          </w:p>
-        </w:tc>
-        <w:tc>
-          <w:tcPr>
-            <w:tcW w:w="7561" w:type="dxa"/>
-            <w:tcBorders/>
-            <w:shd w:color="auto" w:fill="auto" w:val="clear"/>
-          </w:tcPr>
-          <w:p>
-            <w:pPr>
-              <w:pStyle w:val="Normal"/>
-              <w:ind w:hanging="0"/>
-              <w:rPr>
-                <w:lang w:val="uk-UA"/>
-              </w:rPr>
-            </w:pPr>
-            <w:r>
-              <w:rPr>
-                <w:lang w:val="uk-UA"/>
-              </w:rPr>
-              <w:t>– </w:t>
-            </w:r>
-            <w:hyperlink r:id="rId8">
-              <w:r>
-                <w:rPr>
-                  <w:rStyle w:val="Style4"/>
-                  <w:lang w:val="uk-UA"/>
-                </w:rPr>
-                <w:t>Technical Reference Model</w:t>
-              </w:r>
-            </w:hyperlink>
-            <w:r>
-              <w:rPr>
-                <w:lang w:val="uk-UA"/>
-              </w:rPr>
-              <w:t>;</w:t>
-            </w:r>
-          </w:p>
-        </w:tc>
-      </w:tr>
-      <w:tr>
-        <w:trPr/>
-        <w:tc>
-          <w:tcPr>
-            <w:tcW w:w="1799" w:type="dxa"/>
-            <w:tcBorders/>
-            <w:shd w:color="auto" w:fill="auto" w:val="clear"/>
-          </w:tcPr>
-          <w:p>
-            <w:pPr>
-              <w:pStyle w:val="Normal"/>
-              <w:rPr>
-                <w:lang w:val="uk-UA"/>
-              </w:rPr>
-            </w:pPr>
-            <w:r>
-              <w:rPr>
-                <w:lang w:val="uk-UA"/>
-              </w:rPr>
-              <w:t>UDB</w:t>
-            </w:r>
-          </w:p>
-        </w:tc>
-        <w:tc>
-          <w:tcPr>
-            <w:tcW w:w="7561" w:type="dxa"/>
-            <w:tcBorders/>
-            <w:shd w:color="auto" w:fill="auto" w:val="clear"/>
-          </w:tcPr>
-          <w:p>
-            <w:pPr>
-              <w:pStyle w:val="Normal"/>
-              <w:ind w:hanging="0"/>
-              <w:rPr>
-                <w:lang w:val="uk-UA"/>
-              </w:rPr>
-            </w:pPr>
-            <w:r>
-              <w:rPr>
-                <w:lang w:val="uk-UA"/>
-              </w:rPr>
-              <w:t>– </w:t>
-            </w:r>
-            <w:r>
-              <w:rPr>
-                <w:lang w:val="uk-UA"/>
-              </w:rPr>
-              <w:t>Universal Digital Block;</w:t>
-            </w:r>
-          </w:p>
-        </w:tc>
-      </w:tr>
-      <w:tr>
-        <w:trPr/>
-        <w:tc>
-          <w:tcPr>
-            <w:tcW w:w="1799" w:type="dxa"/>
-            <w:tcBorders/>
-            <w:shd w:color="auto" w:fill="auto" w:val="clear"/>
-          </w:tcPr>
-          <w:p>
-            <w:pPr>
-              <w:pStyle w:val="Normal"/>
-              <w:rPr>
-                <w:lang w:val="uk-UA"/>
-              </w:rPr>
-            </w:pPr>
-            <w:r>
-              <w:rPr>
-                <w:lang w:val="uk-UA"/>
-              </w:rPr>
-              <w:t>АЦП</w:t>
-            </w:r>
-          </w:p>
-        </w:tc>
-        <w:tc>
-          <w:tcPr>
-            <w:tcW w:w="7561" w:type="dxa"/>
-            <w:tcBorders/>
-            <w:shd w:color="auto" w:fill="auto" w:val="clear"/>
-          </w:tcPr>
-          <w:p>
-            <w:pPr>
-              <w:pStyle w:val="Normal"/>
-              <w:ind w:hanging="0"/>
-              <w:rPr>
-                <w:lang w:val="uk-UA"/>
-              </w:rPr>
-            </w:pPr>
-            <w:r>
-              <w:rPr>
-                <w:lang w:val="uk-UA"/>
-              </w:rPr>
-              <w:t>– </w:t>
-            </w:r>
-            <w:r>
-              <w:rPr>
-                <w:lang w:val="uk-UA"/>
-              </w:rPr>
-              <w:t>аналого-цифровий перетворювач;</w:t>
-            </w:r>
-          </w:p>
-        </w:tc>
-      </w:tr>
-      <w:tr>
-        <w:trPr/>
-        <w:tc>
-          <w:tcPr>
-            <w:tcW w:w="1799" w:type="dxa"/>
-            <w:tcBorders/>
-            <w:shd w:color="auto" w:fill="auto" w:val="clear"/>
-          </w:tcPr>
-          <w:p>
-            <w:pPr>
-              <w:pStyle w:val="Normal"/>
-              <w:rPr>
-                <w:lang w:val="uk-UA"/>
-              </w:rPr>
-            </w:pPr>
-            <w:r>
-              <w:rPr>
-                <w:lang w:val="uk-UA"/>
-              </w:rPr>
-              <w:t>ВС</w:t>
-            </w:r>
-          </w:p>
-        </w:tc>
-        <w:tc>
-          <w:tcPr>
-            <w:tcW w:w="7561" w:type="dxa"/>
-            <w:tcBorders/>
-            <w:shd w:color="auto" w:fill="auto" w:val="clear"/>
-          </w:tcPr>
-          <w:p>
-            <w:pPr>
-              <w:pStyle w:val="Normal"/>
-              <w:ind w:hanging="0"/>
-              <w:rPr>
-                <w:lang w:val="uk-UA"/>
-              </w:rPr>
-            </w:pPr>
-            <w:r>
-              <w:rPr>
-                <w:lang w:val="uk-UA"/>
-              </w:rPr>
-              <w:t>– </w:t>
-            </w:r>
-            <w:r>
-              <w:rPr>
-                <w:lang w:val="uk-UA"/>
-              </w:rPr>
-              <w:t>вбудована система;</w:t>
-            </w:r>
-          </w:p>
-        </w:tc>
-      </w:tr>
-      <w:tr>
-        <w:trPr/>
-        <w:tc>
-          <w:tcPr>
-            <w:tcW w:w="1799" w:type="dxa"/>
-            <w:tcBorders/>
-            <w:shd w:color="auto" w:fill="auto" w:val="clear"/>
-          </w:tcPr>
-          <w:p>
-            <w:pPr>
-              <w:pStyle w:val="Normal"/>
-              <w:rPr>
-                <w:lang w:val="uk-UA"/>
-              </w:rPr>
-            </w:pPr>
-            <w:r>
-              <w:rPr>
-                <w:lang w:val="uk-UA"/>
-              </w:rPr>
-              <w:t>ВІС</w:t>
-            </w:r>
-          </w:p>
-        </w:tc>
-        <w:tc>
-          <w:tcPr>
-            <w:tcW w:w="7561" w:type="dxa"/>
-            <w:tcBorders/>
-            <w:shd w:color="auto" w:fill="auto" w:val="clear"/>
-          </w:tcPr>
-          <w:p>
-            <w:pPr>
-              <w:pStyle w:val="Normal"/>
-              <w:ind w:hanging="0"/>
-              <w:rPr>
-                <w:lang w:val="uk-UA"/>
-              </w:rPr>
-            </w:pPr>
-            <w:r>
-              <w:rPr>
-                <w:lang w:val="uk-UA"/>
-              </w:rPr>
-              <w:t>– </w:t>
-            </w:r>
-            <w:r>
-              <w:rPr>
-                <w:lang w:val="uk-UA"/>
-              </w:rPr>
-              <w:t>велика інтегральна схема;</w:t>
-            </w:r>
-          </w:p>
-        </w:tc>
-      </w:tr>
-      <w:tr>
-        <w:trPr/>
-        <w:tc>
-          <w:tcPr>
-            <w:tcW w:w="1799" w:type="dxa"/>
-            <w:tcBorders/>
-            <w:shd w:color="auto" w:fill="auto" w:val="clear"/>
-          </w:tcPr>
-          <w:p>
-            <w:pPr>
-              <w:pStyle w:val="Normal"/>
-              <w:rPr>
-                <w:lang w:val="uk-UA"/>
-              </w:rPr>
-            </w:pPr>
-            <w:r>
-              <w:rPr>
-                <w:lang w:val="uk-UA"/>
-              </w:rPr>
-              <w:t>МК</w:t>
-            </w:r>
-          </w:p>
-        </w:tc>
-        <w:tc>
-          <w:tcPr>
-            <w:tcW w:w="7561" w:type="dxa"/>
-            <w:tcBorders/>
-            <w:shd w:color="auto" w:fill="auto" w:val="clear"/>
-          </w:tcPr>
-          <w:p>
-            <w:pPr>
-              <w:pStyle w:val="Normal"/>
-              <w:ind w:hanging="0"/>
-              <w:rPr>
-                <w:lang w:val="uk-UA"/>
-              </w:rPr>
-            </w:pPr>
-            <w:r>
-              <w:rPr>
-                <w:lang w:val="uk-UA"/>
-              </w:rPr>
-              <w:t>– </w:t>
-            </w:r>
-            <w:r>
-              <w:rPr>
-                <w:lang w:val="uk-UA"/>
-              </w:rPr>
-              <w:t>мікроконтролер;</w:t>
-            </w:r>
-          </w:p>
-        </w:tc>
-      </w:tr>
-      <w:tr>
-        <w:trPr/>
-        <w:tc>
-          <w:tcPr>
-            <w:tcW w:w="1799" w:type="dxa"/>
-            <w:tcBorders/>
-            <w:shd w:color="auto" w:fill="auto" w:val="clear"/>
-          </w:tcPr>
-          <w:p>
-            <w:pPr>
-              <w:pStyle w:val="Normal"/>
-              <w:rPr>
-                <w:lang w:val="uk-UA"/>
-              </w:rPr>
-            </w:pPr>
-            <w:r>
-              <w:rPr>
-                <w:lang w:val="uk-UA"/>
-              </w:rPr>
-              <w:t xml:space="preserve">ПЗ </w:t>
-            </w:r>
-          </w:p>
-        </w:tc>
-        <w:tc>
-          <w:tcPr>
-            <w:tcW w:w="7561" w:type="dxa"/>
-            <w:tcBorders/>
-            <w:shd w:color="auto" w:fill="auto" w:val="clear"/>
-          </w:tcPr>
-          <w:p>
-            <w:pPr>
-              <w:pStyle w:val="Normal"/>
-              <w:ind w:hanging="0"/>
-              <w:rPr>
-                <w:lang w:val="uk-UA"/>
-              </w:rPr>
-            </w:pPr>
-            <w:r>
-              <w:rPr>
-                <w:lang w:val="uk-UA"/>
-              </w:rPr>
-              <w:t>– </w:t>
-            </w:r>
-            <w:r>
-              <w:rPr>
-                <w:lang w:val="uk-UA"/>
-              </w:rPr>
-              <w:t>програмне забезпечення;</w:t>
-            </w:r>
-          </w:p>
-        </w:tc>
-      </w:tr>
-      <w:tr>
-        <w:trPr/>
-        <w:tc>
-          <w:tcPr>
-            <w:tcW w:w="1799" w:type="dxa"/>
-            <w:tcBorders/>
-            <w:shd w:color="auto" w:fill="auto" w:val="clear"/>
-          </w:tcPr>
-          <w:p>
-            <w:pPr>
-              <w:pStyle w:val="Normal"/>
-              <w:rPr>
-                <w:lang w:val="uk-UA"/>
-              </w:rPr>
-            </w:pPr>
-            <w:r>
-              <w:rPr>
-                <w:lang w:val="uk-UA"/>
-              </w:rPr>
-              <w:t>ПСнК</w:t>
-            </w:r>
-          </w:p>
-        </w:tc>
-        <w:tc>
-          <w:tcPr>
-            <w:tcW w:w="7561" w:type="dxa"/>
-            <w:tcBorders/>
-            <w:shd w:color="auto" w:fill="auto" w:val="clear"/>
-          </w:tcPr>
-          <w:p>
-            <w:pPr>
-              <w:pStyle w:val="Normal"/>
-              <w:ind w:hanging="0"/>
-              <w:rPr>
-                <w:lang w:val="uk-UA"/>
-              </w:rPr>
-            </w:pPr>
-            <w:r>
-              <w:rPr>
-                <w:lang w:val="uk-UA"/>
-              </w:rPr>
-              <w:t>– </w:t>
-            </w:r>
-            <w:r>
-              <w:rPr>
-                <w:lang w:val="uk-UA"/>
-              </w:rPr>
-              <w:t>програмована система на кристалі;</w:t>
-            </w:r>
-          </w:p>
-        </w:tc>
-      </w:tr>
-      <w:tr>
-        <w:trPr/>
-        <w:tc>
-          <w:tcPr>
-            <w:tcW w:w="1799" w:type="dxa"/>
-            <w:tcBorders/>
-            <w:shd w:color="auto" w:fill="auto" w:val="clear"/>
-          </w:tcPr>
-          <w:p>
-            <w:pPr>
-              <w:pStyle w:val="Normal"/>
-              <w:rPr>
-                <w:lang w:val="uk-UA"/>
-              </w:rPr>
-            </w:pPr>
-            <w:r>
-              <w:rPr>
-                <w:lang w:val="uk-UA"/>
-              </w:rPr>
-              <w:t>ЦАП</w:t>
-            </w:r>
-          </w:p>
-        </w:tc>
-        <w:tc>
-          <w:tcPr>
-            <w:tcW w:w="7561" w:type="dxa"/>
-            <w:tcBorders/>
-            <w:shd w:color="auto" w:fill="auto" w:val="clear"/>
-          </w:tcPr>
-          <w:p>
-            <w:pPr>
-              <w:pStyle w:val="Normal"/>
-              <w:ind w:hanging="0"/>
-              <w:rPr>
-                <w:lang w:val="uk-UA"/>
-              </w:rPr>
-            </w:pPr>
-            <w:r>
-              <w:rPr>
-                <w:lang w:val="uk-UA"/>
-              </w:rPr>
-              <w:t>– </w:t>
-            </w:r>
-            <w:r>
-              <w:rPr>
-                <w:lang w:val="uk-UA"/>
-              </w:rPr>
-              <w:t>цифро-аналоговий перетворювач;</w:t>
-            </w:r>
-          </w:p>
-        </w:tc>
-      </w:tr>
-      <w:tr>
-        <w:trPr/>
-        <w:tc>
-          <w:tcPr>
-            <w:tcW w:w="1799" w:type="dxa"/>
-            <w:tcBorders/>
-            <w:shd w:color="auto" w:fill="auto" w:val="clear"/>
-          </w:tcPr>
-          <w:p>
-            <w:pPr>
-              <w:pStyle w:val="Normal"/>
               <w:tabs>
                 <w:tab w:val="clear" w:pos="709"/>
-                <w:tab w:val="left" w:pos="5310" w:leader="none"/>
+                <w:tab w:val="left" w:pos="8010" w:leader="none"/>
               </w:tabs>
-              <w:rPr>
-                <w:lang w:val="en-US"/>
-              </w:rPr>
-            </w:pPr>
-            <w:r>
-              <w:rPr/>
-            </w:r>
-            <m:oMathPara xmlns:m="http://schemas.openxmlformats.org/officeDocument/2006/math">
-              <m:oMathParaPr>
-                <m:jc m:val="left"/>
-              </m:oMathParaPr>
-              <m:oMath>
-                <m:r>
-                  <m:t xml:space="preserve">⊗</m:t>
-                </m:r>
-              </m:oMath>
-            </m:oMathPara>
-          </w:p>
-        </w:tc>
-        <w:tc>
-          <w:tcPr>
-            <w:tcW w:w="7561" w:type="dxa"/>
-            <w:tcBorders/>
-            <w:shd w:color="auto" w:fill="auto" w:val="clear"/>
-          </w:tcPr>
-          <w:p>
-            <w:pPr>
-              <w:pStyle w:val="Normal"/>
+              <w:spacing w:lineRule="auto" w:line="240"/>
               <w:ind w:hanging="0"/>
               <w:rPr>
                 <w:lang w:val="uk-UA"/>
@@ -7891,121 +7089,7 @@
               <w:rPr>
                 <w:lang w:val="uk-UA"/>
               </w:rPr>
-              <w:t>– </w:t>
-            </w:r>
-            <w:r>
-              <w:rPr>
-                <w:lang w:val="en-US"/>
-              </w:rPr>
-              <w:t xml:space="preserve">операція </w:t>
-            </w:r>
-            <w:r>
-              <w:rPr>
-                <w:lang w:val="uk-UA"/>
-              </w:rPr>
-              <w:t xml:space="preserve">нечіткого </w:t>
-            </w:r>
-            <w:r>
-              <w:rPr>
-                <w:lang w:val="en-US"/>
-              </w:rPr>
-              <w:t>логічного перетинання.</w:t>
-            </w:r>
-          </w:p>
-        </w:tc>
-      </w:tr>
-      <w:tr>
-        <w:trPr/>
-        <w:tc>
-          <w:tcPr>
-            <w:tcW w:w="1799" w:type="dxa"/>
-            <w:tcBorders/>
-            <w:shd w:color="auto" w:fill="auto" w:val="clear"/>
-          </w:tcPr>
-          <w:p>
-            <w:pPr>
-              <w:pStyle w:val="Normal"/>
-              <w:tabs>
-                <w:tab w:val="clear" w:pos="709"/>
-                <w:tab w:val="left" w:pos="5310" w:leader="none"/>
-              </w:tabs>
-              <w:rPr>
-                <w:lang w:val="uk-UA"/>
-              </w:rPr>
-            </w:pPr>
-            <w:r>
-              <w:rPr>
-                <w:lang w:val="uk-UA"/>
-              </w:rPr>
-            </w:r>
-          </w:p>
-        </w:tc>
-        <w:tc>
-          <w:tcPr>
-            <w:tcW w:w="7561" w:type="dxa"/>
-            <w:tcBorders/>
-            <w:shd w:color="auto" w:fill="auto" w:val="clear"/>
-          </w:tcPr>
-          <w:p>
-            <w:pPr>
-              <w:pStyle w:val="Normal"/>
-              <w:ind w:hanging="0"/>
-              <w:rPr>
-                <w:lang w:val="uk-UA"/>
-              </w:rPr>
-            </w:pPr>
-            <w:r>
-              <w:rPr>
-                <w:lang w:val="uk-UA"/>
-              </w:rPr>
-            </w:r>
-          </w:p>
-        </w:tc>
-      </w:tr>
-      <w:tr>
-        <w:trPr/>
-        <w:tc>
-          <w:tcPr>
-            <w:tcW w:w="1799" w:type="dxa"/>
-            <w:tcBorders/>
-            <w:shd w:color="auto" w:fill="auto" w:val="clear"/>
-          </w:tcPr>
-          <w:p>
-            <w:pPr>
-              <w:pStyle w:val="Normal"/>
-              <w:tabs>
-                <w:tab w:val="clear" w:pos="709"/>
-                <w:tab w:val="left" w:pos="5310" w:leader="none"/>
-              </w:tabs>
-              <w:rPr>
-                <w:lang w:val="uk-UA"/>
-              </w:rPr>
-            </w:pPr>
-            <w:r>
-              <w:rPr>
-                <w:lang w:val="uk-UA"/>
-              </w:rPr>
-            </w:r>
-          </w:p>
-        </w:tc>
-        <w:tc>
-          <w:tcPr>
-            <w:tcW w:w="7561" w:type="dxa"/>
-            <w:tcBorders/>
-            <w:shd w:color="auto" w:fill="auto" w:val="clear"/>
-          </w:tcPr>
-          <w:p>
-            <w:pPr>
-              <w:pStyle w:val="Normal"/>
-              <w:ind w:hanging="0"/>
-              <w:rPr>
-                <w:lang w:val="uk-UA"/>
-              </w:rPr>
-            </w:pPr>
-            <w:r>
-              <w:rPr>
-                <w:lang w:val="uk-UA"/>
-              </w:rPr>
+              <w:t>Фреймворк для побудови десктопних застосунків</w:t>
             </w:r>
           </w:p>
         </w:tc>
@@ -8055,23 +7139,26 @@
         <w:rPr>
           <w:lang w:val="uk-UA"/>
         </w:rPr>
-        <w:t>Звичайний текст звичайний текст звичайний текст звичайний текст звичайний текст звичайний текст звичайний текст звичайний текст Звичайний текст звичайний текст звичайний текст звичайний текст звичайний текст звичайний текст звичайний текст звичайний текст Звичайний текст звичайний текст звичайний текст звичайний текст звичайний текст звичайний текст звичайний текст звичайний текст Звичайний текст звичайний текст звичайний текст звичайний текст звичайний текст звичайний текст звичайний текст звичайний текст Звичайний текст звичайний текст звичайний текст звичайний текст звичайний текст звичайний текст звичайний текст звичайний текст Звичайний текст звичайний текст звичайний текст звичайний текст звичайний текст звичайний текст звичайний текст звичайний текст Звичайний текст звичайний текст звичайний текст звичайний текст звичайний текст звичайний текст звичайний текст звичайний текст.</w:t>
-      </w:r>
-    </w:p>
-    <w:p>
-      <w:pPr>
-        <w:pStyle w:val="Normal"/>
-        <w:rPr/>
-      </w:pPr>
-      <w:r>
-        <w:rPr>
-          <w:lang w:val="uk-UA"/>
-        </w:rPr>
-        <w:t>Звичайний текст звичайний текст звичайний текст звичайний текст звичайний текст звичайний текст звичайний текст звичайний текст Звичайний текст звичайний текст звичайний текст звичайний текст звичайний текст звичайний текст звичайний текст звичайний текст Звичайний текст звичайний текст звичайний текст звичайний текст звичайний текст звичайний текст звичайний текст звичайний текст</w:t>
-      </w:r>
-      <w:r>
-        <w:rPr/>
-        <w:t xml:space="preserve"> [1].</w:t>
+        <w:t xml:space="preserve">Перевезення є дуже важливою галуззю в світі. Аби працювати </w:t>
+      </w:r>
+      <w:r>
+        <w:rPr>
+          <w:lang w:val="uk-UA"/>
+        </w:rPr>
+        <w:t>на вантажівці потрібно або отримати вантажівку від компанії, або придбати власну.</w:t>
+      </w:r>
+    </w:p>
+    <w:p>
+      <w:pPr>
+        <w:pStyle w:val="Normal"/>
+        <w:rPr>
+          <w:lang w:val="uk-UA"/>
+        </w:rPr>
+      </w:pPr>
+      <w:r>
+        <w:rPr>
+          <w:lang w:val="uk-UA"/>
+        </w:rPr>
       </w:r>
       <w:r>
         <w:br w:type="page"/>
@@ -8086,12 +7173,12 @@
       <w:bookmarkStart w:id="4" w:name="_Toc31200643"/>
       <w:r>
         <w:rPr/>
-        <w:t>1 ЗАГОЛОВОК ПЕРШОГО РІВНЯ</w:t>
+        <w:t xml:space="preserve">1 </w:t>
       </w:r>
       <w:bookmarkEnd w:id="4"/>
       <w:r>
         <w:rPr/>
-        <w:t xml:space="preserve"> (розділ)</w:t>
+        <w:t>АНАЛІЗ ПРЕДМЕТНОЇ ОБЛАСТІ ТА ОГЛЯД АНАЛОГІВ</w:t>
       </w:r>
     </w:p>
     <w:p>
@@ -8102,12 +7189,16 @@
       <w:bookmarkStart w:id="5" w:name="_Toc31200644"/>
       <w:r>
         <w:rPr/>
-        <w:t>1.1 Заголовок другого рівня</w:t>
+        <w:t xml:space="preserve">1.1 </w:t>
       </w:r>
       <w:bookmarkEnd w:id="5"/>
       <w:r>
         <w:rPr/>
-        <w:t xml:space="preserve"> (підрозділ)</w:t>
+        <w:t>Огляд існуючих методів вирішення завдання</w:t>
+      </w:r>
+      <w:r>
+        <w:rPr/>
+        <w:t xml:space="preserve"> </w:t>
       </w:r>
     </w:p>
     <w:p>
@@ -8115,21 +7206,6 @@
         <w:pStyle w:val="Normal"/>
         <w:rPr>
           <w:b/>
-          <w:lang w:val="uk-UA"/>
-        </w:rPr>
-      </w:pPr>
-      <w:r>
-        <w:rPr>
-          <w:b/>
-          <w:lang w:val="uk-UA"/>
-        </w:rPr>
-        <w:t>1.1.1 Заголовок третього рівня (пункт)</w:t>
-      </w:r>
-    </w:p>
-    <w:p>
-      <w:pPr>
-        <w:pStyle w:val="Normal"/>
-        <w:rPr>
           <w:lang w:val="uk-UA"/>
         </w:rPr>
       </w:pPr>
@@ -11102,7 +10178,7 @@
                     </pic:cNvPicPr>
                   </pic:nvPicPr>
                   <pic:blipFill>
-                    <a:blip r:embed="rId9"/>
+                    <a:blip r:embed="rId8"/>
                     <a:stretch>
                       <a:fillRect/>
                     </a:stretch>
@@ -12664,10 +11740,10 @@
       </w:r>
     </w:p>
     <w:sectPr>
-      <w:headerReference w:type="default" r:id="rId10"/>
-      <w:headerReference w:type="first" r:id="rId11"/>
-      <w:footerReference w:type="default" r:id="rId12"/>
-      <w:footerReference w:type="first" r:id="rId13"/>
+      <w:headerReference w:type="default" r:id="rId9"/>
+      <w:headerReference w:type="first" r:id="rId10"/>
+      <w:footerReference w:type="default" r:id="rId11"/>
+      <w:footerReference w:type="first" r:id="rId12"/>
       <w:type w:val="nextPage"/>
       <w:pgSz w:w="11906" w:h="16838"/>
       <w:pgMar w:left="1701" w:right="851" w:gutter="0" w:header="567" w:top="1134" w:footer="0" w:bottom="1134"/>

</xml_diff>

<commit_message>
winforms not really working
</commit_message>
<xml_diff>
--- a/42D Dyplom/KNT-122_Onyshchenko_PZ.docx
+++ b/42D Dyplom/KNT-122_Onyshchenko_PZ.docx
@@ -6860,86 +6860,15 @@
     </w:sdt>
     <w:p>
       <w:pPr>
-        <w:pStyle w:val="Normal"/>
-        <w:tabs>
-          <w:tab w:val="clear" w:pos="709"/>
-          <w:tab w:val="right" w:pos="9360" w:leader="dot"/>
-          <w:tab w:val="right" w:pos="9720" w:leader="dot"/>
-        </w:tabs>
-        <w:ind w:hanging="0"/>
-        <w:rPr>
-          <w:szCs w:val="28"/>
-          <w:lang w:val="uk-UA"/>
-        </w:rPr>
-      </w:pPr>
-      <w:r>
-        <w:rPr>
-          <w:szCs w:val="28"/>
-          <w:lang w:val="uk-UA"/>
-        </w:rPr>
-        <w:t>Додаток А Текст програми</w:t>
-      </w:r>
-      <w:r>
-        <w:rPr>
-          <w:vanish/>
-          <w:szCs w:val="28"/>
-          <w:lang w:val="uk-UA"/>
-        </w:rPr>
-        <w:tab/>
-        <w:t>2</w:t>
-      </w:r>
-      <w:r>
-        <w:rPr>
-          <w:vanish/>
-          <w:szCs w:val="28"/>
-          <w:lang w:val="uk-UA"/>
-        </w:rPr>
-        <w:fldChar w:fldCharType="begin"/>
-      </w:r>
-      <w:r>
-        <w:rPr>
-          <w:szCs w:val="28"/>
-          <w:vanish/>
-          <w:lang w:val="uk-UA"/>
-        </w:rPr>
-        <w:instrText xml:space="preserve"> PAGEREF _Toc31200653 \h </w:instrText>
-      </w:r>
-      <w:r>
-        <w:rPr>
-          <w:szCs w:val="28"/>
-          <w:vanish/>
-          <w:lang w:val="uk-UA"/>
-        </w:rPr>
-        <w:fldChar w:fldCharType="separate"/>
-      </w:r>
-      <w:r>
-        <w:rPr>
-          <w:szCs w:val="28"/>
-          <w:vanish/>
-          <w:lang w:val="uk-UA"/>
-        </w:rPr>
-        <w:t>16</w:t>
-      </w:r>
-      <w:r>
-        <w:rPr>
-          <w:szCs w:val="28"/>
-          <w:vanish/>
-          <w:lang w:val="uk-UA"/>
-        </w:rPr>
-        <w:fldChar w:fldCharType="end"/>
-      </w:r>
-      <w:r>
-        <w:br w:type="page"/>
-      </w:r>
-    </w:p>
-    <w:p>
-      <w:pPr>
         <w:pStyle w:val="Heading1"/>
         <w:spacing w:lineRule="auto" w:line="360" w:before="0" w:after="0"/>
         <w:rPr>
           <w:szCs w:val="28"/>
         </w:rPr>
       </w:pPr>
+      <w:r>
+        <w:br w:type="page"/>
+      </w:r>
       <w:bookmarkStart w:id="2" w:name="_Toc31200641"/>
       <w:r>
         <w:rPr>
@@ -6977,14 +6906,14 @@
         <w:tblLook w:firstRow="1" w:noVBand="1" w:lastRow="0" w:firstColumn="1" w:lastColumn="0" w:noHBand="0" w:val="04a0"/>
       </w:tblPr>
       <w:tblGrid>
-        <w:gridCol w:w="1799"/>
-        <w:gridCol w:w="7561"/>
+        <w:gridCol w:w="1634"/>
+        <w:gridCol w:w="7726"/>
       </w:tblGrid>
       <w:tr>
         <w:trPr/>
         <w:tc>
           <w:tcPr>
-            <w:tcW w:w="1799" w:type="dxa"/>
+            <w:tcW w:w="1634" w:type="dxa"/>
             <w:tcBorders/>
             <w:shd w:color="auto" w:fill="auto" w:val="clear"/>
           </w:tcPr>
@@ -7011,7 +6940,7 @@
         </w:tc>
         <w:tc>
           <w:tcPr>
-            <w:tcW w:w="7561" w:type="dxa"/>
+            <w:tcW w:w="7726" w:type="dxa"/>
             <w:tcBorders/>
             <w:shd w:color="auto" w:fill="auto" w:val="clear"/>
           </w:tcPr>
@@ -7041,7 +6970,7 @@
         <w:trPr/>
         <w:tc>
           <w:tcPr>
-            <w:tcW w:w="1799" w:type="dxa"/>
+            <w:tcW w:w="1634" w:type="dxa"/>
             <w:tcBorders/>
             <w:shd w:color="auto" w:fill="auto" w:val="clear"/>
           </w:tcPr>
@@ -7068,7 +6997,7 @@
         </w:tc>
         <w:tc>
           <w:tcPr>
-            <w:tcW w:w="7561" w:type="dxa"/>
+            <w:tcW w:w="7726" w:type="dxa"/>
             <w:tcBorders/>
             <w:shd w:color="auto" w:fill="auto" w:val="clear"/>
           </w:tcPr>
@@ -7090,6 +7019,69 @@
                 <w:lang w:val="uk-UA"/>
               </w:rPr>
               <w:t>Фреймворк для побудови десктопних застосунків</w:t>
+            </w:r>
+          </w:p>
+        </w:tc>
+      </w:tr>
+      <w:tr>
+        <w:trPr/>
+        <w:tc>
+          <w:tcPr>
+            <w:tcW w:w="1634" w:type="dxa"/>
+            <w:tcBorders/>
+            <w:shd w:color="auto" w:fill="auto" w:val="clear"/>
+          </w:tcPr>
+          <w:p>
+            <w:pPr>
+              <w:pStyle w:val="Normal"/>
+              <w:tabs>
+                <w:tab w:val="clear" w:pos="709"/>
+                <w:tab w:val="left" w:pos="8010" w:leader="none"/>
+              </w:tabs>
+              <w:spacing w:lineRule="auto" w:line="240"/>
+              <w:ind w:hanging="0" w:start="0"/>
+              <w:rPr>
+                <w:lang w:val="en-US"/>
+              </w:rPr>
+            </w:pPr>
+            <w:r>
+              <w:rPr>
+                <w:lang w:val="en-US"/>
+              </w:rPr>
+              <w:t>MVC</w:t>
+            </w:r>
+          </w:p>
+        </w:tc>
+        <w:tc>
+          <w:tcPr>
+            <w:tcW w:w="7726" w:type="dxa"/>
+            <w:tcBorders/>
+            <w:shd w:color="auto" w:fill="auto" w:val="clear"/>
+          </w:tcPr>
+          <w:p>
+            <w:pPr>
+              <w:pStyle w:val="Normal"/>
+              <w:tabs>
+                <w:tab w:val="clear" w:pos="709"/>
+                <w:tab w:val="left" w:pos="8010" w:leader="none"/>
+              </w:tabs>
+              <w:spacing w:lineRule="auto" w:line="240"/>
+              <w:ind w:hanging="0"/>
+              <w:rPr>
+                <w:lang w:val="en-US"/>
+              </w:rPr>
+            </w:pPr>
+            <w:r>
+              <w:rPr>
+                <w:lang w:val="en-US"/>
+              </w:rPr>
+              <w:t xml:space="preserve">Model-View-Controller, </w:t>
+            </w:r>
+            <w:r>
+              <w:rPr>
+                <w:lang w:val="uk-UA"/>
+              </w:rPr>
+              <w:t>шаблон проєктування</w:t>
             </w:r>
           </w:p>
         </w:tc>

</xml_diff>

<commit_message>
doing some 32JP K work
</commit_message>
<xml_diff>
--- a/42D Dyplom/KNT-122_Onyshchenko_PZ.docx
+++ b/42D Dyplom/KNT-122_Onyshchenko_PZ.docx
@@ -8016,6 +8016,45 @@
         <w:rPr>
           <w:lang w:val="uk-UA"/>
         </w:rPr>
+        <w:drawing>
+          <wp:inline distT="0" distB="0" distL="0" distR="0">
+            <wp:extent cx="5936615" cy="1634490"/>
+            <wp:effectExtent l="0" t="0" r="0" b="0"/>
+            <wp:docPr id="8" name="Зображення4 копія 1"/>
+            <wp:cNvGraphicFramePr>
+              <a:graphicFrameLocks xmlns:a="http://schemas.openxmlformats.org/drawingml/2006/main" noChangeAspect="1"/>
+            </wp:cNvGraphicFramePr>
+            <a:graphic xmlns:a="http://schemas.openxmlformats.org/drawingml/2006/main">
+              <a:graphicData uri="http://schemas.openxmlformats.org/drawingml/2006/picture">
+                <pic:pic xmlns:pic="http://schemas.openxmlformats.org/drawingml/2006/picture">
+                  <pic:nvPicPr>
+                    <pic:cNvPr id="8" name="Зображення4 копія 1"/>
+                    <pic:cNvPicPr>
+                      <a:picLocks noChangeAspect="1" noChangeArrowheads="1"/>
+                    </pic:cNvPicPr>
+                  </pic:nvPicPr>
+                  <pic:blipFill>
+                    <a:blip r:embed="rId9"/>
+                    <a:srcRect l="-9" t="-31" r="-9" b="-31"/>
+                    <a:stretch>
+                      <a:fillRect/>
+                    </a:stretch>
+                  </pic:blipFill>
+                  <pic:spPr bwMode="auto">
+                    <a:xfrm>
+                      <a:off x="0" y="0"/>
+                      <a:ext cx="5936615" cy="1634490"/>
+                    </a:xfrm>
+                    <a:prstGeom prst="rect">
+                      <a:avLst/>
+                    </a:prstGeom>
+                    <a:noFill/>
+                  </pic:spPr>
+                </pic:pic>
+              </a:graphicData>
+            </a:graphic>
+          </wp:inline>
+        </w:drawing>
       </w:r>
     </w:p>
     <w:p>
@@ -8036,6 +8075,146 @@
           <w:lang w:val="uk-UA"/>
         </w:rPr>
         <w:t>Структурна схема</w:t>
+      </w:r>
+    </w:p>
+    <w:p>
+      <w:pPr>
+        <w:pStyle w:val="Normal"/>
+        <w:rPr>
+          <w:lang w:val="uk-UA"/>
+        </w:rPr>
+      </w:pPr>
+      <w:r>
+        <w:rPr>
+          <w:lang w:val="uk-UA"/>
+        </w:rPr>
+      </w:r>
+    </w:p>
+    <w:p>
+      <w:pPr>
+        <w:pStyle w:val="Heading2"/>
+        <w:widowControl/>
+        <w:suppressAutoHyphens w:val="true"/>
+        <w:bidi w:val="0"/>
+        <w:spacing w:lineRule="auto" w:line="360"/>
+        <w:ind w:firstLine="850" w:start="0" w:end="0"/>
+        <w:jc w:val="both"/>
+        <w:rPr>
+          <w:lang w:val="en-US"/>
+        </w:rPr>
+      </w:pPr>
+      <w:bookmarkStart w:id="21" w:name="__RefHeading___Toc2737_3933516918"/>
+      <w:bookmarkEnd w:id="21"/>
+      <w:r>
+        <w:rPr/>
+        <w:t>2.2 Створення функціональної схеми</w:t>
+      </w:r>
+    </w:p>
+    <w:p>
+      <w:pPr>
+        <w:pStyle w:val="Normal"/>
+        <w:rPr>
+          <w:lang w:val="en-US"/>
+        </w:rPr>
+      </w:pPr>
+      <w:r>
+        <w:rPr>
+          <w:lang w:val="en-US"/>
+        </w:rPr>
+      </w:r>
+    </w:p>
+    <w:p>
+      <w:pPr>
+        <w:pStyle w:val="Normal"/>
+        <w:rPr>
+          <w:lang w:val="uk-UA"/>
+        </w:rPr>
+      </w:pPr>
+      <w:r>
+        <w:rPr>
+          <w:lang w:val="uk-UA"/>
+        </w:rPr>
+        <w:t>Розроблений веб-застосунок включає такі функції:</w:t>
+      </w:r>
+    </w:p>
+    <w:p>
+      <w:pPr>
+        <w:pStyle w:val="Normal"/>
+        <w:rPr>
+          <w:lang w:val="uk-UA"/>
+        </w:rPr>
+      </w:pPr>
+      <w:r>
+        <w:rPr>
+          <w:lang w:val="uk-UA"/>
+        </w:rPr>
+        <w:t xml:space="preserve">- </w:t>
+      </w:r>
+    </w:p>
+    <w:p>
+      <w:pPr>
+        <w:pStyle w:val="Normal"/>
+        <w:rPr>
+          <w:lang w:val="uk-UA"/>
+        </w:rPr>
+      </w:pPr>
+      <w:r>
+        <w:rPr>
+          <w:lang w:val="uk-UA"/>
+        </w:rPr>
+        <w:t>Функціональна схема описана на рисунку нижче:</w:t>
+      </w:r>
+    </w:p>
+    <w:p>
+      <w:pPr>
+        <w:pStyle w:val="Normal"/>
+        <w:rPr>
+          <w:lang w:val="uk-UA"/>
+        </w:rPr>
+      </w:pPr>
+      <w:r>
+        <w:rPr>
+          <w:lang w:val="uk-UA"/>
+        </w:rPr>
+      </w:r>
+    </w:p>
+    <w:p>
+      <w:pPr>
+        <w:pStyle w:val="Normal"/>
+        <w:widowControl/>
+        <w:suppressAutoHyphens w:val="true"/>
+        <w:bidi w:val="0"/>
+        <w:spacing w:lineRule="auto" w:line="360"/>
+        <w:ind w:hanging="0" w:end="0"/>
+        <w:jc w:val="center"/>
+        <w:rPr>
+          <w:lang w:val="uk-UA"/>
+        </w:rPr>
+      </w:pPr>
+      <w:r>
+        <w:rPr>
+          <w:lang w:val="uk-UA"/>
+        </w:rPr>
+      </w:r>
+    </w:p>
+    <w:p>
+      <w:pPr>
+        <w:pStyle w:val="Normal"/>
+        <w:widowControl/>
+        <w:suppressAutoHyphens w:val="true"/>
+        <w:bidi w:val="0"/>
+        <w:spacing w:lineRule="auto" w:line="360"/>
+        <w:ind w:hanging="0" w:end="0"/>
+        <w:jc w:val="center"/>
+        <w:rPr>
+          <w:lang w:val="uk-UA"/>
+        </w:rPr>
+      </w:pPr>
+      <w:r>
+        <w:rPr>
+          <w:lang w:val="uk-UA"/>
+        </w:rPr>
+        <w:t>Рисунок 2.2 — Функціональна схема веб-застосунку</w:t>
       </w:r>
       <w:r>
         <w:br w:type="page"/>
@@ -8049,9 +8228,9 @@
           <w:bCs/>
         </w:rPr>
       </w:pPr>
-      <w:bookmarkStart w:id="21" w:name="__RefHeading___Toc66118_3682473240"/>
-      <w:bookmarkStart w:id="22" w:name="_Toc31200650"/>
-      <w:bookmarkEnd w:id="21"/>
+      <w:bookmarkStart w:id="22" w:name="__RefHeading___Toc66118_3682473240"/>
+      <w:bookmarkStart w:id="23" w:name="_Toc31200650"/>
+      <w:bookmarkEnd w:id="22"/>
       <w:r>
         <w:rPr>
           <w:b/>
@@ -8059,7 +8238,7 @@
         </w:rPr>
         <w:t xml:space="preserve">3 </w:t>
       </w:r>
-      <w:bookmarkEnd w:id="22"/>
+      <w:bookmarkEnd w:id="23"/>
       <w:r>
         <w:rPr>
           <w:b/>
@@ -8073,14 +8252,14 @@
         <w:pStyle w:val="Heading2"/>
         <w:rPr/>
       </w:pPr>
-      <w:bookmarkStart w:id="23" w:name="__RefHeading___Toc66120_3682473240"/>
-      <w:bookmarkStart w:id="24" w:name="_Toc31200651"/>
-      <w:bookmarkEnd w:id="23"/>
+      <w:bookmarkStart w:id="24" w:name="__RefHeading___Toc66120_3682473240"/>
+      <w:bookmarkStart w:id="25" w:name="_Toc31200651"/>
+      <w:bookmarkEnd w:id="24"/>
       <w:r>
         <w:rPr/>
         <w:t xml:space="preserve">3.1 </w:t>
       </w:r>
-      <w:bookmarkEnd w:id="24"/>
+      <w:bookmarkEnd w:id="25"/>
       <w:r>
         <w:rPr/>
         <w:t>Вибір засобів розробки</w:t>
@@ -8149,8 +8328,8 @@
         <w:pStyle w:val="h3"/>
         <w:rPr/>
       </w:pPr>
-      <w:bookmarkStart w:id="25" w:name="__RefHeading___Toc2743_3933516918"/>
-      <w:bookmarkEnd w:id="25"/>
+      <w:bookmarkStart w:id="26" w:name="__RefHeading___Toc2743_3933516918"/>
+      <w:bookmarkEnd w:id="26"/>
       <w:r>
         <w:rPr/>
         <w:t>3.1.1 Обґрунтування вибору засобів розробки серверної частини</w:t>
@@ -9254,8 +9433,8 @@
         <w:pStyle w:val="h3"/>
         <w:rPr/>
       </w:pPr>
-      <w:bookmarkStart w:id="26" w:name="__RefHeading___Toc2745_3933516918"/>
-      <w:bookmarkEnd w:id="26"/>
+      <w:bookmarkStart w:id="27" w:name="__RefHeading___Toc2745_3933516918"/>
+      <w:bookmarkEnd w:id="27"/>
       <w:r>
         <w:rPr/>
         <w:t>3.1.</w:t>
@@ -10373,8 +10552,8 @@
         <w:pStyle w:val="h3"/>
         <w:rPr/>
       </w:pPr>
-      <w:bookmarkStart w:id="27" w:name="__RefHeading___Toc2747_3933516918"/>
-      <w:bookmarkEnd w:id="27"/>
+      <w:bookmarkStart w:id="28" w:name="__RefHeading___Toc2747_3933516918"/>
+      <w:bookmarkEnd w:id="28"/>
       <w:r>
         <w:rPr/>
         <w:t>3.1.</w:t>
@@ -10827,8 +11006,8 @@
         <w:jc w:val="both"/>
         <w:rPr/>
       </w:pPr>
-      <w:bookmarkStart w:id="28" w:name="__RefHeading___Toc2749_3933516918"/>
-      <w:bookmarkEnd w:id="28"/>
+      <w:bookmarkStart w:id="29" w:name="__RefHeading___Toc2749_3933516918"/>
+      <w:bookmarkEnd w:id="29"/>
       <w:r>
         <w:rPr/>
         <w:t>3.2 Висновки за розділом</w:t>
@@ -10863,8 +11042,8 @@
           <w:lang w:val="uk-UA"/>
         </w:rPr>
       </w:pPr>
-      <w:bookmarkStart w:id="29" w:name="__RefHeading___Toc2751_3933516918"/>
-      <w:bookmarkEnd w:id="29"/>
+      <w:bookmarkStart w:id="30" w:name="__RefHeading___Toc2751_3933516918"/>
+      <w:bookmarkEnd w:id="30"/>
       <w:r>
         <w:rPr/>
         <w:t xml:space="preserve">4 </w:t>
@@ -10888,8 +11067,8 @@
         <w:jc w:val="both"/>
         <w:rPr/>
       </w:pPr>
-      <w:bookmarkStart w:id="30" w:name="__RefHeading___Toc2753_3933516918"/>
-      <w:bookmarkEnd w:id="30"/>
+      <w:bookmarkStart w:id="31" w:name="__RefHeading___Toc2753_3933516918"/>
+      <w:bookmarkEnd w:id="31"/>
       <w:r>
         <w:rPr/>
         <w:t>4.1 Вибір платформи</w:t>
@@ -10935,8 +11114,8 @@
         <w:jc w:val="both"/>
         <w:rPr/>
       </w:pPr>
-      <w:bookmarkStart w:id="31" w:name="__RefHeading___Toc2755_3933516918"/>
-      <w:bookmarkEnd w:id="31"/>
+      <w:bookmarkStart w:id="32" w:name="__RefHeading___Toc2755_3933516918"/>
+      <w:bookmarkEnd w:id="32"/>
       <w:r>
         <w:rPr/>
         <w:t>4.2 Розробка макету інтерфейсу</w:t>
@@ -10987,7 +11166,7 @@
           <wp:inline distT="0" distB="0" distL="0" distR="0">
             <wp:extent cx="2727960" cy="3200400"/>
             <wp:effectExtent l="0" t="0" r="0" b="0"/>
-            <wp:docPr id="8" name="Зображення4"/>
+            <wp:docPr id="9" name="Зображення4"/>
             <wp:cNvGraphicFramePr>
               <a:graphicFrameLocks xmlns:a="http://schemas.openxmlformats.org/drawingml/2006/main" noChangeAspect="1"/>
             </wp:cNvGraphicFramePr>
@@ -10995,13 +11174,13 @@
               <a:graphicData uri="http://schemas.openxmlformats.org/drawingml/2006/picture">
                 <pic:pic xmlns:pic="http://schemas.openxmlformats.org/drawingml/2006/picture">
                   <pic:nvPicPr>
-                    <pic:cNvPr id="8" name="Зображення4"/>
+                    <pic:cNvPr id="9" name="Зображення4"/>
                     <pic:cNvPicPr>
                       <a:picLocks noChangeAspect="1" noChangeArrowheads="1"/>
                     </pic:cNvPicPr>
                   </pic:nvPicPr>
                   <pic:blipFill>
-                    <a:blip r:embed="rId9"/>
+                    <a:blip r:embed="rId10"/>
                     <a:stretch>
                       <a:fillRect/>
                     </a:stretch>
@@ -11091,7 +11270,7 @@
           <wp:inline distT="0" distB="0" distL="0" distR="0">
             <wp:extent cx="2613660" cy="3066415"/>
             <wp:effectExtent l="0" t="0" r="0" b="0"/>
-            <wp:docPr id="9" name="Зображення5"/>
+            <wp:docPr id="10" name="Зображення5"/>
             <wp:cNvGraphicFramePr>
               <a:graphicFrameLocks xmlns:a="http://schemas.openxmlformats.org/drawingml/2006/main" noChangeAspect="1"/>
             </wp:cNvGraphicFramePr>
@@ -11099,13 +11278,13 @@
               <a:graphicData uri="http://schemas.openxmlformats.org/drawingml/2006/picture">
                 <pic:pic xmlns:pic="http://schemas.openxmlformats.org/drawingml/2006/picture">
                   <pic:nvPicPr>
-                    <pic:cNvPr id="9" name="Зображення5"/>
+                    <pic:cNvPr id="10" name="Зображення5"/>
                     <pic:cNvPicPr>
                       <a:picLocks noChangeAspect="1" noChangeArrowheads="1"/>
                     </pic:cNvPicPr>
                   </pic:nvPicPr>
                   <pic:blipFill>
-                    <a:blip r:embed="rId10"/>
+                    <a:blip r:embed="rId11"/>
                     <a:stretch>
                       <a:fillRect/>
                     </a:stretch>
@@ -11193,7 +11372,7 @@
           <wp:inline distT="0" distB="0" distL="0" distR="0">
             <wp:extent cx="2670810" cy="3133090"/>
             <wp:effectExtent l="0" t="0" r="0" b="0"/>
-            <wp:docPr id="10" name="Зображення6"/>
+            <wp:docPr id="11" name="Зображення6"/>
             <wp:cNvGraphicFramePr>
               <a:graphicFrameLocks xmlns:a="http://schemas.openxmlformats.org/drawingml/2006/main" noChangeAspect="1"/>
             </wp:cNvGraphicFramePr>
@@ -11201,13 +11380,13 @@
               <a:graphicData uri="http://schemas.openxmlformats.org/drawingml/2006/picture">
                 <pic:pic xmlns:pic="http://schemas.openxmlformats.org/drawingml/2006/picture">
                   <pic:nvPicPr>
-                    <pic:cNvPr id="10" name="Зображення6"/>
+                    <pic:cNvPr id="11" name="Зображення6"/>
                     <pic:cNvPicPr>
                       <a:picLocks noChangeAspect="1" noChangeArrowheads="1"/>
                     </pic:cNvPicPr>
                   </pic:nvPicPr>
                   <pic:blipFill>
-                    <a:blip r:embed="rId11"/>
+                    <a:blip r:embed="rId12"/>
                     <a:stretch>
                       <a:fillRect/>
                     </a:stretch>
@@ -11377,8 +11556,8 @@
         <w:jc w:val="both"/>
         <w:rPr/>
       </w:pPr>
-      <w:bookmarkStart w:id="32" w:name="__RefHeading___Toc2759_3933516918"/>
-      <w:bookmarkEnd w:id="32"/>
+      <w:bookmarkStart w:id="33" w:name="__RefHeading___Toc2759_3933516918"/>
+      <w:bookmarkEnd w:id="33"/>
       <w:r>
         <w:rPr/>
         <w:t>4.4 Висновок за розділом</w:t>
@@ -11413,8 +11592,8 @@
           <w:lang w:val="en-US"/>
         </w:rPr>
       </w:pPr>
-      <w:bookmarkStart w:id="33" w:name="__RefHeading___Toc2763_3933516918"/>
-      <w:bookmarkEnd w:id="33"/>
+      <w:bookmarkStart w:id="34" w:name="__RefHeading___Toc2763_3933516918"/>
+      <w:bookmarkEnd w:id="34"/>
       <w:r>
         <w:rPr/>
         <w:t xml:space="preserve">5 </w:t>
@@ -11438,8 +11617,8 @@
           <w:lang w:val="uk-UA"/>
         </w:rPr>
       </w:pPr>
-      <w:bookmarkStart w:id="34" w:name="__RefHeading___Toc2765_3933516918"/>
-      <w:bookmarkEnd w:id="34"/>
+      <w:bookmarkStart w:id="35" w:name="__RefHeading___Toc2765_3933516918"/>
+      <w:bookmarkEnd w:id="35"/>
       <w:r>
         <w:rPr>
           <w:lang w:val="en-US"/>
@@ -11668,7 +11847,7 @@
         </w:rPr>
         <w:t xml:space="preserve">перейти до сторінки </w:t>
       </w:r>
-      <w:hyperlink r:id="rId12">
+      <w:hyperlink r:id="rId13">
         <w:r>
           <w:rPr>
             <w:rStyle w:val="Hyperlink"/>
@@ -11715,8 +11894,8 @@
           <w:lang w:val="uk-UA"/>
         </w:rPr>
       </w:pPr>
-      <w:bookmarkStart w:id="35" w:name="__RefHeading___Toc2767_3933516918"/>
-      <w:bookmarkEnd w:id="35"/>
+      <w:bookmarkStart w:id="36" w:name="__RefHeading___Toc2767_3933516918"/>
+      <w:bookmarkEnd w:id="36"/>
       <w:r>
         <w:rPr/>
         <w:t>5.2 Звертання до програми</w:t>
@@ -11797,7 +11976,7 @@
           <wp:inline distT="0" distB="0" distL="0" distR="0">
             <wp:extent cx="2914650" cy="695325"/>
             <wp:effectExtent l="0" t="0" r="0" b="0"/>
-            <wp:docPr id="11" name="Зображення8"/>
+            <wp:docPr id="12" name="Зображення8"/>
             <wp:cNvGraphicFramePr>
               <a:graphicFrameLocks xmlns:a="http://schemas.openxmlformats.org/drawingml/2006/main" noChangeAspect="1"/>
             </wp:cNvGraphicFramePr>
@@ -11805,13 +11984,13 @@
               <a:graphicData uri="http://schemas.openxmlformats.org/drawingml/2006/picture">
                 <pic:pic xmlns:pic="http://schemas.openxmlformats.org/drawingml/2006/picture">
                   <pic:nvPicPr>
-                    <pic:cNvPr id="11" name="Зображення8"/>
+                    <pic:cNvPr id="12" name="Зображення8"/>
                     <pic:cNvPicPr>
                       <a:picLocks noChangeAspect="1" noChangeArrowheads="1"/>
                     </pic:cNvPicPr>
                   </pic:nvPicPr>
                   <pic:blipFill>
-                    <a:blip r:embed="rId13"/>
+                    <a:blip r:embed="rId14"/>
                     <a:srcRect l="-12" t="-52" r="-12" b="-52"/>
                     <a:stretch>
                       <a:fillRect/>
@@ -11963,7 +12142,7 @@
           <wp:inline distT="0" distB="0" distL="0" distR="0">
             <wp:extent cx="2475230" cy="3829050"/>
             <wp:effectExtent l="0" t="0" r="0" b="0"/>
-            <wp:docPr id="12" name="Зображення9"/>
+            <wp:docPr id="13" name="Зображення9"/>
             <wp:cNvGraphicFramePr>
               <a:graphicFrameLocks xmlns:a="http://schemas.openxmlformats.org/drawingml/2006/main" noChangeAspect="1"/>
             </wp:cNvGraphicFramePr>
@@ -11971,13 +12150,13 @@
               <a:graphicData uri="http://schemas.openxmlformats.org/drawingml/2006/picture">
                 <pic:pic xmlns:pic="http://schemas.openxmlformats.org/drawingml/2006/picture">
                   <pic:nvPicPr>
-                    <pic:cNvPr id="12" name="Зображення9"/>
+                    <pic:cNvPr id="13" name="Зображення9"/>
                     <pic:cNvPicPr>
                       <a:picLocks noChangeAspect="1" noChangeArrowheads="1"/>
                     </pic:cNvPicPr>
                   </pic:nvPicPr>
                   <pic:blipFill>
-                    <a:blip r:embed="rId14"/>
+                    <a:blip r:embed="rId15"/>
                     <a:srcRect l="-12" t="-8" r="-12" b="-8"/>
                     <a:stretch>
                       <a:fillRect/>
@@ -12095,7 +12274,7 @@
           <wp:inline distT="0" distB="0" distL="0" distR="0">
             <wp:extent cx="2962275" cy="2162175"/>
             <wp:effectExtent l="0" t="0" r="0" b="0"/>
-            <wp:docPr id="13" name="Зображення10"/>
+            <wp:docPr id="14" name="Зображення10"/>
             <wp:cNvGraphicFramePr>
               <a:graphicFrameLocks xmlns:a="http://schemas.openxmlformats.org/drawingml/2006/main" noChangeAspect="1"/>
             </wp:cNvGraphicFramePr>
@@ -12103,13 +12282,13 @@
               <a:graphicData uri="http://schemas.openxmlformats.org/drawingml/2006/picture">
                 <pic:pic xmlns:pic="http://schemas.openxmlformats.org/drawingml/2006/picture">
                   <pic:nvPicPr>
-                    <pic:cNvPr id="13" name="Зображення10"/>
+                    <pic:cNvPr id="14" name="Зображення10"/>
                     <pic:cNvPicPr>
                       <a:picLocks noChangeAspect="1" noChangeArrowheads="1"/>
                     </pic:cNvPicPr>
                   </pic:nvPicPr>
                   <pic:blipFill>
-                    <a:blip r:embed="rId15"/>
+                    <a:blip r:embed="rId16"/>
                     <a:srcRect l="-12" t="-17" r="-12" b="-17"/>
                     <a:stretch>
                       <a:fillRect/>
@@ -12161,14 +12340,14 @@
         <w:spacing w:lineRule="auto" w:line="360" w:before="0" w:after="0"/>
         <w:rPr/>
       </w:pPr>
-      <w:bookmarkStart w:id="36" w:name="__RefHeading___Toc66122_3682473240"/>
-      <w:bookmarkStart w:id="37" w:name="_Toc31200652"/>
-      <w:bookmarkEnd w:id="36"/>
+      <w:bookmarkStart w:id="37" w:name="__RefHeading___Toc66122_3682473240"/>
+      <w:bookmarkStart w:id="38" w:name="_Toc31200652"/>
+      <w:bookmarkEnd w:id="37"/>
       <w:r>
         <w:rPr/>
         <w:t>ВИСНОВКИ</w:t>
       </w:r>
-      <w:bookmarkEnd w:id="37"/>
+      <w:bookmarkEnd w:id="38"/>
     </w:p>
     <w:p>
       <w:pPr>
@@ -12220,9 +12399,9 @@
         <w:spacing w:lineRule="auto" w:line="360" w:before="0" w:after="0"/>
         <w:rPr/>
       </w:pPr>
-      <w:bookmarkStart w:id="38" w:name="__RefHeading___Toc66124_3682473240"/>
-      <w:bookmarkStart w:id="39" w:name="_Toc31200653"/>
-      <w:bookmarkEnd w:id="38"/>
+      <w:bookmarkStart w:id="39" w:name="__RefHeading___Toc66124_3682473240"/>
+      <w:bookmarkStart w:id="40" w:name="_Toc31200653"/>
+      <w:bookmarkEnd w:id="39"/>
       <w:r>
         <w:rPr/>
         <w:t xml:space="preserve">ПЕРЕЛІК </w:t>
@@ -12237,7 +12416,7 @@
         <w:rPr/>
         <w:t>ПОСИЛАННЯ</w:t>
       </w:r>
-      <w:bookmarkEnd w:id="39"/>
+      <w:bookmarkEnd w:id="40"/>
     </w:p>
     <w:p>
       <w:pPr>
@@ -12272,7 +12451,7 @@
         </w:rPr>
         <w:t xml:space="preserve">1. </w:t>
       </w:r>
-      <w:hyperlink r:id="rId16">
+      <w:hyperlink r:id="rId17">
         <w:r>
           <w:rPr>
             <w:rStyle w:val="Hyperlink"/>
@@ -12297,7 +12476,7 @@
         </w:rPr>
         <w:t xml:space="preserve">URL: </w:t>
       </w:r>
-      <w:hyperlink r:id="rId17">
+      <w:hyperlink r:id="rId18">
         <w:r>
           <w:rPr>
             <w:rStyle w:val="Hyperlink"/>
@@ -12345,7 +12524,7 @@
         </w:rPr>
         <w:t xml:space="preserve">2. </w:t>
       </w:r>
-      <w:hyperlink r:id="rId18">
+      <w:hyperlink r:id="rId19">
         <w:r>
           <w:rPr>
             <w:rStyle w:val="Hyperlink"/>
@@ -12370,7 +12549,7 @@
         </w:rPr>
         <w:t xml:space="preserve">URL: </w:t>
       </w:r>
-      <w:hyperlink r:id="rId19">
+      <w:hyperlink r:id="rId20">
         <w:r>
           <w:rPr>
             <w:rStyle w:val="Hyperlink"/>
@@ -12422,7 +12601,7 @@
         </w:rPr>
         <w:t xml:space="preserve">3. </w:t>
       </w:r>
-      <w:hyperlink r:id="rId20">
+      <w:hyperlink r:id="rId21">
         <w:r>
           <w:rPr>
             <w:rStyle w:val="Hyperlink"/>
@@ -12449,7 +12628,7 @@
         </w:rPr>
         <w:t xml:space="preserve">URL: </w:t>
       </w:r>
-      <w:hyperlink r:id="rId21">
+      <w:hyperlink r:id="rId22">
         <w:r>
           <w:rPr>
             <w:rStyle w:val="Hyperlink"/>
@@ -12938,10 +13117,10 @@
       </w:r>
     </w:p>
     <w:sectPr>
-      <w:headerReference w:type="default" r:id="rId22"/>
-      <w:headerReference w:type="first" r:id="rId23"/>
-      <w:footerReference w:type="default" r:id="rId24"/>
-      <w:footerReference w:type="first" r:id="rId25"/>
+      <w:headerReference w:type="default" r:id="rId23"/>
+      <w:headerReference w:type="first" r:id="rId24"/>
+      <w:footerReference w:type="default" r:id="rId25"/>
+      <w:footerReference w:type="first" r:id="rId26"/>
       <w:type w:val="nextPage"/>
       <w:pgSz w:w="11906" w:h="16838"/>
       <w:pgMar w:left="1701" w:right="851" w:gutter="0" w:header="567" w:top="1134" w:footer="0" w:bottom="1134"/>
@@ -13192,7 +13371,7 @@
               <wp:extent cx="629920" cy="203200"/>
               <wp:effectExtent l="0" t="0" r="0" b="0"/>
               <wp:wrapSquare wrapText="bothSides"/>
-              <wp:docPr id="14" name="Рамка4"/>
+              <wp:docPr id="15" name="Рамка4"/>
               <a:graphic xmlns:a="http://schemas.openxmlformats.org/drawingml/2006/main">
                 <a:graphicData uri="http://schemas.microsoft.com/office/word/2010/wordprocessingShape">
                   <wps:wsp>

</xml_diff>

<commit_message>
feat: create tables and fill in trucks, diploma
</commit_message>
<xml_diff>
--- a/42D Dyplom/KNT-122_Onyshchenko_PZ.docx
+++ b/42D Dyplom/KNT-122_Onyshchenko_PZ.docx
@@ -438,7 +438,7 @@
       <w:pPr>
         <w:pStyle w:val="Heading2"/>
         <w:spacing w:lineRule="auto" w:line="240"/>
-        <w:ind w:hanging="0"/>
+        <w:ind w:hanging="0" w:start="0"/>
         <w:jc w:val="center"/>
         <w:rPr>
           <w:bCs/>
@@ -1242,7 +1242,7 @@
         <mc:AlternateContent>
           <mc:Choice Requires="wps">
             <w:drawing>
-              <wp:anchor behindDoc="0" distT="0" distB="0" distL="635" distR="0" simplePos="0" locked="0" layoutInCell="1" allowOverlap="1" relativeHeight="55">
+              <wp:anchor behindDoc="0" distT="0" distB="0" distL="635" distR="0" simplePos="0" locked="0" layoutInCell="1" allowOverlap="1" relativeHeight="67">
                 <wp:simplePos x="0" y="0"/>
                 <wp:positionH relativeFrom="column">
                   <wp:posOffset>5852160</wp:posOffset>
@@ -1551,7 +1551,7 @@
     <w:p>
       <w:pPr>
         <w:pStyle w:val="Heading1"/>
-        <w:ind w:firstLine="1750"/>
+        <w:ind w:firstLine="1750" w:start="0"/>
         <w:rPr>
           <w:b w:val="false"/>
           <w:bCs w:val="false"/>
@@ -1768,7 +1768,7 @@
     <w:p>
       <w:pPr>
         <w:pStyle w:val="Heading2"/>
-        <w:ind w:hanging="0"/>
+        <w:ind w:hanging="0" w:start="0"/>
         <w:jc w:val="center"/>
         <w:rPr>
           <w:sz w:val="32"/>
@@ -1789,7 +1789,7 @@
       <w:pPr>
         <w:pStyle w:val="Heading3"/>
         <w:spacing w:lineRule="auto" w:line="240" w:before="60" w:after="60"/>
-        <w:ind w:hanging="0"/>
+        <w:ind w:hanging="0" w:start="0"/>
         <w:jc w:val="center"/>
         <w:rPr>
           <w:rFonts w:ascii="Times New Roman" w:hAnsi="Times New Roman" w:cs="Times New Roman"/>
@@ -2685,7 +2685,7 @@
         <mc:AlternateContent>
           <mc:Choice Requires="wps">
             <w:drawing>
-              <wp:anchor behindDoc="0" distT="5080" distB="5080" distL="5080" distR="5080" simplePos="0" locked="0" layoutInCell="1" allowOverlap="1" relativeHeight="56">
+              <wp:anchor behindDoc="0" distT="5080" distB="5080" distL="5080" distR="5080" simplePos="0" locked="0" layoutInCell="1" allowOverlap="1" relativeHeight="68">
                 <wp:simplePos x="0" y="0"/>
                 <wp:positionH relativeFrom="column">
                   <wp:posOffset>5943600</wp:posOffset>
@@ -3421,7 +3421,7 @@
       <w:pPr>
         <w:pStyle w:val="Heading4"/>
         <w:spacing w:lineRule="auto" w:line="240"/>
-        <w:ind w:hanging="0"/>
+        <w:ind w:hanging="0" w:start="0"/>
         <w:jc w:val="center"/>
         <w:rPr/>
       </w:pPr>
@@ -3460,8 +3460,8 @@
         </w:tblCellMar>
       </w:tblPr>
       <w:tblGrid>
-        <w:gridCol w:w="525"/>
-        <w:gridCol w:w="5150"/>
+        <w:gridCol w:w="524"/>
+        <w:gridCol w:w="5151"/>
         <w:gridCol w:w="2411"/>
         <w:gridCol w:w="1559"/>
       </w:tblGrid>
@@ -3469,7 +3469,7 @@
         <w:trPr/>
         <w:tc>
           <w:tcPr>
-            <w:tcW w:w="525" w:type="dxa"/>
+            <w:tcW w:w="524" w:type="dxa"/>
             <w:tcBorders>
               <w:top w:val="single" w:sz="4" w:space="0" w:color="000000"/>
               <w:start w:val="single" w:sz="4" w:space="0" w:color="000000"/>
@@ -3519,7 +3519,7 @@
         </w:tc>
         <w:tc>
           <w:tcPr>
-            <w:tcW w:w="5150" w:type="dxa"/>
+            <w:tcW w:w="5151" w:type="dxa"/>
             <w:tcBorders>
               <w:top w:val="single" w:sz="4" w:space="0" w:color="000000"/>
               <w:start w:val="single" w:sz="4" w:space="0" w:color="000000"/>
@@ -3640,7 +3640,7 @@
             <w:pPr>
               <w:pStyle w:val="Heading3"/>
               <w:spacing w:lineRule="auto" w:line="240" w:before="0" w:after="0"/>
-              <w:ind w:hanging="0"/>
+              <w:ind w:hanging="0" w:start="0"/>
               <w:jc w:val="center"/>
               <w:rPr>
                 <w:rFonts w:ascii="Times New Roman" w:hAnsi="Times New Roman" w:cs="Times New Roman"/>
@@ -3665,7 +3665,7 @@
         <w:trPr/>
         <w:tc>
           <w:tcPr>
-            <w:tcW w:w="525" w:type="dxa"/>
+            <w:tcW w:w="524" w:type="dxa"/>
             <w:tcBorders>
               <w:top w:val="single" w:sz="4" w:space="0" w:color="000000"/>
               <w:start w:val="single" w:sz="4" w:space="0" w:color="000000"/>
@@ -3696,7 +3696,7 @@
         </w:tc>
         <w:tc>
           <w:tcPr>
-            <w:tcW w:w="5150" w:type="dxa"/>
+            <w:tcW w:w="5151" w:type="dxa"/>
             <w:tcBorders>
               <w:top w:val="single" w:sz="4" w:space="0" w:color="000000"/>
               <w:start w:val="single" w:sz="4" w:space="0" w:color="000000"/>
@@ -3792,7 +3792,7 @@
         <w:trPr/>
         <w:tc>
           <w:tcPr>
-            <w:tcW w:w="525" w:type="dxa"/>
+            <w:tcW w:w="524" w:type="dxa"/>
             <w:tcBorders>
               <w:top w:val="single" w:sz="4" w:space="0" w:color="000000"/>
               <w:start w:val="single" w:sz="4" w:space="0" w:color="000000"/>
@@ -3823,7 +3823,7 @@
         </w:tc>
         <w:tc>
           <w:tcPr>
-            <w:tcW w:w="5150" w:type="dxa"/>
+            <w:tcW w:w="5151" w:type="dxa"/>
             <w:tcBorders>
               <w:top w:val="single" w:sz="4" w:space="0" w:color="000000"/>
               <w:start w:val="single" w:sz="4" w:space="0" w:color="000000"/>
@@ -3919,7 +3919,7 @@
         <w:trPr/>
         <w:tc>
           <w:tcPr>
-            <w:tcW w:w="525" w:type="dxa"/>
+            <w:tcW w:w="524" w:type="dxa"/>
             <w:tcBorders>
               <w:top w:val="single" w:sz="4" w:space="0" w:color="000000"/>
               <w:start w:val="single" w:sz="4" w:space="0" w:color="000000"/>
@@ -3950,7 +3950,7 @@
         </w:tc>
         <w:tc>
           <w:tcPr>
-            <w:tcW w:w="5150" w:type="dxa"/>
+            <w:tcW w:w="5151" w:type="dxa"/>
             <w:tcBorders>
               <w:top w:val="single" w:sz="4" w:space="0" w:color="000000"/>
               <w:start w:val="single" w:sz="4" w:space="0" w:color="000000"/>
@@ -4051,7 +4051,7 @@
         <w:trPr/>
         <w:tc>
           <w:tcPr>
-            <w:tcW w:w="525" w:type="dxa"/>
+            <w:tcW w:w="524" w:type="dxa"/>
             <w:tcBorders>
               <w:top w:val="single" w:sz="4" w:space="0" w:color="000000"/>
               <w:start w:val="single" w:sz="4" w:space="0" w:color="000000"/>
@@ -4082,7 +4082,7 @@
         </w:tc>
         <w:tc>
           <w:tcPr>
-            <w:tcW w:w="5150" w:type="dxa"/>
+            <w:tcW w:w="5151" w:type="dxa"/>
             <w:tcBorders>
               <w:top w:val="single" w:sz="4" w:space="0" w:color="000000"/>
               <w:start w:val="single" w:sz="4" w:space="0" w:color="000000"/>
@@ -4177,7 +4177,7 @@
         <w:trPr/>
         <w:tc>
           <w:tcPr>
-            <w:tcW w:w="525" w:type="dxa"/>
+            <w:tcW w:w="524" w:type="dxa"/>
             <w:tcBorders>
               <w:top w:val="single" w:sz="4" w:space="0" w:color="000000"/>
               <w:start w:val="single" w:sz="4" w:space="0" w:color="000000"/>
@@ -4208,7 +4208,7 @@
         </w:tc>
         <w:tc>
           <w:tcPr>
-            <w:tcW w:w="5150" w:type="dxa"/>
+            <w:tcW w:w="5151" w:type="dxa"/>
             <w:tcBorders>
               <w:top w:val="single" w:sz="4" w:space="0" w:color="000000"/>
               <w:start w:val="single" w:sz="4" w:space="0" w:color="000000"/>
@@ -4304,7 +4304,7 @@
         <w:trPr/>
         <w:tc>
           <w:tcPr>
-            <w:tcW w:w="525" w:type="dxa"/>
+            <w:tcW w:w="524" w:type="dxa"/>
             <w:tcBorders>
               <w:top w:val="single" w:sz="4" w:space="0" w:color="000000"/>
               <w:start w:val="single" w:sz="4" w:space="0" w:color="000000"/>
@@ -4335,7 +4335,7 @@
         </w:tc>
         <w:tc>
           <w:tcPr>
-            <w:tcW w:w="5150" w:type="dxa"/>
+            <w:tcW w:w="5151" w:type="dxa"/>
             <w:tcBorders>
               <w:top w:val="single" w:sz="4" w:space="0" w:color="000000"/>
               <w:start w:val="single" w:sz="4" w:space="0" w:color="000000"/>
@@ -4431,7 +4431,7 @@
         <w:trPr/>
         <w:tc>
           <w:tcPr>
-            <w:tcW w:w="525" w:type="dxa"/>
+            <w:tcW w:w="524" w:type="dxa"/>
             <w:tcBorders>
               <w:top w:val="single" w:sz="4" w:space="0" w:color="000000"/>
               <w:start w:val="single" w:sz="4" w:space="0" w:color="000000"/>
@@ -4462,7 +4462,7 @@
         </w:tc>
         <w:tc>
           <w:tcPr>
-            <w:tcW w:w="5150" w:type="dxa"/>
+            <w:tcW w:w="5151" w:type="dxa"/>
             <w:tcBorders>
               <w:top w:val="single" w:sz="4" w:space="0" w:color="000000"/>
               <w:start w:val="single" w:sz="4" w:space="0" w:color="000000"/>
@@ -4558,7 +4558,7 @@
         <w:trPr/>
         <w:tc>
           <w:tcPr>
-            <w:tcW w:w="525" w:type="dxa"/>
+            <w:tcW w:w="524" w:type="dxa"/>
             <w:tcBorders>
               <w:top w:val="single" w:sz="4" w:space="0" w:color="000000"/>
               <w:start w:val="single" w:sz="4" w:space="0" w:color="000000"/>
@@ -4589,7 +4589,7 @@
         </w:tc>
         <w:tc>
           <w:tcPr>
-            <w:tcW w:w="5150" w:type="dxa"/>
+            <w:tcW w:w="5151" w:type="dxa"/>
             <w:tcBorders>
               <w:top w:val="single" w:sz="4" w:space="0" w:color="000000"/>
               <w:start w:val="single" w:sz="4" w:space="0" w:color="000000"/>
@@ -4684,7 +4684,7 @@
         <w:trPr/>
         <w:tc>
           <w:tcPr>
-            <w:tcW w:w="525" w:type="dxa"/>
+            <w:tcW w:w="524" w:type="dxa"/>
             <w:tcBorders>
               <w:top w:val="single" w:sz="4" w:space="0" w:color="000000"/>
               <w:start w:val="single" w:sz="4" w:space="0" w:color="000000"/>
@@ -4715,7 +4715,7 @@
         </w:tc>
         <w:tc>
           <w:tcPr>
-            <w:tcW w:w="5150" w:type="dxa"/>
+            <w:tcW w:w="5151" w:type="dxa"/>
             <w:tcBorders>
               <w:top w:val="single" w:sz="4" w:space="0" w:color="000000"/>
               <w:start w:val="single" w:sz="4" w:space="0" w:color="000000"/>
@@ -5062,10 +5062,12 @@
     <w:p>
       <w:pPr>
         <w:sectPr>
-          <w:headerReference w:type="default" r:id="rId2"/>
-          <w:headerReference w:type="first" r:id="rId3"/>
-          <w:footerReference w:type="default" r:id="rId4"/>
-          <w:footerReference w:type="first" r:id="rId5"/>
+          <w:headerReference w:type="even" r:id="rId2"/>
+          <w:headerReference w:type="default" r:id="rId3"/>
+          <w:headerReference w:type="first" r:id="rId4"/>
+          <w:footerReference w:type="even" r:id="rId5"/>
+          <w:footerReference w:type="default" r:id="rId6"/>
+          <w:footerReference w:type="first" r:id="rId7"/>
           <w:type w:val="nextPage"/>
           <w:pgSz w:w="11906" w:h="16838"/>
           <w:pgMar w:left="1531" w:right="737" w:gutter="0" w:header="567" w:top="1191" w:footer="0" w:bottom="1191"/>
@@ -5094,7 +5096,7 @@
         <mc:AlternateContent>
           <mc:Choice Requires="wps">
             <w:drawing>
-              <wp:anchor behindDoc="0" distT="0" distB="0" distL="635" distR="0" simplePos="0" locked="0" layoutInCell="1" allowOverlap="1" relativeHeight="54">
+              <wp:anchor behindDoc="0" distT="0" distB="0" distL="635" distR="0" simplePos="0" locked="0" layoutInCell="1" allowOverlap="1" relativeHeight="66">
                 <wp:simplePos x="0" y="0"/>
                 <wp:positionH relativeFrom="column">
                   <wp:posOffset>5852160</wp:posOffset>
@@ -5199,7 +5201,19 @@
         <w:rPr>
           <w:lang w:val="uk-UA"/>
         </w:rPr>
-        <w:t>Пояснювальна записка до дипломної кваліфікаційної роботи бакалавра містить: 20 с., 6 табл., 1 рис., 3 дод., 5 джерел.</w:t>
+        <w:t>Пояснювальна записка до дипломної кваліфікаційної роботи бакалавра містить: 2</w:t>
+      </w:r>
+      <w:r>
+        <w:rPr>
+          <w:lang w:val="en-US"/>
+        </w:rPr>
+        <w:t>7</w:t>
+      </w:r>
+      <w:r>
+        <w:rPr>
+          <w:lang w:val="uk-UA"/>
+        </w:rPr>
+        <w:t xml:space="preserve"> с., 6 табл., 1 рис., 3 дод., 5 джерел.</w:t>
       </w:r>
     </w:p>
     <w:p>
@@ -5214,13 +5228,19 @@
         <w:rPr>
           <w:lang w:val="uk-UA"/>
         </w:rPr>
-        <w:t xml:space="preserve">ІНТЕРНЕТ МАГАЗИН ВАНТАЖІВОК, МАГАЗИН ТОВАРІВ, ЗАСТОУСНОК ДЛЯ НАСТОЛЬНИХ КОМП’ЮТЕРІВ, </w:t>
+        <w:t xml:space="preserve">ІНТЕРНЕТ МАГАЗИН ВАНТАЖІВОК, МАГАЗИН ТОВАРІВ, </w:t>
+      </w:r>
+      <w:r>
+        <w:rPr>
+          <w:lang w:val="uk-UA"/>
+        </w:rPr>
+        <w:t xml:space="preserve">ВЕБ-ЗАСТОСУНОК, </w:t>
       </w:r>
       <w:r>
         <w:rPr>
           <w:lang w:val="en-US"/>
         </w:rPr>
-        <w:t>WINFORMS, C#</w:t>
+        <w:t>NICEGUI, PYTHON.</w:t>
       </w:r>
     </w:p>
     <w:p>
@@ -5235,7 +5255,31 @@
         <w:rPr>
           <w:lang w:val="uk-UA"/>
         </w:rPr>
-        <w:t>Об’єкт дослідження – програмні засоби для продажу вантажних автомобілів.</w:t>
+        <w:t xml:space="preserve">Об’єкт </w:t>
+      </w:r>
+      <w:r>
+        <w:rPr>
+          <w:lang w:val="uk-UA"/>
+        </w:rPr>
+        <w:t>проєктування</w:t>
+      </w:r>
+      <w:r>
+        <w:rPr>
+          <w:lang w:val="uk-UA"/>
+        </w:rPr>
+        <w:t xml:space="preserve"> – </w:t>
+      </w:r>
+      <w:r>
+        <w:rPr>
+          <w:lang w:val="uk-UA"/>
+        </w:rPr>
+        <w:t>сучасні інтернет магазини вантажівок</w:t>
+      </w:r>
+      <w:r>
+        <w:rPr>
+          <w:lang w:val="uk-UA"/>
+        </w:rPr>
+        <w:t>.</w:t>
       </w:r>
     </w:p>
     <w:p>
@@ -5250,7 +5294,31 @@
         <w:rPr>
           <w:lang w:val="uk-UA"/>
         </w:rPr>
-        <w:t>Предмет дослідження – комп’ютерні програми для купівлі вантажівок.</w:t>
+        <w:t xml:space="preserve">Предмет </w:t>
+      </w:r>
+      <w:r>
+        <w:rPr>
+          <w:lang w:val="uk-UA"/>
+        </w:rPr>
+        <w:t>проєктування</w:t>
+      </w:r>
+      <w:r>
+        <w:rPr>
+          <w:lang w:val="uk-UA"/>
+        </w:rPr>
+        <w:t xml:space="preserve"> – </w:t>
+      </w:r>
+      <w:r>
+        <w:rPr>
+          <w:lang w:val="uk-UA"/>
+        </w:rPr>
+        <w:t>програмні засоби продажу вантажних автомобілей в інтернеті</w:t>
+      </w:r>
+      <w:r>
+        <w:rPr>
+          <w:lang w:val="uk-UA"/>
+        </w:rPr>
+        <w:t>.</w:t>
       </w:r>
     </w:p>
     <w:p>
@@ -5300,77 +5368,208 @@
     </w:p>
     <w:p>
       <w:pPr>
-        <w:pStyle w:val="Normal"/>
-        <w:spacing w:lineRule="auto" w:line="348"/>
-        <w:rPr>
-          <w:lang w:val="uk-UA"/>
-        </w:rPr>
-      </w:pPr>
-      <w:r>
-        <w:rPr>
-          <w:lang w:val="uk-UA"/>
-        </w:rPr>
-        <w:t>Показники успішності:</w:t>
-      </w:r>
-    </w:p>
-    <w:p>
-      <w:pPr>
-        <w:pStyle w:val="Normal"/>
-        <w:spacing w:lineRule="auto" w:line="348"/>
-        <w:rPr>
-          <w:lang w:val="uk-UA"/>
-        </w:rPr>
-      </w:pPr>
-      <w:r>
-        <w:rPr>
-          <w:lang w:val="uk-UA"/>
-        </w:rPr>
-        <w:t>- Пояснювальна записка згідно вимог;</w:t>
-      </w:r>
-    </w:p>
-    <w:p>
-      <w:pPr>
-        <w:pStyle w:val="Normal"/>
-        <w:spacing w:lineRule="auto" w:line="348"/>
-        <w:rPr>
-          <w:lang w:val="uk-UA"/>
-        </w:rPr>
-      </w:pPr>
-      <w:r>
-        <w:rPr>
-          <w:lang w:val="uk-UA"/>
-        </w:rPr>
-        <w:t>- Оформлена презентація;</w:t>
-      </w:r>
-    </w:p>
-    <w:p>
-      <w:pPr>
-        <w:pStyle w:val="Normal"/>
-        <w:spacing w:lineRule="auto" w:line="348"/>
-        <w:rPr>
-          <w:lang w:val="uk-UA"/>
-        </w:rPr>
-      </w:pPr>
-      <w:r>
-        <w:rPr>
-          <w:lang w:val="uk-UA"/>
-        </w:rPr>
-        <w:t>- Працездатна програма.</w:t>
-      </w:r>
-    </w:p>
-    <w:p>
-      <w:pPr>
-        <w:pStyle w:val="Normal"/>
-        <w:spacing w:lineRule="auto" w:line="348"/>
-        <w:rPr>
-          <w:lang w:val="uk-UA"/>
-        </w:rPr>
-      </w:pPr>
-      <w:r>
-        <w:rPr>
-          <w:lang w:val="uk-UA"/>
-        </w:rPr>
-        <w:t>Висновки — розроблено програмну систему для продажу вантажних авто.</w:t>
+        <w:pStyle w:val="Common"/>
+        <w:rPr/>
+      </w:pPr>
+      <w:r>
+        <w:rPr>
+          <w:rFonts w:eastAsia="Times New Roman" w:cs="Times New Roman"/>
+          <w:szCs w:val="28"/>
+          <w:lang w:val="uk-UA"/>
+        </w:rPr>
+        <w:t>Програмний застосунок містить наступні функції:</w:t>
+      </w:r>
+    </w:p>
+    <w:p>
+      <w:pPr>
+        <w:pStyle w:val="Common"/>
+        <w:rPr>
+          <w:rFonts w:eastAsia="Times New Roman" w:cs="Times New Roman"/>
+          <w:szCs w:val="28"/>
+          <w:lang w:val="uk-UA"/>
+        </w:rPr>
+      </w:pPr>
+      <w:r>
+        <w:rPr>
+          <w:rFonts w:eastAsia="Times New Roman" w:cs="Times New Roman"/>
+          <w:szCs w:val="28"/>
+          <w:lang w:val="uk-UA"/>
+        </w:rPr>
+        <w:t xml:space="preserve">- </w:t>
+      </w:r>
+      <w:r>
+        <w:rPr>
+          <w:rFonts w:eastAsia="Times New Roman" w:cs="Times New Roman"/>
+          <w:szCs w:val="28"/>
+          <w:lang w:val="uk-UA"/>
+        </w:rPr>
+        <w:t>купівля вантажівки</w:t>
+      </w:r>
+      <w:r>
+        <w:rPr>
+          <w:rFonts w:eastAsia="Times New Roman" w:cs="Times New Roman"/>
+          <w:szCs w:val="28"/>
+          <w:lang w:val="uk-UA"/>
+        </w:rPr>
+        <w:t>;</w:t>
+      </w:r>
+    </w:p>
+    <w:p>
+      <w:pPr>
+        <w:pStyle w:val="Common"/>
+        <w:rPr>
+          <w:rFonts w:eastAsia="Times New Roman" w:cs="Times New Roman"/>
+          <w:szCs w:val="28"/>
+          <w:lang w:val="uk-UA"/>
+        </w:rPr>
+      </w:pPr>
+      <w:r>
+        <w:rPr>
+          <w:rFonts w:eastAsia="Times New Roman" w:cs="Times New Roman"/>
+          <w:szCs w:val="28"/>
+          <w:lang w:val="uk-UA"/>
+        </w:rPr>
+        <w:t xml:space="preserve">- </w:t>
+      </w:r>
+      <w:r>
+        <w:rPr>
+          <w:rFonts w:eastAsia="Times New Roman" w:cs="Times New Roman"/>
+          <w:szCs w:val="28"/>
+          <w:lang w:val="uk-UA"/>
+        </w:rPr>
+        <w:t>продаж вантажівки</w:t>
+      </w:r>
+      <w:r>
+        <w:rPr>
+          <w:rFonts w:eastAsia="Times New Roman" w:cs="Times New Roman"/>
+          <w:szCs w:val="28"/>
+          <w:lang w:val="uk-UA"/>
+        </w:rPr>
+        <w:t>;</w:t>
+      </w:r>
+    </w:p>
+    <w:p>
+      <w:pPr>
+        <w:pStyle w:val="Common"/>
+        <w:rPr>
+          <w:rFonts w:eastAsia="Times New Roman" w:cs="Times New Roman"/>
+          <w:szCs w:val="28"/>
+          <w:lang w:val="uk-UA"/>
+        </w:rPr>
+      </w:pPr>
+      <w:r>
+        <w:rPr>
+          <w:rFonts w:eastAsia="Times New Roman" w:cs="Times New Roman"/>
+          <w:szCs w:val="28"/>
+          <w:lang w:val="uk-UA"/>
+        </w:rPr>
+        <w:t xml:space="preserve">- </w:t>
+      </w:r>
+      <w:r>
+        <w:rPr>
+          <w:rFonts w:eastAsia="Times New Roman" w:cs="Times New Roman"/>
+          <w:szCs w:val="28"/>
+          <w:lang w:val="uk-UA"/>
+        </w:rPr>
+        <w:t>здійснення рейсів</w:t>
+      </w:r>
+      <w:r>
+        <w:rPr>
+          <w:rFonts w:eastAsia="Times New Roman" w:cs="Times New Roman"/>
+          <w:szCs w:val="28"/>
+          <w:lang w:val="uk-UA"/>
+        </w:rPr>
+        <w:t>.</w:t>
+      </w:r>
+    </w:p>
+    <w:p>
+      <w:pPr>
+        <w:pStyle w:val="Common"/>
+        <w:rPr>
+          <w:rFonts w:eastAsia="Times New Roman" w:cs="Times New Roman"/>
+          <w:szCs w:val="28"/>
+          <w:lang w:val="uk-UA"/>
+        </w:rPr>
+      </w:pPr>
+      <w:r>
+        <w:rPr>
+          <w:rFonts w:eastAsia="Times New Roman" w:cs="Times New Roman"/>
+          <w:szCs w:val="28"/>
+          <w:lang w:val="uk-UA"/>
+        </w:rPr>
+        <w:t>Застосунок може бути використаний на таких платформах:</w:t>
+      </w:r>
+    </w:p>
+    <w:p>
+      <w:pPr>
+        <w:pStyle w:val="Common"/>
+        <w:rPr/>
+      </w:pPr>
+      <w:r>
+        <w:rPr>
+          <w:rFonts w:eastAsia="Times New Roman" w:cs="Times New Roman"/>
+          <w:szCs w:val="28"/>
+          <w:lang w:val="uk-UA"/>
+        </w:rPr>
+        <w:t xml:space="preserve">- </w:t>
+      </w:r>
+      <w:r>
+        <w:rPr>
+          <w:rFonts w:eastAsia="Times New Roman" w:cs="Times New Roman"/>
+          <w:szCs w:val="28"/>
+          <w:lang w:val="en-US"/>
+        </w:rPr>
+        <w:t>Windows;</w:t>
+      </w:r>
+    </w:p>
+    <w:p>
+      <w:pPr>
+        <w:pStyle w:val="Common"/>
+        <w:rPr>
+          <w:rFonts w:eastAsia="Times New Roman" w:cs="Times New Roman"/>
+          <w:szCs w:val="28"/>
+          <w:lang w:val="en-US"/>
+        </w:rPr>
+      </w:pPr>
+      <w:r>
+        <w:rPr>
+          <w:rFonts w:eastAsia="Times New Roman" w:cs="Times New Roman"/>
+          <w:szCs w:val="28"/>
+          <w:lang w:val="en-US"/>
+        </w:rPr>
+        <w:t>- MacOS;</w:t>
+      </w:r>
+    </w:p>
+    <w:p>
+      <w:pPr>
+        <w:pStyle w:val="Common"/>
+        <w:rPr>
+          <w:rFonts w:eastAsia="Times New Roman" w:cs="Times New Roman"/>
+          <w:szCs w:val="28"/>
+          <w:lang w:val="en-US"/>
+        </w:rPr>
+      </w:pPr>
+      <w:r>
+        <w:rPr>
+          <w:rFonts w:eastAsia="Times New Roman" w:cs="Times New Roman"/>
+          <w:szCs w:val="28"/>
+          <w:lang w:val="en-US"/>
+        </w:rPr>
+        <w:t>- Android;</w:t>
+      </w:r>
+    </w:p>
+    <w:p>
+      <w:pPr>
+        <w:pStyle w:val="Common"/>
+        <w:rPr/>
+      </w:pPr>
+      <w:r>
+        <w:rPr>
+          <w:rFonts w:eastAsia="Times New Roman" w:cs="Times New Roman"/>
+          <w:szCs w:val="28"/>
+          <w:lang w:val="en-US"/>
+        </w:rPr>
+        <w:t>- iOS.</w:t>
       </w:r>
       <w:r>
         <w:br w:type="page"/>
@@ -5380,6 +5579,7 @@
       <w:pPr>
         <w:pStyle w:val="Heading1"/>
         <w:spacing w:lineRule="auto" w:line="360" w:before="0" w:after="0"/>
+        <w:ind w:hanging="0" w:start="0"/>
         <w:rPr>
           <w:lang w:val="en-US"/>
         </w:rPr>
@@ -5421,7 +5621,7 @@
         <w:rPr>
           <w:lang w:val="en-US"/>
         </w:rPr>
-        <w:t>The explanatory note to the bachelor's thesis contains: 20 pages, 6 tables, 1 figure, 3 appendices, 5 sources.</w:t>
+        <w:t>The explanatory note to the bachelor's thesis contains: 27 pages, 6 tables, 1 figure, 3 appendices, 5 sources.</w:t>
       </w:r>
     </w:p>
     <w:p>
@@ -5435,7 +5635,7 @@
         <w:rPr>
           <w:lang w:val="en-US"/>
         </w:rPr>
-        <w:t>ONLINE TRUCKS STORE, E-STORE, DESKTOP APPLICATION, WINFORMS, C#</w:t>
+        <w:t>INTERNET TRUCK STORE, GOODS STORE, WEB APPLICATION, NICEGUI, PYTHON.</w:t>
       </w:r>
     </w:p>
     <w:p>
@@ -5449,7 +5649,7 @@
         <w:rPr>
           <w:lang w:val="en-US"/>
         </w:rPr>
-        <w:t>The object of research is software for selling trucks.</w:t>
+        <w:t>The object of design is modern online truck stores.</w:t>
       </w:r>
     </w:p>
     <w:p>
@@ -5463,7 +5663,7 @@
         <w:rPr>
           <w:lang w:val="en-US"/>
         </w:rPr>
-        <w:t>The subject of the study is computer programs for purchasing trucks.</w:t>
+        <w:t>The subject of design is software for selling trucks on the Internet.</w:t>
       </w:r>
     </w:p>
     <w:p>
@@ -5477,7 +5677,7 @@
         <w:rPr>
           <w:lang w:val="en-US"/>
         </w:rPr>
-        <w:t>The purpose of the work is to create a software system for ordering trucks.</w:t>
+        <w:t>The goal of the work is to create a software system for ordering trucks.</w:t>
       </w:r>
     </w:p>
     <w:p>
@@ -5505,7 +5705,7 @@
         <w:rPr>
           <w:lang w:val="en-US"/>
         </w:rPr>
-        <w:t>The result of the work should be a finished program, an explanatory note, and a project presentation.</w:t>
+        <w:t>The result of the work should be a finished program, explanatory note, and project presentation.</w:t>
       </w:r>
     </w:p>
     <w:p>
@@ -5519,7 +5719,7 @@
         <w:rPr>
           <w:lang w:val="en-US"/>
         </w:rPr>
-        <w:t>Success indicators:</w:t>
+        <w:t>The software application includes the following functions:</w:t>
       </w:r>
     </w:p>
     <w:p>
@@ -5533,7 +5733,7 @@
         <w:rPr>
           <w:lang w:val="en-US"/>
         </w:rPr>
-        <w:t>- Explanatory note in accordance with requirements;</w:t>
+        <w:t>- truck purchase;</w:t>
       </w:r>
     </w:p>
     <w:p>
@@ -5547,7 +5747,7 @@
         <w:rPr>
           <w:lang w:val="en-US"/>
         </w:rPr>
-        <w:t>- Formed presentation;</w:t>
+        <w:t>- truck sale;</w:t>
       </w:r>
     </w:p>
     <w:p>
@@ -5561,7 +5761,7 @@
         <w:rPr>
           <w:lang w:val="en-US"/>
         </w:rPr>
-        <w:t>- Working program.</w:t>
+        <w:t>- trip execution.</w:t>
       </w:r>
     </w:p>
     <w:p>
@@ -5575,7 +5775,63 @@
         <w:rPr>
           <w:lang w:val="en-US"/>
         </w:rPr>
-        <w:t>Conclusions — a software system for selling trucks has been developed.</w:t>
+        <w:t>The application can be used on the following platforms:</w:t>
+      </w:r>
+    </w:p>
+    <w:p>
+      <w:pPr>
+        <w:pStyle w:val="Normal"/>
+        <w:rPr>
+          <w:lang w:val="uk-UA"/>
+        </w:rPr>
+      </w:pPr>
+      <w:r>
+        <w:rPr>
+          <w:lang w:val="en-US"/>
+        </w:rPr>
+        <w:t>- Windows;</w:t>
+      </w:r>
+    </w:p>
+    <w:p>
+      <w:pPr>
+        <w:pStyle w:val="Normal"/>
+        <w:rPr>
+          <w:lang w:val="uk-UA"/>
+        </w:rPr>
+      </w:pPr>
+      <w:r>
+        <w:rPr>
+          <w:lang w:val="en-US"/>
+        </w:rPr>
+        <w:t>- MacOS;</w:t>
+      </w:r>
+    </w:p>
+    <w:p>
+      <w:pPr>
+        <w:pStyle w:val="Normal"/>
+        <w:rPr>
+          <w:lang w:val="uk-UA"/>
+        </w:rPr>
+      </w:pPr>
+      <w:r>
+        <w:rPr>
+          <w:lang w:val="en-US"/>
+        </w:rPr>
+        <w:t>- Android;</w:t>
+      </w:r>
+    </w:p>
+    <w:p>
+      <w:pPr>
+        <w:pStyle w:val="Normal"/>
+        <w:rPr>
+          <w:lang w:val="uk-UA"/>
+        </w:rPr>
+      </w:pPr>
+      <w:r>
+        <w:rPr>
+          <w:lang w:val="en-US"/>
+        </w:rPr>
+        <w:t>- iOS.</w:t>
       </w:r>
       <w:r>
         <w:br w:type="page"/>
@@ -5585,6 +5841,7 @@
       <w:pPr>
         <w:pStyle w:val="Heading1"/>
         <w:spacing w:lineRule="auto" w:line="360" w:before="0" w:after="0"/>
+        <w:ind w:hanging="0" w:start="0"/>
         <w:rPr/>
       </w:pPr>
       <w:bookmarkStart w:id="5" w:name="__RefHeading___Toc66098_3682473240"/>
@@ -5609,10 +5866,7 @@
         </w:rPr>
       </w:pPr>
       <w:r>
-        <w:rPr>
-          <w:lang w:val="uk-UA"/>
-        </w:rPr>
-        <w:t>С.</w:t>
+        <w:rPr/>
       </w:r>
     </w:p>
     <w:sdt>
@@ -5760,7 +6014,7 @@
               </w:rPr>
               <w:t>ПЕРЕЛІК СКОРОЧЕНЬ ТА УМОВНИХ ПОЗНАК</w:t>
               <w:tab/>
-              <w:t>7</w:t>
+              <w:t>8</w:t>
             </w:r>
           </w:hyperlink>
         </w:p>
@@ -5780,7 +6034,7 @@
               </w:rPr>
               <w:t>ВСТУП</w:t>
               <w:tab/>
-              <w:t>8</w:t>
+              <w:t>9</w:t>
             </w:r>
           </w:hyperlink>
         </w:p>
@@ -5800,7 +6054,7 @@
               </w:rPr>
               <w:t>1 АНАЛІЗ ПРЕДМЕТНОЇ ОБЛАСТІ ТА ОГЛЯД АНАЛОГІВ</w:t>
               <w:tab/>
-              <w:t>9</w:t>
+              <w:t>10</w:t>
             </w:r>
           </w:hyperlink>
         </w:p>
@@ -5820,7 +6074,7 @@
               </w:rPr>
               <w:t>1.1 Огляд існуючих методів вирішення завдання</w:t>
               <w:tab/>
-              <w:t>9</w:t>
+              <w:t>10</w:t>
             </w:r>
           </w:hyperlink>
         </w:p>
@@ -5840,7 +6094,27 @@
               </w:rPr>
               <w:t>1.2 Огляд існуючих програмних засобів</w:t>
               <w:tab/>
-              <w:t>9</w:t>
+              <w:t>10</w:t>
+            </w:r>
+          </w:hyperlink>
+        </w:p>
+        <w:p>
+          <w:pPr>
+            <w:pStyle w:val="TOC2"/>
+            <w:tabs>
+              <w:tab w:val="clear" w:pos="709"/>
+              <w:tab w:val="right" w:pos="9353" w:leader="dot"/>
+            </w:tabs>
+            <w:rPr/>
+          </w:pPr>
+          <w:hyperlink w:anchor="__RefHeading___Toc1385_4277420833" w:tooltip="1.3 Висновки за розділом">
+            <w:r>
+              <w:rPr>
+                <w:rStyle w:val="Style9"/>
+              </w:rPr>
+              <w:t>1.3 Висновки за розділом</w:t>
+              <w:tab/>
+              <w:t>15</w:t>
             </w:r>
           </w:hyperlink>
         </w:p>
@@ -5853,14 +6127,14 @@
             </w:tabs>
             <w:rPr/>
           </w:pPr>
-          <w:hyperlink w:anchor="__RefHeading___Toc66110_3682473240" w:tooltip="2 ЗАГОЛОВОК ПЕРШОГО РІВНЯ">
+          <w:hyperlink w:anchor="__RefHeading___Toc66110_3682473240" w:tooltip="2 ПРОЄКТУВАННЯ СТРУКТУРИ СИСТЕМИ">
             <w:r>
               <w:rPr>
                 <w:rStyle w:val="Style9"/>
               </w:rPr>
-              <w:t>2 ЗАГОЛОВОК ПЕРШОГО РІВНЯ</w:t>
+              <w:t>2 ПРОЄКТУВАННЯ СТРУКТУРИ СИСТЕМИ</w:t>
               <w:tab/>
-              <w:t>15</w:t>
+              <w:t>16</w:t>
             </w:r>
           </w:hyperlink>
         </w:p>
@@ -5873,14 +6147,14 @@
             </w:tabs>
             <w:rPr/>
           </w:pPr>
-          <w:hyperlink w:anchor="__RefHeading___Toc66112_3682473240" w:tooltip="2.1 Заголовок другого рівня">
+          <w:hyperlink w:anchor="__RefHeading___Toc66112_3682473240" w:tooltip="2.1 Створення структурної схеми">
             <w:r>
               <w:rPr>
                 <w:rStyle w:val="Style9"/>
               </w:rPr>
-              <w:t>2.1 Заголовок другого рівня</w:t>
+              <w:t>2.1 Створення структурної схеми</w:t>
               <w:tab/>
-              <w:t>15</w:t>
+              <w:t>16</w:t>
             </w:r>
           </w:hyperlink>
         </w:p>
@@ -5893,14 +6167,34 @@
             </w:tabs>
             <w:rPr/>
           </w:pPr>
-          <w:hyperlink w:anchor="__RefHeading___Toc66114_3682473240" w:tooltip="2.2 Заголовок другого рівня">
+          <w:hyperlink w:anchor="__RefHeading___Toc2737_3933516918" w:tooltip="2.2 Створення функціональної схеми">
             <w:r>
               <w:rPr>
                 <w:rStyle w:val="Style9"/>
               </w:rPr>
-              <w:t>2.2 Заголовок другого рівня</w:t>
+              <w:t>2.2 Створення функціональної схеми</w:t>
               <w:tab/>
-              <w:t>15</w:t>
+              <w:t>16</w:t>
+            </w:r>
+          </w:hyperlink>
+        </w:p>
+        <w:p>
+          <w:pPr>
+            <w:pStyle w:val="TOC1"/>
+            <w:tabs>
+              <w:tab w:val="clear" w:pos="9631"/>
+              <w:tab w:val="right" w:pos="9353" w:leader="dot"/>
+            </w:tabs>
+            <w:rPr/>
+          </w:pPr>
+          <w:hyperlink w:anchor="__RefHeading___Toc66118_3682473240" w:tooltip="3 ПРОГРАМНА РЕАЛІЗАЦІЯ">
+            <w:r>
+              <w:rPr>
+                <w:rStyle w:val="Style9"/>
+              </w:rPr>
+              <w:t>3 ПРОГРАМНА РЕАЛІЗАЦІЯ</w:t>
+              <w:tab/>
+              <w:t>17</w:t>
             </w:r>
           </w:hyperlink>
         </w:p>
@@ -5913,14 +6207,34 @@
             </w:tabs>
             <w:rPr/>
           </w:pPr>
-          <w:hyperlink w:anchor="__RefHeading___Toc66116_3682473240" w:tooltip="2.3 Заголовок другого рівня">
+          <w:hyperlink w:anchor="__RefHeading___Toc66120_3682473240" w:tooltip="3.1 Вибір засобів розробки">
             <w:r>
               <w:rPr>
                 <w:rStyle w:val="Style9"/>
               </w:rPr>
-              <w:t>2.3 Заголовок другого рівня</w:t>
+              <w:t>3.1 Вибір засобів розробки</w:t>
               <w:tab/>
-              <w:t>16</w:t>
+              <w:t>17</w:t>
+            </w:r>
+          </w:hyperlink>
+        </w:p>
+        <w:p>
+          <w:pPr>
+            <w:pStyle w:val="TOC2"/>
+            <w:tabs>
+              <w:tab w:val="clear" w:pos="709"/>
+              <w:tab w:val="right" w:pos="9353" w:leader="dot"/>
+            </w:tabs>
+            <w:rPr/>
+          </w:pPr>
+          <w:hyperlink w:anchor="__RefHeading___Toc2749_3933516918" w:tooltip="3.2 Висновки за розділом">
+            <w:r>
+              <w:rPr>
+                <w:rStyle w:val="Style9"/>
+              </w:rPr>
+              <w:t>3.2 Висновки за розділом</w:t>
+              <w:tab/>
+              <w:t>19</w:t>
             </w:r>
           </w:hyperlink>
         </w:p>
@@ -5933,14 +6247,14 @@
             </w:tabs>
             <w:rPr/>
           </w:pPr>
-          <w:hyperlink w:anchor="__RefHeading___Toc66118_3682473240" w:tooltip="3 ЗАГОЛОВОК ПЕРШОГО РІВНЯ">
+          <w:hyperlink w:anchor="__RefHeading___Toc2751_3933516918" w:tooltip="4 РОЗРОБКА ІНТЕРФЕЙСУ">
             <w:r>
               <w:rPr>
                 <w:rStyle w:val="Style9"/>
               </w:rPr>
-              <w:t>3 ЗАГОЛОВОК ПЕРШОГО РІВНЯ</w:t>
+              <w:t>4 РОЗРОБКА ІНТЕРФЕЙСУ</w:t>
               <w:tab/>
-              <w:t>18</w:t>
+              <w:t>20</w:t>
             </w:r>
           </w:hyperlink>
         </w:p>
@@ -5953,14 +6267,114 @@
             </w:tabs>
             <w:rPr/>
           </w:pPr>
-          <w:hyperlink w:anchor="__RefHeading___Toc66120_3682473240" w:tooltip="3.1 Заголовок другого рівня">
+          <w:hyperlink w:anchor="__RefHeading___Toc2753_3933516918" w:tooltip="4.1 Вибір платформи">
             <w:r>
               <w:rPr>
                 <w:rStyle w:val="Style9"/>
               </w:rPr>
-              <w:t>3.1 Заголовок другого рівня</w:t>
+              <w:t>4.1 Вибір платформи</w:t>
               <w:tab/>
-              <w:t>18</w:t>
+              <w:t>20</w:t>
+            </w:r>
+          </w:hyperlink>
+        </w:p>
+        <w:p>
+          <w:pPr>
+            <w:pStyle w:val="TOC2"/>
+            <w:tabs>
+              <w:tab w:val="clear" w:pos="709"/>
+              <w:tab w:val="right" w:pos="9353" w:leader="dot"/>
+            </w:tabs>
+            <w:rPr/>
+          </w:pPr>
+          <w:hyperlink w:anchor="__RefHeading___Toc2755_3933516918" w:tooltip="4.2 Розробка макету інтерфейсу">
+            <w:r>
+              <w:rPr>
+                <w:rStyle w:val="Style9"/>
+              </w:rPr>
+              <w:t>4.2 Розробка макету інтерфейсу</w:t>
+              <w:tab/>
+              <w:t>20</w:t>
+            </w:r>
+          </w:hyperlink>
+        </w:p>
+        <w:p>
+          <w:pPr>
+            <w:pStyle w:val="TOC2"/>
+            <w:tabs>
+              <w:tab w:val="clear" w:pos="709"/>
+              <w:tab w:val="right" w:pos="9353" w:leader="dot"/>
+            </w:tabs>
+            <w:rPr/>
+          </w:pPr>
+          <w:hyperlink w:anchor="__RefHeading___Toc2759_3933516918" w:tooltip="4.4 Висновок за розділом">
+            <w:r>
+              <w:rPr>
+                <w:rStyle w:val="Style9"/>
+              </w:rPr>
+              <w:t>4.4 Висновок за розділом</w:t>
+              <w:tab/>
+              <w:t>22</w:t>
+            </w:r>
+          </w:hyperlink>
+        </w:p>
+        <w:p>
+          <w:pPr>
+            <w:pStyle w:val="TOC1"/>
+            <w:tabs>
+              <w:tab w:val="clear" w:pos="9631"/>
+              <w:tab w:val="right" w:pos="9353" w:leader="dot"/>
+            </w:tabs>
+            <w:rPr/>
+          </w:pPr>
+          <w:hyperlink w:anchor="__RefHeading___Toc2763_3933516918" w:tooltip="5 КЕРІВНИЦТВО КОРИСТУВАЧА">
+            <w:r>
+              <w:rPr>
+                <w:rStyle w:val="Style9"/>
+              </w:rPr>
+              <w:t>5 КЕРІВНИЦТВО КОРИСТУВАЧА</w:t>
+              <w:tab/>
+              <w:t>23</w:t>
+            </w:r>
+          </w:hyperlink>
+        </w:p>
+        <w:p>
+          <w:pPr>
+            <w:pStyle w:val="TOC2"/>
+            <w:tabs>
+              <w:tab w:val="clear" w:pos="709"/>
+              <w:tab w:val="right" w:pos="9353" w:leader="dot"/>
+            </w:tabs>
+            <w:rPr/>
+          </w:pPr>
+          <w:hyperlink w:anchor="__RefHeading___Toc2765_3933516918" w:tooltip="5.1 Необхідні умови для виконання">
+            <w:r>
+              <w:rPr>
+                <w:rStyle w:val="Style9"/>
+              </w:rPr>
+              <w:t>5.1 Необхідні умови для виконання</w:t>
+              <w:tab/>
+              <w:t>23</w:t>
+            </w:r>
+          </w:hyperlink>
+        </w:p>
+        <w:p>
+          <w:pPr>
+            <w:pStyle w:val="TOC2"/>
+            <w:tabs>
+              <w:tab w:val="clear" w:pos="709"/>
+              <w:tab w:val="right" w:pos="9353" w:leader="dot"/>
+            </w:tabs>
+            <w:rPr/>
+          </w:pPr>
+          <w:hyperlink w:anchor="__RefHeading___Toc2767_3933516918" w:tooltip="5.2 Звертання до програми">
+            <w:r>
+              <w:rPr>
+                <w:rStyle w:val="Style9"/>
+              </w:rPr>
+              <w:t>5.2 Звертання до програми</w:t>
+              <w:tab/>
+              <w:t>23</w:t>
             </w:r>
           </w:hyperlink>
         </w:p>
@@ -5980,7 +6394,7 @@
               </w:rPr>
               <w:t>ВИСНОВКИ</w:t>
               <w:tab/>
-              <w:t>20</w:t>
+              <w:t>25</w:t>
             </w:r>
           </w:hyperlink>
         </w:p>
@@ -6000,7 +6414,7 @@
               </w:rPr>
               <w:t>ПЕРЕЛІК ДЖЕРЕЛ ПОСИЛАННЯ</w:t>
               <w:tab/>
-              <w:t>21</w:t>
+              <w:t>26</w:t>
             </w:r>
           </w:hyperlink>
           <w:r>
@@ -6016,6 +6430,7 @@
       <w:pPr>
         <w:pStyle w:val="Heading1"/>
         <w:spacing w:lineRule="auto" w:line="360" w:before="0" w:after="0"/>
+        <w:ind w:hanging="0" w:start="0"/>
         <w:rPr>
           <w:szCs w:val="28"/>
         </w:rPr>
@@ -6088,7 +6503,7 @@
               <w:rPr>
                 <w:lang w:val="en-US"/>
               </w:rPr>
-              <w:t>C#</w:t>
+              <w:t>NiceGUI</w:t>
             </w:r>
           </w:p>
         </w:tc>
@@ -6107,14 +6522,20 @@
               <w:spacing w:lineRule="auto" w:line="240"/>
               <w:ind w:hanging="0"/>
               <w:rPr>
-                <w:lang w:val="uk-UA"/>
+                <w:lang w:val="en-US"/>
               </w:rPr>
             </w:pPr>
             <w:r>
               <w:rPr>
                 <w:lang w:val="uk-UA"/>
               </w:rPr>
-              <w:t>Мова програмування зі статичної типізацією</w:t>
+              <w:t xml:space="preserve">Бібліотека створення графічних інтерфейсів мовою </w:t>
+            </w:r>
+            <w:r>
+              <w:rPr>
+                <w:lang w:val="en-US"/>
+              </w:rPr>
+              <w:t>Python</w:t>
             </w:r>
           </w:p>
         </w:tc>
@@ -6143,7 +6564,7 @@
               <w:rPr>
                 <w:lang w:val="en-US"/>
               </w:rPr>
-              <w:t>WinForms</w:t>
+              <w:t>Python</w:t>
             </w:r>
           </w:p>
         </w:tc>
@@ -6169,190 +6590,7 @@
               <w:rPr>
                 <w:lang w:val="uk-UA"/>
               </w:rPr>
-              <w:t>Фреймворк для побудови десктопних застосунків</w:t>
-            </w:r>
-          </w:p>
-        </w:tc>
-      </w:tr>
-      <w:tr>
-        <w:trPr/>
-        <w:tc>
-          <w:tcPr>
-            <w:tcW w:w="1634" w:type="dxa"/>
-            <w:tcBorders/>
-          </w:tcPr>
-          <w:p>
-            <w:pPr>
-              <w:pStyle w:val="Normal"/>
-              <w:tabs>
-                <w:tab w:val="clear" w:pos="709"/>
-                <w:tab w:val="left" w:pos="8010" w:leader="none"/>
-              </w:tabs>
-              <w:spacing w:lineRule="auto" w:line="240"/>
-              <w:ind w:hanging="0" w:start="0"/>
-              <w:rPr>
-                <w:lang w:val="en-US"/>
-              </w:rPr>
-            </w:pPr>
-            <w:r>
-              <w:rPr>
-                <w:lang w:val="en-US"/>
-              </w:rPr>
-              <w:t>MVC</w:t>
-            </w:r>
-          </w:p>
-        </w:tc>
-        <w:tc>
-          <w:tcPr>
-            <w:tcW w:w="7726" w:type="dxa"/>
-            <w:tcBorders/>
-          </w:tcPr>
-          <w:p>
-            <w:pPr>
-              <w:pStyle w:val="Normal"/>
-              <w:tabs>
-                <w:tab w:val="clear" w:pos="709"/>
-                <w:tab w:val="left" w:pos="8010" w:leader="none"/>
-              </w:tabs>
-              <w:spacing w:lineRule="auto" w:line="240"/>
-              <w:ind w:hanging="0"/>
-              <w:rPr>
-                <w:lang w:val="en-US"/>
-              </w:rPr>
-            </w:pPr>
-            <w:r>
-              <w:rPr>
-                <w:lang w:val="en-US"/>
-              </w:rPr>
-              <w:t xml:space="preserve">Model-View-Controller, </w:t>
-            </w:r>
-            <w:r>
-              <w:rPr>
-                <w:lang w:val="uk-UA"/>
-              </w:rPr>
-              <w:t>шаблон проєктування</w:t>
-            </w:r>
-          </w:p>
-        </w:tc>
-      </w:tr>
-      <w:tr>
-        <w:trPr/>
-        <w:tc>
-          <w:tcPr>
-            <w:tcW w:w="1634" w:type="dxa"/>
-            <w:tcBorders/>
-          </w:tcPr>
-          <w:p>
-            <w:pPr>
-              <w:pStyle w:val="Normal"/>
-              <w:tabs>
-                <w:tab w:val="clear" w:pos="709"/>
-                <w:tab w:val="left" w:pos="8010" w:leader="none"/>
-              </w:tabs>
-              <w:spacing w:lineRule="auto" w:line="240"/>
-              <w:ind w:hanging="0" w:start="0"/>
-              <w:rPr>
-                <w:lang w:val="en-US"/>
-              </w:rPr>
-            </w:pPr>
-            <w:r>
-              <w:rPr>
-                <w:lang w:val="en-US"/>
-              </w:rPr>
-              <w:t>Next.js</w:t>
-            </w:r>
-          </w:p>
-        </w:tc>
-        <w:tc>
-          <w:tcPr>
-            <w:tcW w:w="7726" w:type="dxa"/>
-            <w:tcBorders/>
-          </w:tcPr>
-          <w:p>
-            <w:pPr>
-              <w:pStyle w:val="Normal"/>
-              <w:tabs>
-                <w:tab w:val="clear" w:pos="709"/>
-                <w:tab w:val="left" w:pos="8010" w:leader="none"/>
-              </w:tabs>
-              <w:spacing w:lineRule="auto" w:line="240"/>
-              <w:ind w:hanging="0"/>
-              <w:rPr>
-                <w:lang w:val="uk-UA"/>
-              </w:rPr>
-            </w:pPr>
-            <w:r>
-              <w:rPr>
-                <w:lang w:val="uk-UA"/>
-              </w:rPr>
-              <w:t xml:space="preserve">Фреймворк </w:t>
-            </w:r>
-            <w:r>
-              <w:rPr>
-                <w:lang w:val="en-US"/>
-              </w:rPr>
-              <w:t xml:space="preserve">React </w:t>
-            </w:r>
-            <w:r>
-              <w:rPr>
-                <w:lang w:val="uk-UA"/>
-              </w:rPr>
-              <w:t>для побудови веб-сторінок</w:t>
-            </w:r>
-          </w:p>
-        </w:tc>
-      </w:tr>
-      <w:tr>
-        <w:trPr/>
-        <w:tc>
-          <w:tcPr>
-            <w:tcW w:w="1634" w:type="dxa"/>
-            <w:tcBorders/>
-          </w:tcPr>
-          <w:p>
-            <w:pPr>
-              <w:pStyle w:val="Normal"/>
-              <w:tabs>
-                <w:tab w:val="clear" w:pos="709"/>
-                <w:tab w:val="left" w:pos="8010" w:leader="none"/>
-              </w:tabs>
-              <w:spacing w:lineRule="auto" w:line="240"/>
-              <w:ind w:hanging="0" w:start="0"/>
-              <w:rPr>
-                <w:lang w:val="en-US"/>
-              </w:rPr>
-            </w:pPr>
-            <w:r>
-              <w:rPr>
-                <w:lang w:val="en-US"/>
-              </w:rPr>
-              <w:t>Django</w:t>
-            </w:r>
-          </w:p>
-        </w:tc>
-        <w:tc>
-          <w:tcPr>
-            <w:tcW w:w="7726" w:type="dxa"/>
-            <w:tcBorders/>
-          </w:tcPr>
-          <w:p>
-            <w:pPr>
-              <w:pStyle w:val="Normal"/>
-              <w:tabs>
-                <w:tab w:val="clear" w:pos="709"/>
-                <w:tab w:val="left" w:pos="8010" w:leader="none"/>
-              </w:tabs>
-              <w:spacing w:lineRule="auto" w:line="240"/>
-              <w:ind w:hanging="0"/>
-              <w:rPr>
-                <w:lang w:val="uk-UA"/>
-              </w:rPr>
-            </w:pPr>
-            <w:r>
-              <w:rPr>
-                <w:lang w:val="uk-UA"/>
-              </w:rPr>
-              <w:t>Фреймворк бекенду, який взаємодіє з базою даних</w:t>
+              <w:t>Високорівнева мова програмування з динамічною типізацією</w:t>
             </w:r>
           </w:p>
         </w:tc>
@@ -6362,6 +6600,7 @@
       <w:pPr>
         <w:pStyle w:val="Heading1"/>
         <w:spacing w:lineRule="auto" w:line="360" w:before="0" w:after="0"/>
+        <w:ind w:hanging="0" w:start="0"/>
         <w:rPr>
           <w:szCs w:val="28"/>
         </w:rPr>
@@ -6404,13 +6643,7 @@
         <w:rPr>
           <w:lang w:val="uk-UA"/>
         </w:rPr>
-        <w:t xml:space="preserve">Перевезення є важливою галуззю в світі. </w:t>
-      </w:r>
-      <w:r>
-        <w:rPr>
-          <w:lang w:val="uk-UA"/>
-        </w:rPr>
-        <w:t>Люди щодня мають потреби. Потрібно їсти, пити та вдягатися (1 Тимофія 6:8). Місцеві магазини потребують доставки товару. Ланцюг доставки товарів виглядає так:</w:t>
+        <w:t>Перевезення є важливою галуззю в світі. Люди щодня мають потреби. Потрібно їсти, пити та вдягатися (1 Тимофія 6:8). Місцеві магазини потребують доставки товару. Ланцюг доставки товарів виглядає так:</w:t>
       </w:r>
     </w:p>
     <w:p>
@@ -6466,37 +6699,19 @@
         <w:rPr>
           <w:lang w:val="uk-UA"/>
         </w:rPr>
-        <w:t xml:space="preserve">Аби працювати на </w:t>
-      </w:r>
-      <w:r>
-        <w:rPr>
-          <w:lang w:val="uk-UA"/>
-        </w:rPr>
-        <w:t xml:space="preserve">ринку перевезень </w:t>
-      </w:r>
-      <w:r>
-        <w:rPr>
-          <w:lang w:val="uk-UA"/>
-        </w:rPr>
-        <w:t xml:space="preserve">потрібно або </w:t>
-      </w:r>
-      <w:r>
-        <w:rPr>
-          <w:lang w:val="uk-UA"/>
-        </w:rPr>
-        <w:t>робити на вантажівці компанії</w:t>
-      </w:r>
-      <w:r>
-        <w:rPr>
-          <w:lang w:val="uk-UA"/>
-        </w:rPr>
-        <w:t xml:space="preserve"> або придбати власну. </w:t>
-      </w:r>
-      <w:r>
-        <w:rPr>
-          <w:lang w:val="uk-UA"/>
-        </w:rPr>
-        <w:t>Власну вантажівку можна придбати на різних вебсайтах. Кілька відомих брендів вантажівок є:</w:t>
+        <w:t xml:space="preserve">Аби працювати на ринку перевезень потрібно або </w:t>
+      </w:r>
+      <w:r>
+        <w:rPr>
+          <w:lang w:val="uk-UA"/>
+        </w:rPr>
+        <w:t xml:space="preserve">працювати </w:t>
+      </w:r>
+      <w:r>
+        <w:rPr>
+          <w:lang w:val="uk-UA"/>
+        </w:rPr>
+        <w:t>на вантажівці компанії, або придбати власну. Власну вантажівку можна придбати на різних вебсайтах. Кілька відомих брендів вантажівок:</w:t>
       </w:r>
     </w:p>
     <w:p>
@@ -6558,7 +6773,7 @@
         <w:rPr>
           <w:lang w:val="uk-UA"/>
         </w:rPr>
-        <w:t>Програма може бути реалізована на платформі браузера або як десктопний застосунок.</w:t>
+        <w:t xml:space="preserve">Кожна з цих компаній має веб-сайт, на якому можна придбати (або подивитися де можна придбати) власну вантажівку. </w:t>
       </w:r>
       <w:r>
         <w:br w:type="page"/>
@@ -6568,6 +6783,7 @@
       <w:pPr>
         <w:pStyle w:val="Heading1"/>
         <w:spacing w:lineRule="auto" w:line="360" w:before="0" w:after="0"/>
+        <w:ind w:hanging="0" w:start="0"/>
         <w:rPr/>
       </w:pPr>
       <w:bookmarkStart w:id="11" w:name="__RefHeading___Toc66104_3682473240"/>
@@ -6586,6 +6802,7 @@
     <w:p>
       <w:pPr>
         <w:pStyle w:val="Heading2"/>
+        <w:ind w:firstLine="851" w:start="0"/>
         <w:rPr/>
       </w:pPr>
       <w:bookmarkStart w:id="13" w:name="__RefHeading___Toc66106_3682473240"/>
@@ -6660,6 +6877,7 @@
     <w:p>
       <w:pPr>
         <w:pStyle w:val="Heading2"/>
+        <w:ind w:firstLine="851" w:start="0"/>
         <w:rPr/>
       </w:pPr>
       <w:bookmarkStart w:id="15" w:name="__RefHeading___Toc66108_3682473240"/>
@@ -6679,6 +6897,7 @@
       <w:pPr>
         <w:pStyle w:val="Heading3"/>
         <w:spacing w:before="0" w:after="0"/>
+        <w:ind w:firstLine="851" w:start="0"/>
         <w:rPr>
           <w:rFonts w:ascii="Times New Roman" w:hAnsi="Times New Roman"/>
           <w:sz w:val="28"/>
@@ -6693,7 +6912,7 @@
           <w:szCs w:val="28"/>
           <w:lang w:val="uk-UA"/>
         </w:rPr>
-        <w:t xml:space="preserve">1.2.1 </w:t>
+        <w:t>1.2.1 Веб-застосунок</w:t>
       </w:r>
       <w:r>
         <w:rPr>
@@ -6701,16 +6920,6 @@
           <w:b/>
           <w:sz w:val="28"/>
           <w:szCs w:val="28"/>
-          <w:lang w:val="uk-UA"/>
-        </w:rPr>
-        <w:t>Веб-застосунок</w:t>
-      </w:r>
-      <w:r>
-        <w:rPr>
-          <w:rFonts w:ascii="Times New Roman" w:hAnsi="Times New Roman"/>
-          <w:b/>
-          <w:sz w:val="28"/>
-          <w:szCs w:val="28"/>
           <w:lang w:val="en-US"/>
         </w:rPr>
         <w:t xml:space="preserve"> Auto.RIA</w:t>
@@ -6747,30 +6956,18 @@
         <w:rPr>
           <w:lang w:val="en-US"/>
         </w:rPr>
-        <w:t>Auto.RIA</w:t>
+        <w:t xml:space="preserve">Auto.RIA[1] </w:t>
+      </w:r>
+      <w:r>
+        <w:rPr>
+          <w:lang w:val="uk-UA"/>
+        </w:rPr>
+        <w:t xml:space="preserve">є популярним веб-застосунком для продажу та купівлі автомобілей. Він </w:t>
       </w:r>
       <w:r>
         <w:rPr>
           <w:lang w:val="en-US"/>
         </w:rPr>
-        <w:t>[1]</w:t>
-      </w:r>
-      <w:r>
-        <w:rPr>
-          <w:lang w:val="en-US"/>
-        </w:rPr>
-        <w:t xml:space="preserve"> </w:t>
-      </w:r>
-      <w:r>
-        <w:rPr>
-          <w:lang w:val="uk-UA"/>
-        </w:rPr>
-        <w:t xml:space="preserve">є популярним веб-застосунком для продажу та купівлі автомобілей. Він </w:t>
-      </w:r>
-      <w:r>
-        <w:rPr>
-          <w:lang w:val="en-US"/>
-        </w:rPr>
         <w:t>містить</w:t>
       </w:r>
       <w:r>
@@ -6922,19 +7119,7 @@
         <w:rPr>
           <w:lang w:val="uk-UA"/>
         </w:rPr>
-        <w:t>Вигляд інтерфейсу веб-застосунку на рисунк</w:t>
-      </w:r>
-      <w:r>
-        <w:rPr>
-          <w:lang w:val="uk-UA"/>
-        </w:rPr>
-        <w:t>у</w:t>
-      </w:r>
-      <w:r>
-        <w:rPr>
-          <w:lang w:val="uk-UA"/>
-        </w:rPr>
-        <w:t xml:space="preserve"> нижче:</w:t>
+        <w:t>Вигляд інтерфейсу веб-застосунку на рисунку нижче:</w:t>
       </w:r>
     </w:p>
     <w:p>
@@ -6964,9 +7149,7 @@
         </w:rPr>
       </w:pPr>
       <w:r>
-        <w:rPr>
-          <w:lang w:val="uk-UA"/>
-        </w:rPr>
+        <w:rPr/>
         <w:drawing>
           <wp:inline distT="0" distB="0" distL="0" distR="0">
             <wp:extent cx="5939790" cy="7381875"/>
@@ -6985,7 +7168,7 @@
                     </pic:cNvPicPr>
                   </pic:nvPicPr>
                   <pic:blipFill>
-                    <a:blip r:embed="rId6"/>
+                    <a:blip r:embed="rId8"/>
                     <a:stretch>
                       <a:fillRect/>
                     </a:stretch>
@@ -7024,13 +7207,7 @@
         <w:rPr>
           <w:lang w:val="uk-UA"/>
         </w:rPr>
-        <w:t>Рисунок 1.1 — Вигляд веб-сайт</w:t>
-      </w:r>
-      <w:r>
-        <w:rPr>
-          <w:lang w:val="uk-UA"/>
-        </w:rPr>
-        <w:t>у</w:t>
+        <w:t>Рисунок 1.1 — Вигляд веб-сайту</w:t>
       </w:r>
     </w:p>
     <w:p>
@@ -7054,6 +7231,8 @@
     <w:p>
       <w:pPr>
         <w:pStyle w:val="Heading3"/>
+        <w:spacing w:before="0" w:after="60"/>
+        <w:ind w:firstLine="851" w:start="0"/>
         <w:rPr>
           <w:rFonts w:ascii="Times New Roman" w:hAnsi="Times New Roman"/>
           <w:sz w:val="28"/>
@@ -7130,23 +7309,7 @@
           <w:szCs w:val="28"/>
           <w:lang w:val="en-US"/>
         </w:rPr>
-        <w:t>Volvo</w:t>
-      </w:r>
-      <w:r>
-        <w:rPr>
-          <w:sz w:val="28"/>
-          <w:szCs w:val="28"/>
-          <w:lang w:val="en-US"/>
-        </w:rPr>
-        <w:t>[2]</w:t>
-      </w:r>
-      <w:r>
-        <w:rPr>
-          <w:sz w:val="28"/>
-          <w:szCs w:val="28"/>
-          <w:lang w:val="en-US"/>
-        </w:rPr>
-        <w:t xml:space="preserve"> </w:t>
+        <w:t xml:space="preserve">Volvo[2] </w:t>
       </w:r>
       <w:r>
         <w:rPr>
@@ -7306,11 +7469,7 @@
         </w:rPr>
       </w:pPr>
       <w:r>
-        <w:rPr>
-          <w:sz w:val="28"/>
-          <w:szCs w:val="28"/>
-          <w:lang w:val="uk-UA"/>
-        </w:rPr>
+        <w:rPr/>
         <w:drawing>
           <wp:inline distT="0" distB="0" distL="0" distR="0">
             <wp:extent cx="5939790" cy="7348220"/>
@@ -7329,7 +7488,7 @@
                     </pic:cNvPicPr>
                   </pic:nvPicPr>
                   <pic:blipFill>
-                    <a:blip r:embed="rId7"/>
+                    <a:blip r:embed="rId9"/>
                     <a:stretch>
                       <a:fillRect/>
                     </a:stretch>
@@ -7395,6 +7554,8 @@
     <w:p>
       <w:pPr>
         <w:pStyle w:val="Heading3"/>
+        <w:spacing w:before="0" w:after="60"/>
+        <w:ind w:firstLine="851" w:start="0"/>
         <w:rPr>
           <w:rFonts w:ascii="Times New Roman" w:hAnsi="Times New Roman"/>
           <w:sz w:val="28"/>
@@ -7416,16 +7577,7 @@
           <w:szCs w:val="28"/>
           <w:lang w:val="en-US"/>
         </w:rPr>
-        <w:t>DA</w:t>
-      </w:r>
-      <w:r>
-        <w:rPr>
-          <w:rFonts w:ascii="Times New Roman" w:hAnsi="Times New Roman"/>
-          <w:sz w:val="28"/>
-          <w:szCs w:val="28"/>
-          <w:lang w:val="en-US"/>
-        </w:rPr>
-        <w:t>F</w:t>
+        <w:t>DAF</w:t>
       </w:r>
     </w:p>
     <w:p>
@@ -7490,23 +7642,7 @@
           <w:szCs w:val="28"/>
           <w:lang w:val="en-US"/>
         </w:rPr>
-        <w:t>DAF</w:t>
-      </w:r>
-      <w:r>
-        <w:rPr>
-          <w:sz w:val="28"/>
-          <w:szCs w:val="28"/>
-          <w:lang w:val="en-US"/>
-        </w:rPr>
-        <w:t>[3]</w:t>
-      </w:r>
-      <w:r>
-        <w:rPr>
-          <w:sz w:val="28"/>
-          <w:szCs w:val="28"/>
-          <w:lang w:val="en-US"/>
-        </w:rPr>
-        <w:t xml:space="preserve"> </w:t>
+        <w:t xml:space="preserve">DAF[3] </w:t>
       </w:r>
       <w:r>
         <w:rPr>
@@ -7682,11 +7818,7 @@
         </w:rPr>
       </w:pPr>
       <w:r>
-        <w:rPr>
-          <w:sz w:val="28"/>
-          <w:szCs w:val="28"/>
-          <w:lang w:val="uk-UA"/>
-        </w:rPr>
+        <w:rPr/>
         <w:drawing>
           <wp:inline distT="0" distB="0" distL="0" distR="0">
             <wp:extent cx="5939790" cy="7137400"/>
@@ -7705,7 +7837,7 @@
                     </pic:cNvPicPr>
                   </pic:nvPicPr>
                   <pic:blipFill>
-                    <a:blip r:embed="rId8"/>
+                    <a:blip r:embed="rId10"/>
                     <a:stretch>
                       <a:fillRect/>
                     </a:stretch>
@@ -7787,23 +7919,14 @@
     <w:p>
       <w:pPr>
         <w:pStyle w:val="Heading2"/>
+        <w:ind w:firstLine="851" w:start="0"/>
         <w:rPr/>
       </w:pPr>
+      <w:bookmarkStart w:id="17" w:name="__RefHeading___Toc1385_4277420833"/>
+      <w:bookmarkEnd w:id="17"/>
       <w:r>
         <w:rPr/>
-        <w:t>1.</w:t>
-      </w:r>
-      <w:r>
-        <w:rPr/>
-        <w:t>3</w:t>
-      </w:r>
-      <w:r>
-        <w:rPr/>
-        <w:t xml:space="preserve"> </w:t>
-      </w:r>
-      <w:r>
-        <w:rPr/>
-        <w:t>Висновки за розділом</w:t>
+        <w:t>1.3 Висновки за розділом</w:t>
       </w:r>
     </w:p>
     <w:p>
@@ -7864,16 +7987,17 @@
       <w:pPr>
         <w:pStyle w:val="Heading1"/>
         <w:spacing w:lineRule="auto" w:line="360" w:before="0" w:after="0"/>
+        <w:ind w:hanging="0" w:start="0"/>
         <w:rPr/>
       </w:pPr>
-      <w:bookmarkStart w:id="17" w:name="__RefHeading___Toc66110_3682473240"/>
-      <w:bookmarkStart w:id="18" w:name="_Toc31200646"/>
-      <w:bookmarkEnd w:id="17"/>
+      <w:bookmarkStart w:id="18" w:name="__RefHeading___Toc66110_3682473240"/>
+      <w:bookmarkStart w:id="19" w:name="_Toc31200646"/>
+      <w:bookmarkEnd w:id="18"/>
       <w:r>
         <w:rPr/>
         <w:t xml:space="preserve">2 </w:t>
       </w:r>
-      <w:bookmarkEnd w:id="18"/>
+      <w:bookmarkEnd w:id="19"/>
       <w:r>
         <w:rPr/>
         <w:t>ПРОЄКТУВАННЯ СТРУКТУРИ СИСТЕМИ</w:t>
@@ -7882,16 +8006,17 @@
     <w:p>
       <w:pPr>
         <w:pStyle w:val="Heading2"/>
+        <w:ind w:firstLine="851" w:start="0"/>
         <w:rPr/>
       </w:pPr>
-      <w:bookmarkStart w:id="19" w:name="__RefHeading___Toc66112_3682473240"/>
-      <w:bookmarkStart w:id="20" w:name="_Toc31200647"/>
-      <w:bookmarkEnd w:id="19"/>
+      <w:bookmarkStart w:id="20" w:name="__RefHeading___Toc66112_3682473240"/>
+      <w:bookmarkStart w:id="21" w:name="_Toc31200647"/>
+      <w:bookmarkEnd w:id="20"/>
       <w:r>
         <w:rPr/>
         <w:t xml:space="preserve">2.1 </w:t>
       </w:r>
-      <w:bookmarkEnd w:id="20"/>
+      <w:bookmarkEnd w:id="21"/>
       <w:r>
         <w:rPr>
           <w:lang w:val="uk-UA"/>
@@ -8013,9 +8138,7 @@
         </w:rPr>
       </w:pPr>
       <w:r>
-        <w:rPr>
-          <w:lang w:val="uk-UA"/>
-        </w:rPr>
+        <w:rPr/>
         <w:drawing>
           <wp:inline distT="0" distB="0" distL="0" distR="0">
             <wp:extent cx="5936615" cy="1634490"/>
@@ -8034,8 +8157,8 @@
                     </pic:cNvPicPr>
                   </pic:nvPicPr>
                   <pic:blipFill>
-                    <a:blip r:embed="rId9"/>
-                    <a:srcRect l="-9" t="-31" r="-9" b="-31"/>
+                    <a:blip r:embed="rId11"/>
+                    <a:srcRect l="-17" t="-62" r="-17" b="-62"/>
                     <a:stretch>
                       <a:fillRect/>
                     </a:stretch>
@@ -8068,13 +8191,7 @@
         <w:rPr>
           <w:lang w:val="uk-UA"/>
         </w:rPr>
-        <w:t xml:space="preserve">Рисунок 2.1 — </w:t>
-      </w:r>
-      <w:r>
-        <w:rPr>
-          <w:lang w:val="uk-UA"/>
-        </w:rPr>
-        <w:t>Структурна схема</w:t>
+        <w:t>Рисунок 2.1 — Структурна схема</w:t>
       </w:r>
     </w:p>
     <w:p>
@@ -8103,8 +8220,8 @@
           <w:lang w:val="en-US"/>
         </w:rPr>
       </w:pPr>
-      <w:bookmarkStart w:id="21" w:name="__RefHeading___Toc2737_3933516918"/>
-      <w:bookmarkEnd w:id="21"/>
+      <w:bookmarkStart w:id="22" w:name="__RefHeading___Toc2737_3933516918"/>
+      <w:bookmarkEnd w:id="22"/>
       <w:r>
         <w:rPr/>
         <w:t>2.2 Створення функціональної схеми</w:t>
@@ -8223,14 +8340,16 @@
     <w:p>
       <w:pPr>
         <w:pStyle w:val="Heading1"/>
+        <w:spacing w:before="0" w:after="0"/>
+        <w:ind w:hanging="0" w:start="0"/>
         <w:rPr>
           <w:b/>
           <w:bCs/>
         </w:rPr>
       </w:pPr>
-      <w:bookmarkStart w:id="22" w:name="__RefHeading___Toc66118_3682473240"/>
-      <w:bookmarkStart w:id="23" w:name="_Toc31200650"/>
-      <w:bookmarkEnd w:id="22"/>
+      <w:bookmarkStart w:id="23" w:name="__RefHeading___Toc66118_3682473240"/>
+      <w:bookmarkStart w:id="24" w:name="_Toc31200650"/>
+      <w:bookmarkEnd w:id="23"/>
       <w:r>
         <w:rPr>
           <w:b/>
@@ -8238,7 +8357,7 @@
         </w:rPr>
         <w:t xml:space="preserve">3 </w:t>
       </w:r>
-      <w:bookmarkEnd w:id="23"/>
+      <w:bookmarkEnd w:id="24"/>
       <w:r>
         <w:rPr>
           <w:b/>
@@ -8250,23 +8369,20 @@
     <w:p>
       <w:pPr>
         <w:pStyle w:val="Heading2"/>
+        <w:ind w:firstLine="851" w:start="0"/>
         <w:rPr/>
       </w:pPr>
-      <w:bookmarkStart w:id="24" w:name="__RefHeading___Toc66120_3682473240"/>
-      <w:bookmarkStart w:id="25" w:name="_Toc31200651"/>
-      <w:bookmarkEnd w:id="24"/>
+      <w:bookmarkStart w:id="25" w:name="__RefHeading___Toc66120_3682473240"/>
+      <w:bookmarkStart w:id="26" w:name="_Toc31200651"/>
+      <w:bookmarkEnd w:id="25"/>
       <w:r>
         <w:rPr/>
         <w:t xml:space="preserve">3.1 </w:t>
       </w:r>
-      <w:bookmarkEnd w:id="25"/>
+      <w:bookmarkEnd w:id="26"/>
       <w:r>
         <w:rPr/>
-        <w:t>Вибір засобів розробки</w:t>
-      </w:r>
-      <w:r>
-        <w:rPr/>
-        <w:t xml:space="preserve"> </w:t>
+        <w:t xml:space="preserve">Вибір засобів розробки </w:t>
       </w:r>
     </w:p>
     <w:p>
@@ -8328,8 +8444,8 @@
         <w:pStyle w:val="h3"/>
         <w:rPr/>
       </w:pPr>
-      <w:bookmarkStart w:id="26" w:name="__RefHeading___Toc2743_3933516918"/>
-      <w:bookmarkEnd w:id="26"/>
+      <w:bookmarkStart w:id="27" w:name="__RefHeading___Toc2743_3933516918"/>
+      <w:bookmarkEnd w:id="27"/>
       <w:r>
         <w:rPr/>
         <w:t>3.1.1 Обґрунтування вибору засобів розробки серверної частини</w:t>
@@ -8438,9 +8554,9 @@
       </w:tblPr>
       <w:tblGrid>
         <w:gridCol w:w="2654"/>
-        <w:gridCol w:w="1415"/>
+        <w:gridCol w:w="1414"/>
         <w:gridCol w:w="1251"/>
-        <w:gridCol w:w="1251"/>
+        <w:gridCol w:w="1252"/>
       </w:tblGrid>
       <w:tr>
         <w:trPr/>
@@ -8455,7 +8571,7 @@
           </w:tcPr>
           <w:p>
             <w:pPr>
-              <w:pStyle w:val="Style14"/>
+              <w:pStyle w:val="user5"/>
               <w:spacing w:lineRule="auto" w:line="240"/>
               <w:ind w:hanging="0" w:end="0"/>
               <w:rPr>
@@ -8474,7 +8590,7 @@
         </w:tc>
         <w:tc>
           <w:tcPr>
-            <w:tcW w:w="1415" w:type="dxa"/>
+            <w:tcW w:w="1414" w:type="dxa"/>
             <w:tcBorders>
               <w:top w:val="single" w:sz="4" w:space="0" w:color="000000"/>
               <w:start w:val="single" w:sz="4" w:space="0" w:color="000000"/>
@@ -8483,7 +8599,7 @@
           </w:tcPr>
           <w:p>
             <w:pPr>
-              <w:pStyle w:val="Style14"/>
+              <w:pStyle w:val="user5"/>
               <w:spacing w:lineRule="auto" w:line="240"/>
               <w:ind w:hanging="0" w:end="0"/>
               <w:rPr>
@@ -8513,7 +8629,7 @@
           </w:tcPr>
           <w:p>
             <w:pPr>
-              <w:pStyle w:val="Style14"/>
+              <w:pStyle w:val="user5"/>
               <w:spacing w:lineRule="auto" w:line="240"/>
               <w:ind w:hanging="0" w:end="0"/>
               <w:rPr>
@@ -8534,7 +8650,7 @@
         </w:tc>
         <w:tc>
           <w:tcPr>
-            <w:tcW w:w="1251" w:type="dxa"/>
+            <w:tcW w:w="1252" w:type="dxa"/>
             <w:tcBorders>
               <w:top w:val="single" w:sz="4" w:space="0" w:color="000000"/>
               <w:start w:val="single" w:sz="4" w:space="0" w:color="000000"/>
@@ -8544,7 +8660,7 @@
           </w:tcPr>
           <w:p>
             <w:pPr>
-              <w:pStyle w:val="Style14"/>
+              <w:pStyle w:val="user5"/>
               <w:spacing w:lineRule="auto" w:line="240"/>
               <w:ind w:hanging="0" w:end="0"/>
               <w:rPr>
@@ -8576,7 +8692,7 @@
           </w:tcPr>
           <w:p>
             <w:pPr>
-              <w:pStyle w:val="Style14"/>
+              <w:pStyle w:val="user5"/>
               <w:spacing w:lineRule="auto" w:line="240"/>
               <w:ind w:hanging="0" w:end="0"/>
               <w:rPr/>
@@ -8589,7 +8705,7 @@
         </w:tc>
         <w:tc>
           <w:tcPr>
-            <w:tcW w:w="1415" w:type="dxa"/>
+            <w:tcW w:w="1414" w:type="dxa"/>
             <w:tcBorders>
               <w:start w:val="single" w:sz="4" w:space="0" w:color="000000"/>
               <w:bottom w:val="single" w:sz="4" w:space="0" w:color="000000"/>
@@ -8597,7 +8713,7 @@
           </w:tcPr>
           <w:p>
             <w:pPr>
-              <w:pStyle w:val="Style14"/>
+              <w:pStyle w:val="user5"/>
               <w:spacing w:lineRule="auto" w:line="240"/>
               <w:ind w:hanging="0" w:end="0"/>
               <w:rPr>
@@ -8622,7 +8738,7 @@
           </w:tcPr>
           <w:p>
             <w:pPr>
-              <w:pStyle w:val="Style14"/>
+              <w:pStyle w:val="user5"/>
               <w:spacing w:lineRule="auto" w:line="240"/>
               <w:ind w:hanging="0" w:end="0"/>
               <w:rPr>
@@ -8639,7 +8755,7 @@
         </w:tc>
         <w:tc>
           <w:tcPr>
-            <w:tcW w:w="1251" w:type="dxa"/>
+            <w:tcW w:w="1252" w:type="dxa"/>
             <w:tcBorders>
               <w:start w:val="single" w:sz="4" w:space="0" w:color="000000"/>
               <w:bottom w:val="single" w:sz="4" w:space="0" w:color="000000"/>
@@ -8648,7 +8764,7 @@
           </w:tcPr>
           <w:p>
             <w:pPr>
-              <w:pStyle w:val="Style14"/>
+              <w:pStyle w:val="user5"/>
               <w:spacing w:lineRule="auto" w:line="240"/>
               <w:ind w:hanging="0" w:end="0"/>
               <w:rPr>
@@ -8676,7 +8792,7 @@
           </w:tcPr>
           <w:p>
             <w:pPr>
-              <w:pStyle w:val="Style14"/>
+              <w:pStyle w:val="user5"/>
               <w:spacing w:lineRule="auto" w:line="240"/>
               <w:ind w:hanging="0" w:end="0"/>
               <w:rPr/>
@@ -8689,7 +8805,7 @@
         </w:tc>
         <w:tc>
           <w:tcPr>
-            <w:tcW w:w="1415" w:type="dxa"/>
+            <w:tcW w:w="1414" w:type="dxa"/>
             <w:tcBorders>
               <w:start w:val="single" w:sz="4" w:space="0" w:color="000000"/>
               <w:bottom w:val="single" w:sz="4" w:space="0" w:color="000000"/>
@@ -8697,7 +8813,7 @@
           </w:tcPr>
           <w:p>
             <w:pPr>
-              <w:pStyle w:val="Style14"/>
+              <w:pStyle w:val="user5"/>
               <w:spacing w:lineRule="auto" w:line="240"/>
               <w:ind w:hanging="0" w:end="0"/>
               <w:rPr>
@@ -8722,7 +8838,7 @@
           </w:tcPr>
           <w:p>
             <w:pPr>
-              <w:pStyle w:val="Style14"/>
+              <w:pStyle w:val="user5"/>
               <w:spacing w:lineRule="auto" w:line="240"/>
               <w:ind w:hanging="0" w:end="0"/>
               <w:rPr>
@@ -8739,7 +8855,7 @@
         </w:tc>
         <w:tc>
           <w:tcPr>
-            <w:tcW w:w="1251" w:type="dxa"/>
+            <w:tcW w:w="1252" w:type="dxa"/>
             <w:tcBorders>
               <w:start w:val="single" w:sz="4" w:space="0" w:color="000000"/>
               <w:bottom w:val="single" w:sz="4" w:space="0" w:color="000000"/>
@@ -8748,7 +8864,7 @@
           </w:tcPr>
           <w:p>
             <w:pPr>
-              <w:pStyle w:val="Style14"/>
+              <w:pStyle w:val="user5"/>
               <w:spacing w:lineRule="auto" w:line="240"/>
               <w:ind w:hanging="0" w:end="0"/>
               <w:rPr>
@@ -8776,7 +8892,7 @@
           </w:tcPr>
           <w:p>
             <w:pPr>
-              <w:pStyle w:val="Style14"/>
+              <w:pStyle w:val="user5"/>
               <w:spacing w:lineRule="auto" w:line="240"/>
               <w:ind w:hanging="0" w:end="0"/>
               <w:rPr/>
@@ -8789,7 +8905,7 @@
         </w:tc>
         <w:tc>
           <w:tcPr>
-            <w:tcW w:w="1415" w:type="dxa"/>
+            <w:tcW w:w="1414" w:type="dxa"/>
             <w:tcBorders>
               <w:start w:val="single" w:sz="4" w:space="0" w:color="000000"/>
               <w:bottom w:val="single" w:sz="4" w:space="0" w:color="000000"/>
@@ -8797,7 +8913,7 @@
           </w:tcPr>
           <w:p>
             <w:pPr>
-              <w:pStyle w:val="Style14"/>
+              <w:pStyle w:val="user5"/>
               <w:spacing w:lineRule="auto" w:line="240"/>
               <w:ind w:hanging="0" w:end="0"/>
               <w:rPr>
@@ -8822,7 +8938,7 @@
           </w:tcPr>
           <w:p>
             <w:pPr>
-              <w:pStyle w:val="Style14"/>
+              <w:pStyle w:val="user5"/>
               <w:spacing w:lineRule="auto" w:line="240"/>
               <w:ind w:hanging="0" w:end="0"/>
               <w:rPr>
@@ -8839,7 +8955,7 @@
         </w:tc>
         <w:tc>
           <w:tcPr>
-            <w:tcW w:w="1251" w:type="dxa"/>
+            <w:tcW w:w="1252" w:type="dxa"/>
             <w:tcBorders>
               <w:start w:val="single" w:sz="4" w:space="0" w:color="000000"/>
               <w:bottom w:val="single" w:sz="4" w:space="0" w:color="000000"/>
@@ -8848,7 +8964,7 @@
           </w:tcPr>
           <w:p>
             <w:pPr>
-              <w:pStyle w:val="Style14"/>
+              <w:pStyle w:val="user5"/>
               <w:spacing w:lineRule="auto" w:line="240"/>
               <w:ind w:hanging="0" w:end="0"/>
               <w:rPr>
@@ -8960,6 +9076,7 @@
     <w:p>
       <w:pPr>
         <w:pStyle w:val="Normal"/>
+        <w:spacing w:before="0" w:after="0"/>
         <w:jc w:val="both"/>
         <w:rPr>
           <w:lang w:val="uk-UA"/>
@@ -8987,8 +9104,8 @@
       </w:tblPr>
       <w:tblGrid>
         <w:gridCol w:w="2963"/>
-        <w:gridCol w:w="1127"/>
-        <w:gridCol w:w="1127"/>
+        <w:gridCol w:w="1126"/>
+        <w:gridCol w:w="1128"/>
         <w:gridCol w:w="1127"/>
       </w:tblGrid>
       <w:tr>
@@ -9004,7 +9121,7 @@
           </w:tcPr>
           <w:p>
             <w:pPr>
-              <w:pStyle w:val="Style14"/>
+              <w:pStyle w:val="user5"/>
               <w:spacing w:lineRule="auto" w:line="240"/>
               <w:ind w:hanging="0" w:end="0"/>
               <w:rPr>
@@ -9023,7 +9140,7 @@
         </w:tc>
         <w:tc>
           <w:tcPr>
-            <w:tcW w:w="1127" w:type="dxa"/>
+            <w:tcW w:w="1126" w:type="dxa"/>
             <w:tcBorders>
               <w:top w:val="single" w:sz="4" w:space="0" w:color="000000"/>
               <w:start w:val="single" w:sz="4" w:space="0" w:color="000000"/>
@@ -9032,7 +9149,7 @@
           </w:tcPr>
           <w:p>
             <w:pPr>
-              <w:pStyle w:val="Style14"/>
+              <w:pStyle w:val="user5"/>
               <w:spacing w:lineRule="auto" w:line="240"/>
               <w:ind w:hanging="0" w:end="0"/>
               <w:rPr>
@@ -9053,7 +9170,7 @@
         </w:tc>
         <w:tc>
           <w:tcPr>
-            <w:tcW w:w="1127" w:type="dxa"/>
+            <w:tcW w:w="1128" w:type="dxa"/>
             <w:tcBorders>
               <w:top w:val="single" w:sz="4" w:space="0" w:color="000000"/>
               <w:start w:val="single" w:sz="4" w:space="0" w:color="000000"/>
@@ -9062,7 +9179,7 @@
           </w:tcPr>
           <w:p>
             <w:pPr>
-              <w:pStyle w:val="Style14"/>
+              <w:pStyle w:val="user5"/>
               <w:spacing w:lineRule="auto" w:line="240"/>
               <w:ind w:hanging="0" w:end="0"/>
               <w:rPr>
@@ -9093,7 +9210,7 @@
           </w:tcPr>
           <w:p>
             <w:pPr>
-              <w:pStyle w:val="Style14"/>
+              <w:pStyle w:val="user5"/>
               <w:spacing w:lineRule="auto" w:line="240"/>
               <w:ind w:hanging="0" w:end="0"/>
               <w:rPr>
@@ -9125,7 +9242,7 @@
           </w:tcPr>
           <w:p>
             <w:pPr>
-              <w:pStyle w:val="Style14"/>
+              <w:pStyle w:val="user5"/>
               <w:spacing w:lineRule="auto" w:line="240"/>
               <w:ind w:hanging="0" w:end="0"/>
               <w:rPr/>
@@ -9138,7 +9255,7 @@
         </w:tc>
         <w:tc>
           <w:tcPr>
-            <w:tcW w:w="1127" w:type="dxa"/>
+            <w:tcW w:w="1126" w:type="dxa"/>
             <w:tcBorders>
               <w:start w:val="single" w:sz="4" w:space="0" w:color="000000"/>
               <w:bottom w:val="single" w:sz="4" w:space="0" w:color="000000"/>
@@ -9146,7 +9263,7 @@
           </w:tcPr>
           <w:p>
             <w:pPr>
-              <w:pStyle w:val="Style14"/>
+              <w:pStyle w:val="user5"/>
               <w:spacing w:lineRule="auto" w:line="240"/>
               <w:ind w:hanging="0" w:end="0"/>
               <w:rPr>
@@ -9163,7 +9280,7 @@
         </w:tc>
         <w:tc>
           <w:tcPr>
-            <w:tcW w:w="1127" w:type="dxa"/>
+            <w:tcW w:w="1128" w:type="dxa"/>
             <w:tcBorders>
               <w:start w:val="single" w:sz="4" w:space="0" w:color="000000"/>
               <w:bottom w:val="single" w:sz="4" w:space="0" w:color="000000"/>
@@ -9171,7 +9288,7 @@
           </w:tcPr>
           <w:p>
             <w:pPr>
-              <w:pStyle w:val="Style14"/>
+              <w:pStyle w:val="user5"/>
               <w:spacing w:lineRule="auto" w:line="240"/>
               <w:ind w:hanging="0" w:end="0"/>
               <w:rPr>
@@ -9197,7 +9314,7 @@
           </w:tcPr>
           <w:p>
             <w:pPr>
-              <w:pStyle w:val="Style14"/>
+              <w:pStyle w:val="user5"/>
               <w:spacing w:lineRule="auto" w:line="240"/>
               <w:ind w:hanging="0" w:end="0"/>
               <w:rPr>
@@ -9225,7 +9342,7 @@
           </w:tcPr>
           <w:p>
             <w:pPr>
-              <w:pStyle w:val="Style14"/>
+              <w:pStyle w:val="user5"/>
               <w:spacing w:lineRule="auto" w:line="240"/>
               <w:ind w:hanging="0" w:end="0"/>
               <w:rPr/>
@@ -9238,7 +9355,7 @@
         </w:tc>
         <w:tc>
           <w:tcPr>
-            <w:tcW w:w="1127" w:type="dxa"/>
+            <w:tcW w:w="1126" w:type="dxa"/>
             <w:tcBorders>
               <w:start w:val="single" w:sz="4" w:space="0" w:color="000000"/>
               <w:bottom w:val="single" w:sz="4" w:space="0" w:color="000000"/>
@@ -9246,7 +9363,7 @@
           </w:tcPr>
           <w:p>
             <w:pPr>
-              <w:pStyle w:val="Style14"/>
+              <w:pStyle w:val="user5"/>
               <w:spacing w:lineRule="auto" w:line="240"/>
               <w:ind w:hanging="0" w:end="0"/>
               <w:rPr>
@@ -9263,7 +9380,7 @@
         </w:tc>
         <w:tc>
           <w:tcPr>
-            <w:tcW w:w="1127" w:type="dxa"/>
+            <w:tcW w:w="1128" w:type="dxa"/>
             <w:tcBorders>
               <w:start w:val="single" w:sz="4" w:space="0" w:color="000000"/>
               <w:bottom w:val="single" w:sz="4" w:space="0" w:color="000000"/>
@@ -9271,7 +9388,7 @@
           </w:tcPr>
           <w:p>
             <w:pPr>
-              <w:pStyle w:val="Style14"/>
+              <w:pStyle w:val="user5"/>
               <w:spacing w:lineRule="auto" w:line="240"/>
               <w:ind w:hanging="0" w:end="0"/>
               <w:rPr>
@@ -9297,7 +9414,7 @@
           </w:tcPr>
           <w:p>
             <w:pPr>
-              <w:pStyle w:val="Style14"/>
+              <w:pStyle w:val="user5"/>
               <w:spacing w:lineRule="auto" w:line="240"/>
               <w:ind w:hanging="0" w:end="0"/>
               <w:rPr>
@@ -9325,7 +9442,7 @@
           </w:tcPr>
           <w:p>
             <w:pPr>
-              <w:pStyle w:val="Style14"/>
+              <w:pStyle w:val="user5"/>
               <w:spacing w:lineRule="auto" w:line="240"/>
               <w:ind w:hanging="0" w:end="0"/>
               <w:rPr/>
@@ -9338,7 +9455,7 @@
         </w:tc>
         <w:tc>
           <w:tcPr>
-            <w:tcW w:w="1127" w:type="dxa"/>
+            <w:tcW w:w="1126" w:type="dxa"/>
             <w:tcBorders>
               <w:start w:val="single" w:sz="4" w:space="0" w:color="000000"/>
               <w:bottom w:val="single" w:sz="4" w:space="0" w:color="000000"/>
@@ -9346,7 +9463,7 @@
           </w:tcPr>
           <w:p>
             <w:pPr>
-              <w:pStyle w:val="Style14"/>
+              <w:pStyle w:val="user5"/>
               <w:spacing w:lineRule="auto" w:line="240"/>
               <w:ind w:hanging="0" w:end="0"/>
               <w:rPr>
@@ -9363,7 +9480,7 @@
         </w:tc>
         <w:tc>
           <w:tcPr>
-            <w:tcW w:w="1127" w:type="dxa"/>
+            <w:tcW w:w="1128" w:type="dxa"/>
             <w:tcBorders>
               <w:start w:val="single" w:sz="4" w:space="0" w:color="000000"/>
               <w:bottom w:val="single" w:sz="4" w:space="0" w:color="000000"/>
@@ -9371,7 +9488,7 @@
           </w:tcPr>
           <w:p>
             <w:pPr>
-              <w:pStyle w:val="Style14"/>
+              <w:pStyle w:val="user5"/>
               <w:spacing w:lineRule="auto" w:line="240"/>
               <w:ind w:hanging="0" w:end="0"/>
               <w:rPr>
@@ -9397,7 +9514,7 @@
           </w:tcPr>
           <w:p>
             <w:pPr>
-              <w:pStyle w:val="Style14"/>
+              <w:pStyle w:val="user5"/>
               <w:spacing w:lineRule="auto" w:line="240"/>
               <w:ind w:hanging="0" w:end="0"/>
               <w:rPr>
@@ -9433,8 +9550,8 @@
         <w:pStyle w:val="h3"/>
         <w:rPr/>
       </w:pPr>
-      <w:bookmarkStart w:id="27" w:name="__RefHeading___Toc2745_3933516918"/>
-      <w:bookmarkEnd w:id="27"/>
+      <w:bookmarkStart w:id="28" w:name="__RefHeading___Toc2745_3933516918"/>
+      <w:bookmarkEnd w:id="28"/>
       <w:r>
         <w:rPr/>
         <w:t>3.1.</w:t>
@@ -9594,7 +9711,7 @@
           </w:tcPr>
           <w:p>
             <w:pPr>
-              <w:pStyle w:val="Style14"/>
+              <w:pStyle w:val="user5"/>
               <w:spacing w:lineRule="auto" w:line="240"/>
               <w:ind w:hanging="0" w:end="0"/>
               <w:rPr>
@@ -9622,7 +9739,7 @@
           </w:tcPr>
           <w:p>
             <w:pPr>
-              <w:pStyle w:val="Style14"/>
+              <w:pStyle w:val="user5"/>
               <w:spacing w:lineRule="auto" w:line="240"/>
               <w:ind w:hanging="0" w:end="0"/>
               <w:rPr>
@@ -9652,7 +9769,7 @@
           </w:tcPr>
           <w:p>
             <w:pPr>
-              <w:pStyle w:val="Style14"/>
+              <w:pStyle w:val="user5"/>
               <w:spacing w:lineRule="auto" w:line="240"/>
               <w:ind w:hanging="0" w:end="0"/>
               <w:rPr>
@@ -9683,7 +9800,7 @@
           </w:tcPr>
           <w:p>
             <w:pPr>
-              <w:pStyle w:val="Style14"/>
+              <w:pStyle w:val="user5"/>
               <w:spacing w:lineRule="auto" w:line="240"/>
               <w:ind w:hanging="0" w:end="0"/>
               <w:rPr>
@@ -9715,7 +9832,7 @@
           </w:tcPr>
           <w:p>
             <w:pPr>
-              <w:pStyle w:val="Style14"/>
+              <w:pStyle w:val="user5"/>
               <w:spacing w:lineRule="auto" w:line="240"/>
               <w:ind w:hanging="0" w:end="0"/>
               <w:rPr/>
@@ -9736,7 +9853,7 @@
           </w:tcPr>
           <w:p>
             <w:pPr>
-              <w:pStyle w:val="Style14"/>
+              <w:pStyle w:val="user5"/>
               <w:spacing w:lineRule="auto" w:line="240"/>
               <w:ind w:hanging="0" w:end="0"/>
               <w:rPr>
@@ -9761,7 +9878,7 @@
           </w:tcPr>
           <w:p>
             <w:pPr>
-              <w:pStyle w:val="Style14"/>
+              <w:pStyle w:val="user5"/>
               <w:spacing w:lineRule="auto" w:line="240"/>
               <w:ind w:hanging="0" w:end="0"/>
               <w:rPr>
@@ -9787,7 +9904,7 @@
           </w:tcPr>
           <w:p>
             <w:pPr>
-              <w:pStyle w:val="Style14"/>
+              <w:pStyle w:val="user5"/>
               <w:spacing w:lineRule="auto" w:line="240"/>
               <w:ind w:hanging="0" w:end="0"/>
               <w:rPr>
@@ -9815,7 +9932,7 @@
           </w:tcPr>
           <w:p>
             <w:pPr>
-              <w:pStyle w:val="Style14"/>
+              <w:pStyle w:val="user5"/>
               <w:spacing w:lineRule="auto" w:line="240"/>
               <w:ind w:hanging="0" w:end="0"/>
               <w:rPr/>
@@ -9836,7 +9953,7 @@
           </w:tcPr>
           <w:p>
             <w:pPr>
-              <w:pStyle w:val="Style14"/>
+              <w:pStyle w:val="user5"/>
               <w:spacing w:lineRule="auto" w:line="240"/>
               <w:ind w:hanging="0" w:end="0"/>
               <w:rPr>
@@ -9861,7 +9978,7 @@
           </w:tcPr>
           <w:p>
             <w:pPr>
-              <w:pStyle w:val="Style14"/>
+              <w:pStyle w:val="user5"/>
               <w:spacing w:lineRule="auto" w:line="240"/>
               <w:ind w:hanging="0" w:end="0"/>
               <w:rPr>
@@ -9887,7 +10004,7 @@
           </w:tcPr>
           <w:p>
             <w:pPr>
-              <w:pStyle w:val="Style14"/>
+              <w:pStyle w:val="user5"/>
               <w:spacing w:lineRule="auto" w:line="240"/>
               <w:ind w:hanging="0" w:end="0"/>
               <w:rPr>
@@ -9915,7 +10032,7 @@
           </w:tcPr>
           <w:p>
             <w:pPr>
-              <w:pStyle w:val="Style14"/>
+              <w:pStyle w:val="user5"/>
               <w:spacing w:lineRule="auto" w:line="240"/>
               <w:ind w:hanging="0" w:end="0"/>
               <w:rPr/>
@@ -9936,7 +10053,7 @@
           </w:tcPr>
           <w:p>
             <w:pPr>
-              <w:pStyle w:val="Style14"/>
+              <w:pStyle w:val="user5"/>
               <w:spacing w:lineRule="auto" w:line="240"/>
               <w:ind w:hanging="0" w:end="0"/>
               <w:rPr>
@@ -9961,7 +10078,7 @@
           </w:tcPr>
           <w:p>
             <w:pPr>
-              <w:pStyle w:val="Style14"/>
+              <w:pStyle w:val="user5"/>
               <w:spacing w:lineRule="auto" w:line="240"/>
               <w:ind w:hanging="0" w:end="0"/>
               <w:rPr>
@@ -9987,7 +10104,7 @@
           </w:tcPr>
           <w:p>
             <w:pPr>
-              <w:pStyle w:val="Style14"/>
+              <w:pStyle w:val="user5"/>
               <w:spacing w:lineRule="auto" w:line="240"/>
               <w:ind w:hanging="0" w:end="0"/>
               <w:rPr>
@@ -10109,8 +10226,8 @@
         </w:tblCellMar>
       </w:tblPr>
       <w:tblGrid>
-        <w:gridCol w:w="3862"/>
-        <w:gridCol w:w="992"/>
+        <w:gridCol w:w="3861"/>
+        <w:gridCol w:w="993"/>
         <w:gridCol w:w="1127"/>
         <w:gridCol w:w="1188"/>
       </w:tblGrid>
@@ -10118,7 +10235,7 @@
         <w:trPr/>
         <w:tc>
           <w:tcPr>
-            <w:tcW w:w="3862" w:type="dxa"/>
+            <w:tcW w:w="3861" w:type="dxa"/>
             <w:tcBorders>
               <w:top w:val="single" w:sz="4" w:space="0" w:color="000000"/>
               <w:start w:val="single" w:sz="4" w:space="0" w:color="000000"/>
@@ -10127,7 +10244,7 @@
           </w:tcPr>
           <w:p>
             <w:pPr>
-              <w:pStyle w:val="Style14"/>
+              <w:pStyle w:val="user5"/>
               <w:spacing w:lineRule="auto" w:line="240"/>
               <w:ind w:hanging="0" w:end="0"/>
               <w:rPr/>
@@ -10140,7 +10257,7 @@
         </w:tc>
         <w:tc>
           <w:tcPr>
-            <w:tcW w:w="992" w:type="dxa"/>
+            <w:tcW w:w="993" w:type="dxa"/>
             <w:tcBorders>
               <w:top w:val="single" w:sz="4" w:space="0" w:color="000000"/>
               <w:start w:val="single" w:sz="4" w:space="0" w:color="000000"/>
@@ -10149,7 +10266,7 @@
           </w:tcPr>
           <w:p>
             <w:pPr>
-              <w:pStyle w:val="Style14"/>
+              <w:pStyle w:val="user5"/>
               <w:spacing w:lineRule="auto" w:line="240"/>
               <w:ind w:hanging="0" w:end="0"/>
               <w:rPr>
@@ -10175,7 +10292,7 @@
           </w:tcPr>
           <w:p>
             <w:pPr>
-              <w:pStyle w:val="Style14"/>
+              <w:pStyle w:val="user5"/>
               <w:spacing w:lineRule="auto" w:line="240"/>
               <w:ind w:hanging="0" w:end="0"/>
               <w:rPr>
@@ -10202,7 +10319,7 @@
           </w:tcPr>
           <w:p>
             <w:pPr>
-              <w:pStyle w:val="Style14"/>
+              <w:pStyle w:val="user5"/>
               <w:spacing w:lineRule="auto" w:line="240"/>
               <w:ind w:hanging="0" w:end="0"/>
               <w:rPr>
@@ -10222,7 +10339,7 @@
         <w:trPr/>
         <w:tc>
           <w:tcPr>
-            <w:tcW w:w="3862" w:type="dxa"/>
+            <w:tcW w:w="3861" w:type="dxa"/>
             <w:tcBorders>
               <w:start w:val="single" w:sz="4" w:space="0" w:color="000000"/>
               <w:bottom w:val="single" w:sz="4" w:space="0" w:color="000000"/>
@@ -10230,7 +10347,7 @@
           </w:tcPr>
           <w:p>
             <w:pPr>
-              <w:pStyle w:val="Style14"/>
+              <w:pStyle w:val="user5"/>
               <w:spacing w:lineRule="auto" w:line="240"/>
               <w:ind w:hanging="0" w:end="0"/>
               <w:rPr/>
@@ -10243,7 +10360,7 @@
         </w:tc>
         <w:tc>
           <w:tcPr>
-            <w:tcW w:w="992" w:type="dxa"/>
+            <w:tcW w:w="993" w:type="dxa"/>
             <w:tcBorders>
               <w:start w:val="single" w:sz="4" w:space="0" w:color="000000"/>
               <w:bottom w:val="single" w:sz="4" w:space="0" w:color="000000"/>
@@ -10251,7 +10368,7 @@
           </w:tcPr>
           <w:p>
             <w:pPr>
-              <w:pStyle w:val="Style14"/>
+              <w:pStyle w:val="user5"/>
               <w:spacing w:lineRule="auto" w:line="240"/>
               <w:ind w:hanging="0" w:end="0"/>
               <w:rPr>
@@ -10276,7 +10393,7 @@
           </w:tcPr>
           <w:p>
             <w:pPr>
-              <w:pStyle w:val="Style14"/>
+              <w:pStyle w:val="user5"/>
               <w:spacing w:lineRule="auto" w:line="240"/>
               <w:ind w:hanging="0" w:end="0"/>
               <w:rPr>
@@ -10302,7 +10419,7 @@
           </w:tcPr>
           <w:p>
             <w:pPr>
-              <w:pStyle w:val="Style14"/>
+              <w:pStyle w:val="user5"/>
               <w:spacing w:lineRule="auto" w:line="240"/>
               <w:ind w:hanging="0" w:end="0"/>
               <w:rPr>
@@ -10322,7 +10439,7 @@
         <w:trPr/>
         <w:tc>
           <w:tcPr>
-            <w:tcW w:w="3862" w:type="dxa"/>
+            <w:tcW w:w="3861" w:type="dxa"/>
             <w:tcBorders>
               <w:start w:val="single" w:sz="4" w:space="0" w:color="000000"/>
               <w:bottom w:val="single" w:sz="4" w:space="0" w:color="000000"/>
@@ -10330,7 +10447,7 @@
           </w:tcPr>
           <w:p>
             <w:pPr>
-              <w:pStyle w:val="Style14"/>
+              <w:pStyle w:val="user5"/>
               <w:spacing w:lineRule="auto" w:line="240"/>
               <w:ind w:hanging="0" w:end="0"/>
               <w:rPr/>
@@ -10343,7 +10460,7 @@
         </w:tc>
         <w:tc>
           <w:tcPr>
-            <w:tcW w:w="992" w:type="dxa"/>
+            <w:tcW w:w="993" w:type="dxa"/>
             <w:tcBorders>
               <w:start w:val="single" w:sz="4" w:space="0" w:color="000000"/>
               <w:bottom w:val="single" w:sz="4" w:space="0" w:color="000000"/>
@@ -10351,7 +10468,7 @@
           </w:tcPr>
           <w:p>
             <w:pPr>
-              <w:pStyle w:val="Style14"/>
+              <w:pStyle w:val="user5"/>
               <w:spacing w:lineRule="auto" w:line="240"/>
               <w:ind w:hanging="0" w:end="0"/>
               <w:rPr>
@@ -10376,7 +10493,7 @@
           </w:tcPr>
           <w:p>
             <w:pPr>
-              <w:pStyle w:val="Style14"/>
+              <w:pStyle w:val="user5"/>
               <w:spacing w:lineRule="auto" w:line="240"/>
               <w:ind w:hanging="0" w:end="0"/>
               <w:rPr>
@@ -10402,7 +10519,7 @@
           </w:tcPr>
           <w:p>
             <w:pPr>
-              <w:pStyle w:val="Style14"/>
+              <w:pStyle w:val="user5"/>
               <w:spacing w:lineRule="auto" w:line="240"/>
               <w:ind w:hanging="0" w:end="0"/>
               <w:rPr>
@@ -10422,7 +10539,7 @@
         <w:trPr/>
         <w:tc>
           <w:tcPr>
-            <w:tcW w:w="3862" w:type="dxa"/>
+            <w:tcW w:w="3861" w:type="dxa"/>
             <w:tcBorders>
               <w:start w:val="single" w:sz="4" w:space="0" w:color="000000"/>
               <w:bottom w:val="single" w:sz="4" w:space="0" w:color="000000"/>
@@ -10430,7 +10547,7 @@
           </w:tcPr>
           <w:p>
             <w:pPr>
-              <w:pStyle w:val="Style14"/>
+              <w:pStyle w:val="user5"/>
               <w:spacing w:lineRule="auto" w:line="240"/>
               <w:ind w:hanging="0" w:end="0"/>
               <w:rPr/>
@@ -10443,7 +10560,7 @@
         </w:tc>
         <w:tc>
           <w:tcPr>
-            <w:tcW w:w="992" w:type="dxa"/>
+            <w:tcW w:w="993" w:type="dxa"/>
             <w:tcBorders>
               <w:start w:val="single" w:sz="4" w:space="0" w:color="000000"/>
               <w:bottom w:val="single" w:sz="4" w:space="0" w:color="000000"/>
@@ -10451,7 +10568,7 @@
           </w:tcPr>
           <w:p>
             <w:pPr>
-              <w:pStyle w:val="Style14"/>
+              <w:pStyle w:val="user5"/>
               <w:spacing w:lineRule="auto" w:line="240"/>
               <w:ind w:hanging="0" w:end="0"/>
               <w:rPr>
@@ -10476,7 +10593,7 @@
           </w:tcPr>
           <w:p>
             <w:pPr>
-              <w:pStyle w:val="Style14"/>
+              <w:pStyle w:val="user5"/>
               <w:spacing w:lineRule="auto" w:line="240"/>
               <w:ind w:hanging="0" w:end="0"/>
               <w:rPr>
@@ -10502,7 +10619,7 @@
           </w:tcPr>
           <w:p>
             <w:pPr>
-              <w:pStyle w:val="Style14"/>
+              <w:pStyle w:val="user5"/>
               <w:spacing w:lineRule="auto" w:line="240"/>
               <w:ind w:hanging="0" w:end="0"/>
               <w:rPr>
@@ -10552,8 +10669,8 @@
         <w:pStyle w:val="h3"/>
         <w:rPr/>
       </w:pPr>
-      <w:bookmarkStart w:id="28" w:name="__RefHeading___Toc2747_3933516918"/>
-      <w:bookmarkEnd w:id="28"/>
+      <w:bookmarkStart w:id="29" w:name="__RefHeading___Toc2747_3933516918"/>
+      <w:bookmarkEnd w:id="29"/>
       <w:r>
         <w:rPr/>
         <w:t>3.1.</w:t>
@@ -10659,15 +10776,15 @@
         </w:tblCellMar>
       </w:tblPr>
       <w:tblGrid>
-        <w:gridCol w:w="2871"/>
+        <w:gridCol w:w="2870"/>
         <w:gridCol w:w="2433"/>
-        <w:gridCol w:w="1437"/>
+        <w:gridCol w:w="1438"/>
       </w:tblGrid>
       <w:tr>
         <w:trPr/>
         <w:tc>
           <w:tcPr>
-            <w:tcW w:w="2871" w:type="dxa"/>
+            <w:tcW w:w="2870" w:type="dxa"/>
             <w:tcBorders>
               <w:top w:val="single" w:sz="4" w:space="0" w:color="000000"/>
               <w:start w:val="single" w:sz="4" w:space="0" w:color="000000"/>
@@ -10676,7 +10793,7 @@
           </w:tcPr>
           <w:p>
             <w:pPr>
-              <w:pStyle w:val="Style14"/>
+              <w:pStyle w:val="user5"/>
               <w:spacing w:lineRule="auto" w:line="240"/>
               <w:ind w:hanging="0" w:end="0"/>
               <w:rPr>
@@ -10704,7 +10821,7 @@
           </w:tcPr>
           <w:p>
             <w:pPr>
-              <w:pStyle w:val="Style14"/>
+              <w:pStyle w:val="user5"/>
               <w:spacing w:lineRule="auto" w:line="240"/>
               <w:ind w:hanging="0" w:end="0"/>
               <w:rPr>
@@ -10725,7 +10842,7 @@
         </w:tc>
         <w:tc>
           <w:tcPr>
-            <w:tcW w:w="1437" w:type="dxa"/>
+            <w:tcW w:w="1438" w:type="dxa"/>
             <w:tcBorders>
               <w:top w:val="single" w:sz="4" w:space="0" w:color="000000"/>
               <w:start w:val="single" w:sz="4" w:space="0" w:color="000000"/>
@@ -10735,7 +10852,7 @@
           </w:tcPr>
           <w:p>
             <w:pPr>
-              <w:pStyle w:val="Style14"/>
+              <w:pStyle w:val="user5"/>
               <w:spacing w:lineRule="auto" w:line="240"/>
               <w:ind w:hanging="0" w:end="0"/>
               <w:rPr>
@@ -10759,7 +10876,7 @@
         <w:trPr/>
         <w:tc>
           <w:tcPr>
-            <w:tcW w:w="2871" w:type="dxa"/>
+            <w:tcW w:w="2870" w:type="dxa"/>
             <w:tcBorders>
               <w:start w:val="single" w:sz="4" w:space="0" w:color="000000"/>
               <w:bottom w:val="single" w:sz="4" w:space="0" w:color="000000"/>
@@ -10767,7 +10884,7 @@
           </w:tcPr>
           <w:p>
             <w:pPr>
-              <w:pStyle w:val="Style14"/>
+              <w:pStyle w:val="user5"/>
               <w:spacing w:lineRule="auto" w:line="240"/>
               <w:ind w:hanging="0" w:end="0"/>
               <w:rPr/>
@@ -10788,7 +10905,7 @@
           </w:tcPr>
           <w:p>
             <w:pPr>
-              <w:pStyle w:val="Style14"/>
+              <w:pStyle w:val="user5"/>
               <w:spacing w:lineRule="auto" w:line="240"/>
               <w:ind w:hanging="0" w:end="0"/>
               <w:rPr>
@@ -10805,7 +10922,7 @@
         </w:tc>
         <w:tc>
           <w:tcPr>
-            <w:tcW w:w="1437" w:type="dxa"/>
+            <w:tcW w:w="1438" w:type="dxa"/>
             <w:tcBorders>
               <w:start w:val="single" w:sz="4" w:space="0" w:color="000000"/>
               <w:bottom w:val="single" w:sz="4" w:space="0" w:color="000000"/>
@@ -10814,7 +10931,7 @@
           </w:tcPr>
           <w:p>
             <w:pPr>
-              <w:pStyle w:val="Style14"/>
+              <w:pStyle w:val="user5"/>
               <w:spacing w:lineRule="auto" w:line="240"/>
               <w:ind w:hanging="0" w:end="0"/>
               <w:rPr>
@@ -10834,7 +10951,7 @@
         <w:trPr/>
         <w:tc>
           <w:tcPr>
-            <w:tcW w:w="2871" w:type="dxa"/>
+            <w:tcW w:w="2870" w:type="dxa"/>
             <w:tcBorders>
               <w:start w:val="single" w:sz="4" w:space="0" w:color="000000"/>
               <w:bottom w:val="single" w:sz="4" w:space="0" w:color="000000"/>
@@ -10842,7 +10959,7 @@
           </w:tcPr>
           <w:p>
             <w:pPr>
-              <w:pStyle w:val="Style14"/>
+              <w:pStyle w:val="user5"/>
               <w:spacing w:lineRule="auto" w:line="240"/>
               <w:ind w:hanging="0" w:end="0"/>
               <w:rPr/>
@@ -10863,7 +10980,7 @@
           </w:tcPr>
           <w:p>
             <w:pPr>
-              <w:pStyle w:val="Style14"/>
+              <w:pStyle w:val="user5"/>
               <w:spacing w:lineRule="auto" w:line="240"/>
               <w:ind w:hanging="0" w:end="0"/>
               <w:rPr>
@@ -10880,7 +10997,7 @@
         </w:tc>
         <w:tc>
           <w:tcPr>
-            <w:tcW w:w="1437" w:type="dxa"/>
+            <w:tcW w:w="1438" w:type="dxa"/>
             <w:tcBorders>
               <w:start w:val="single" w:sz="4" w:space="0" w:color="000000"/>
               <w:bottom w:val="single" w:sz="4" w:space="0" w:color="000000"/>
@@ -10889,7 +11006,7 @@
           </w:tcPr>
           <w:p>
             <w:pPr>
-              <w:pStyle w:val="Style14"/>
+              <w:pStyle w:val="user5"/>
               <w:spacing w:lineRule="auto" w:line="240"/>
               <w:ind w:hanging="0" w:end="0"/>
               <w:rPr>
@@ -10909,7 +11026,7 @@
         <w:trPr/>
         <w:tc>
           <w:tcPr>
-            <w:tcW w:w="2871" w:type="dxa"/>
+            <w:tcW w:w="2870" w:type="dxa"/>
             <w:tcBorders>
               <w:start w:val="single" w:sz="4" w:space="0" w:color="000000"/>
               <w:bottom w:val="single" w:sz="4" w:space="0" w:color="000000"/>
@@ -10917,7 +11034,7 @@
           </w:tcPr>
           <w:p>
             <w:pPr>
-              <w:pStyle w:val="Style14"/>
+              <w:pStyle w:val="user5"/>
               <w:spacing w:lineRule="auto" w:line="240"/>
               <w:ind w:hanging="0" w:end="0"/>
               <w:rPr/>
@@ -10938,7 +11055,7 @@
           </w:tcPr>
           <w:p>
             <w:pPr>
-              <w:pStyle w:val="Style14"/>
+              <w:pStyle w:val="user5"/>
               <w:spacing w:lineRule="auto" w:line="240"/>
               <w:ind w:hanging="0" w:end="0"/>
               <w:rPr>
@@ -10955,7 +11072,7 @@
         </w:tc>
         <w:tc>
           <w:tcPr>
-            <w:tcW w:w="1437" w:type="dxa"/>
+            <w:tcW w:w="1438" w:type="dxa"/>
             <w:tcBorders>
               <w:start w:val="single" w:sz="4" w:space="0" w:color="000000"/>
               <w:bottom w:val="single" w:sz="4" w:space="0" w:color="000000"/>
@@ -10964,7 +11081,7 @@
           </w:tcPr>
           <w:p>
             <w:pPr>
-              <w:pStyle w:val="Style14"/>
+              <w:pStyle w:val="user5"/>
               <w:spacing w:lineRule="auto" w:line="240"/>
               <w:ind w:hanging="0" w:end="0"/>
               <w:rPr>
@@ -11006,8 +11123,8 @@
         <w:jc w:val="both"/>
         <w:rPr/>
       </w:pPr>
-      <w:bookmarkStart w:id="29" w:name="__RefHeading___Toc2749_3933516918"/>
-      <w:bookmarkEnd w:id="29"/>
+      <w:bookmarkStart w:id="30" w:name="__RefHeading___Toc2749_3933516918"/>
+      <w:bookmarkEnd w:id="30"/>
       <w:r>
         <w:rPr/>
         <w:t>3.2 Висновки за розділом</w:t>
@@ -11038,12 +11155,14 @@
     <w:p>
       <w:pPr>
         <w:pStyle w:val="Heading1"/>
-        <w:rPr>
-          <w:lang w:val="uk-UA"/>
-        </w:rPr>
-      </w:pPr>
-      <w:bookmarkStart w:id="30" w:name="__RefHeading___Toc2751_3933516918"/>
-      <w:bookmarkEnd w:id="30"/>
+        <w:spacing w:before="0" w:after="0"/>
+        <w:ind w:hanging="0" w:start="0"/>
+        <w:rPr>
+          <w:lang w:val="uk-UA"/>
+        </w:rPr>
+      </w:pPr>
+      <w:bookmarkStart w:id="31" w:name="__RefHeading___Toc2751_3933516918"/>
+      <w:bookmarkEnd w:id="31"/>
       <w:r>
         <w:rPr/>
         <w:t xml:space="preserve">4 </w:t>
@@ -11067,8 +11186,8 @@
         <w:jc w:val="both"/>
         <w:rPr/>
       </w:pPr>
-      <w:bookmarkStart w:id="31" w:name="__RefHeading___Toc2753_3933516918"/>
-      <w:bookmarkEnd w:id="31"/>
+      <w:bookmarkStart w:id="32" w:name="__RefHeading___Toc2753_3933516918"/>
+      <w:bookmarkEnd w:id="32"/>
       <w:r>
         <w:rPr/>
         <w:t>4.1 Вибір платформи</w:t>
@@ -11114,8 +11233,8 @@
         <w:jc w:val="both"/>
         <w:rPr/>
       </w:pPr>
-      <w:bookmarkStart w:id="32" w:name="__RefHeading___Toc2755_3933516918"/>
-      <w:bookmarkEnd w:id="32"/>
+      <w:bookmarkStart w:id="33" w:name="__RefHeading___Toc2755_3933516918"/>
+      <w:bookmarkEnd w:id="33"/>
       <w:r>
         <w:rPr/>
         <w:t>4.2 Розробка макету інтерфейсу</w:t>
@@ -11180,7 +11299,7 @@
                     </pic:cNvPicPr>
                   </pic:nvPicPr>
                   <pic:blipFill>
-                    <a:blip r:embed="rId10"/>
+                    <a:blip r:embed="rId12"/>
                     <a:stretch>
                       <a:fillRect/>
                     </a:stretch>
@@ -11263,9 +11382,7 @@
         </w:rPr>
       </w:pPr>
       <w:r>
-        <w:rPr>
-          <w:lang w:val="en-US"/>
-        </w:rPr>
+        <w:rPr/>
         <w:drawing>
           <wp:inline distT="0" distB="0" distL="0" distR="0">
             <wp:extent cx="2613660" cy="3066415"/>
@@ -11284,7 +11401,7 @@
                     </pic:cNvPicPr>
                   </pic:nvPicPr>
                   <pic:blipFill>
-                    <a:blip r:embed="rId11"/>
+                    <a:blip r:embed="rId13"/>
                     <a:stretch>
                       <a:fillRect/>
                     </a:stretch>
@@ -11365,9 +11482,7 @@
         </w:rPr>
       </w:pPr>
       <w:r>
-        <w:rPr>
-          <w:lang w:val="en-US"/>
-        </w:rPr>
+        <w:rPr/>
         <w:drawing>
           <wp:inline distT="0" distB="0" distL="0" distR="0">
             <wp:extent cx="2670810" cy="3133090"/>
@@ -11386,7 +11501,7 @@
                     </pic:cNvPicPr>
                   </pic:nvPicPr>
                   <pic:blipFill>
-                    <a:blip r:embed="rId12"/>
+                    <a:blip r:embed="rId14"/>
                     <a:stretch>
                       <a:fillRect/>
                     </a:stretch>
@@ -11453,6 +11568,7 @@
       <w:pPr>
         <w:pStyle w:val="Heading3"/>
         <w:spacing w:lineRule="auto" w:line="360" w:before="0" w:after="0"/>
+        <w:ind w:firstLine="851" w:start="0"/>
         <w:rPr>
           <w:rFonts w:ascii="Times New Roman" w:hAnsi="Times New Roman"/>
           <w:sz w:val="28"/>
@@ -11510,19 +11626,7 @@
         <w:rPr>
           <w:lang w:val="uk-UA"/>
         </w:rPr>
-        <w:t>Рисунок 4.</w:t>
-      </w:r>
-      <w:r>
-        <w:rPr>
-          <w:lang w:val="uk-UA"/>
-        </w:rPr>
-        <w:t>2</w:t>
-      </w:r>
-      <w:r>
-        <w:rPr>
-          <w:lang w:val="uk-UA"/>
-        </w:rPr>
-        <w:t xml:space="preserve"> — Вигляд розробленого веб-інтерфейсу</w:t>
+        <w:t>Рисунок 4.2 — Вигляд розробленого веб-інтерфейсу</w:t>
       </w:r>
     </w:p>
     <w:p>
@@ -11556,8 +11660,8 @@
         <w:jc w:val="both"/>
         <w:rPr/>
       </w:pPr>
-      <w:bookmarkStart w:id="33" w:name="__RefHeading___Toc2759_3933516918"/>
-      <w:bookmarkEnd w:id="33"/>
+      <w:bookmarkStart w:id="34" w:name="__RefHeading___Toc2759_3933516918"/>
+      <w:bookmarkEnd w:id="34"/>
       <w:r>
         <w:rPr/>
         <w:t>4.4 Висновок за розділом</w:t>
@@ -11588,19 +11692,17 @@
     <w:p>
       <w:pPr>
         <w:pStyle w:val="Heading1"/>
+        <w:spacing w:before="0" w:after="0"/>
+        <w:ind w:hanging="0" w:start="0"/>
         <w:rPr>
           <w:lang w:val="en-US"/>
         </w:rPr>
       </w:pPr>
-      <w:bookmarkStart w:id="34" w:name="__RefHeading___Toc2763_3933516918"/>
-      <w:bookmarkEnd w:id="34"/>
+      <w:bookmarkStart w:id="35" w:name="__RefHeading___Toc2763_3933516918"/>
+      <w:bookmarkEnd w:id="35"/>
       <w:r>
         <w:rPr/>
-        <w:t xml:space="preserve">5 </w:t>
-      </w:r>
-      <w:r>
-        <w:rPr/>
-        <w:t>КЕРІВНИЦТВО КОРИСТУВАЧА</w:t>
+        <w:t>5 КЕРІВНИЦТВО КОРИСТУВАЧА</w:t>
       </w:r>
     </w:p>
     <w:p>
@@ -11617,8 +11719,8 @@
           <w:lang w:val="uk-UA"/>
         </w:rPr>
       </w:pPr>
-      <w:bookmarkStart w:id="35" w:name="__RefHeading___Toc2765_3933516918"/>
-      <w:bookmarkEnd w:id="35"/>
+      <w:bookmarkStart w:id="36" w:name="__RefHeading___Toc2765_3933516918"/>
+      <w:bookmarkEnd w:id="36"/>
       <w:r>
         <w:rPr>
           <w:lang w:val="en-US"/>
@@ -11734,13 +11836,7 @@
         <w:rPr>
           <w:lang w:val="uk-UA"/>
         </w:rPr>
-        <w:t xml:space="preserve">1. з </w:t>
-      </w:r>
-      <w:r>
-        <w:rPr>
-          <w:lang w:val="uk-UA"/>
-        </w:rPr>
-        <w:t xml:space="preserve">теки </w:t>
+        <w:t xml:space="preserve">1. з теки </w:t>
       </w:r>
       <w:r>
         <w:rPr>
@@ -11847,7 +11943,7 @@
         </w:rPr>
         <w:t xml:space="preserve">перейти до сторінки </w:t>
       </w:r>
-      <w:hyperlink r:id="rId13">
+      <w:hyperlink r:id="rId15">
         <w:r>
           <w:rPr>
             <w:rStyle w:val="Hyperlink"/>
@@ -11894,8 +11990,8 @@
           <w:lang w:val="uk-UA"/>
         </w:rPr>
       </w:pPr>
-      <w:bookmarkStart w:id="36" w:name="__RefHeading___Toc2767_3933516918"/>
-      <w:bookmarkEnd w:id="36"/>
+      <w:bookmarkStart w:id="37" w:name="__RefHeading___Toc2767_3933516918"/>
+      <w:bookmarkEnd w:id="37"/>
       <w:r>
         <w:rPr/>
         <w:t>5.2 Звертання до програми</w:t>
@@ -11969,9 +12065,7 @@
         </w:rPr>
       </w:pPr>
       <w:r>
-        <w:rPr>
-          <w:lang w:val="uk-UA"/>
-        </w:rPr>
+        <w:rPr/>
         <w:drawing>
           <wp:inline distT="0" distB="0" distL="0" distR="0">
             <wp:extent cx="2914650" cy="695325"/>
@@ -11990,8 +12084,8 @@
                     </pic:cNvPicPr>
                   </pic:nvPicPr>
                   <pic:blipFill>
-                    <a:blip r:embed="rId14"/>
-                    <a:srcRect l="-12" t="-52" r="-12" b="-52"/>
+                    <a:blip r:embed="rId16"/>
+                    <a:srcRect l="-25" t="-104" r="-25" b="-104"/>
                     <a:stretch>
                       <a:fillRect/>
                     </a:stretch>
@@ -12135,9 +12229,7 @@
         </w:rPr>
       </w:pPr>
       <w:r>
-        <w:rPr>
-          <w:lang w:val="uk-UA"/>
-        </w:rPr>
+        <w:rPr/>
         <w:drawing>
           <wp:inline distT="0" distB="0" distL="0" distR="0">
             <wp:extent cx="2475230" cy="3829050"/>
@@ -12156,8 +12248,8 @@
                     </pic:cNvPicPr>
                   </pic:nvPicPr>
                   <pic:blipFill>
-                    <a:blip r:embed="rId15"/>
-                    <a:srcRect l="-12" t="-8" r="-12" b="-8"/>
+                    <a:blip r:embed="rId17"/>
+                    <a:srcRect l="-24" t="-16" r="-24" b="-16"/>
                     <a:stretch>
                       <a:fillRect/>
                     </a:stretch>
@@ -12267,9 +12359,7 @@
         </w:rPr>
       </w:pPr>
       <w:r>
-        <w:rPr>
-          <w:lang w:val="uk-UA"/>
-        </w:rPr>
+        <w:rPr/>
         <w:drawing>
           <wp:inline distT="0" distB="0" distL="0" distR="0">
             <wp:extent cx="2962275" cy="2162175"/>
@@ -12288,8 +12378,8 @@
                     </pic:cNvPicPr>
                   </pic:nvPicPr>
                   <pic:blipFill>
-                    <a:blip r:embed="rId16"/>
-                    <a:srcRect l="-12" t="-17" r="-12" b="-17"/>
+                    <a:blip r:embed="rId18"/>
+                    <a:srcRect l="-24" t="-33" r="-24" b="-33"/>
                     <a:stretch>
                       <a:fillRect/>
                     </a:stretch>
@@ -12338,16 +12428,17 @@
       <w:pPr>
         <w:pStyle w:val="Heading1"/>
         <w:spacing w:lineRule="auto" w:line="360" w:before="0" w:after="0"/>
+        <w:ind w:hanging="0" w:start="0"/>
         <w:rPr/>
       </w:pPr>
-      <w:bookmarkStart w:id="37" w:name="__RefHeading___Toc66122_3682473240"/>
-      <w:bookmarkStart w:id="38" w:name="_Toc31200652"/>
-      <w:bookmarkEnd w:id="37"/>
+      <w:bookmarkStart w:id="38" w:name="__RefHeading___Toc66122_3682473240"/>
+      <w:bookmarkStart w:id="39" w:name="_Toc31200652"/>
+      <w:bookmarkEnd w:id="38"/>
       <w:r>
         <w:rPr/>
         <w:t>ВИСНОВКИ</w:t>
       </w:r>
-      <w:bookmarkEnd w:id="38"/>
+      <w:bookmarkEnd w:id="39"/>
     </w:p>
     <w:p>
       <w:pPr>
@@ -12397,11 +12488,12 @@
       <w:pPr>
         <w:pStyle w:val="Heading1"/>
         <w:spacing w:lineRule="auto" w:line="360" w:before="0" w:after="0"/>
+        <w:ind w:hanging="0" w:start="0"/>
         <w:rPr/>
       </w:pPr>
-      <w:bookmarkStart w:id="39" w:name="__RefHeading___Toc66124_3682473240"/>
-      <w:bookmarkStart w:id="40" w:name="_Toc31200653"/>
-      <w:bookmarkEnd w:id="39"/>
+      <w:bookmarkStart w:id="40" w:name="__RefHeading___Toc66124_3682473240"/>
+      <w:bookmarkStart w:id="41" w:name="_Toc31200653"/>
+      <w:bookmarkEnd w:id="40"/>
       <w:r>
         <w:rPr/>
         <w:t xml:space="preserve">ПЕРЕЛІК </w:t>
@@ -12416,7 +12508,7 @@
         <w:rPr/>
         <w:t>ПОСИЛАННЯ</w:t>
       </w:r>
-      <w:bookmarkEnd w:id="40"/>
+      <w:bookmarkEnd w:id="41"/>
     </w:p>
     <w:p>
       <w:pPr>
@@ -12451,7 +12543,7 @@
         </w:rPr>
         <w:t xml:space="preserve">1. </w:t>
       </w:r>
-      <w:hyperlink r:id="rId17">
+      <w:hyperlink r:id="rId19">
         <w:r>
           <w:rPr>
             <w:rStyle w:val="Hyperlink"/>
@@ -12476,7 +12568,7 @@
         </w:rPr>
         <w:t xml:space="preserve">URL: </w:t>
       </w:r>
-      <w:hyperlink r:id="rId18">
+      <w:hyperlink r:id="rId20">
         <w:r>
           <w:rPr>
             <w:rStyle w:val="Hyperlink"/>
@@ -12524,7 +12616,7 @@
         </w:rPr>
         <w:t xml:space="preserve">2. </w:t>
       </w:r>
-      <w:hyperlink r:id="rId19">
+      <w:hyperlink r:id="rId21">
         <w:r>
           <w:rPr>
             <w:rStyle w:val="Hyperlink"/>
@@ -12549,7 +12641,7 @@
         </w:rPr>
         <w:t xml:space="preserve">URL: </w:t>
       </w:r>
-      <w:hyperlink r:id="rId20">
+      <w:hyperlink r:id="rId22">
         <w:r>
           <w:rPr>
             <w:rStyle w:val="Hyperlink"/>
@@ -12601,7 +12693,7 @@
         </w:rPr>
         <w:t xml:space="preserve">3. </w:t>
       </w:r>
-      <w:hyperlink r:id="rId21">
+      <w:hyperlink r:id="rId23">
         <w:r>
           <w:rPr>
             <w:rStyle w:val="Hyperlink"/>
@@ -12618,17 +12710,9 @@
           <w:szCs w:val="28"/>
           <w:lang w:val="en-US"/>
         </w:rPr>
-        <w:t xml:space="preserve">. </w:t>
-      </w:r>
-      <w:r>
-        <w:rPr>
-          <w:sz w:val="28"/>
-          <w:szCs w:val="28"/>
-          <w:lang w:val="en-US"/>
-        </w:rPr>
-        <w:t xml:space="preserve">URL: </w:t>
-      </w:r>
-      <w:hyperlink r:id="rId22">
+        <w:t xml:space="preserve">. URL: </w:t>
+      </w:r>
+      <w:hyperlink r:id="rId24">
         <w:r>
           <w:rPr>
             <w:rStyle w:val="Hyperlink"/>
@@ -12655,6 +12739,152 @@
         </w:rPr>
         <w:t>дата звернення: 19.01.2026)</w:t>
       </w:r>
+    </w:p>
+    <w:p>
+      <w:pPr>
+        <w:pStyle w:val="ListParagraph"/>
+        <w:widowControl/>
+        <w:suppressAutoHyphens w:val="true"/>
+        <w:bidi w:val="0"/>
+        <w:spacing w:lineRule="auto" w:line="240" w:before="0" w:after="0"/>
+        <w:ind w:firstLine="850" w:start="0" w:end="0"/>
+        <w:contextualSpacing/>
+        <w:jc w:val="start"/>
+        <w:rPr/>
+      </w:pPr>
+      <w:r>
+        <w:rPr>
+          <w:sz w:val="28"/>
+          <w:szCs w:val="28"/>
+          <w:lang w:val="uk-UA"/>
+        </w:rPr>
+        <w:t xml:space="preserve">4. </w:t>
+      </w:r>
+      <w:hyperlink r:id="rId25">
+        <w:r>
+          <w:rPr>
+            <w:rStyle w:val="Hyperlink"/>
+            <w:sz w:val="28"/>
+            <w:szCs w:val="28"/>
+          </w:rPr>
+          <w:t>Продається на RST | авто Вантажні | Купити Вантажні</w:t>
+        </w:r>
+      </w:hyperlink>
+      <w:r>
+        <w:rPr>
+          <w:sz w:val="28"/>
+          <w:szCs w:val="28"/>
+        </w:rPr>
+        <w:t xml:space="preserve">. </w:t>
+      </w:r>
+      <w:r>
+        <w:rPr>
+          <w:sz w:val="28"/>
+          <w:szCs w:val="28"/>
+          <w:lang w:val="en-US"/>
+        </w:rPr>
+        <w:t xml:space="preserve">URL: </w:t>
+      </w:r>
+      <w:hyperlink r:id="rId26">
+        <w:r>
+          <w:rPr>
+            <w:rStyle w:val="Hyperlink"/>
+            <w:sz w:val="28"/>
+            <w:szCs w:val="28"/>
+            <w:lang w:val="en-US"/>
+          </w:rPr>
+          <w:t>https://rst.ua/ukr/oldcars/?k=2&amp;task=newresults</w:t>
+        </w:r>
+      </w:hyperlink>
+      <w:r>
+        <w:rPr>
+          <w:sz w:val="28"/>
+          <w:szCs w:val="28"/>
+          <w:lang w:val="en-US"/>
+        </w:rPr>
+        <w:t>. (</w:t>
+      </w:r>
+      <w:r>
+        <w:rPr>
+          <w:sz w:val="28"/>
+          <w:szCs w:val="28"/>
+          <w:lang w:val="uk-UA"/>
+        </w:rPr>
+        <w:t>дата звернення: 28.01.2026)</w:t>
+      </w:r>
+    </w:p>
+    <w:p>
+      <w:pPr>
+        <w:pStyle w:val="ListParagraph"/>
+        <w:widowControl/>
+        <w:suppressAutoHyphens w:val="true"/>
+        <w:bidi w:val="0"/>
+        <w:spacing w:lineRule="auto" w:line="240" w:before="0" w:after="0"/>
+        <w:ind w:firstLine="850" w:start="0" w:end="0"/>
+        <w:contextualSpacing/>
+        <w:jc w:val="start"/>
+        <w:rPr/>
+      </w:pPr>
+      <w:r>
+        <w:rPr>
+          <w:sz w:val="28"/>
+          <w:szCs w:val="28"/>
+          <w:lang w:val="uk-UA"/>
+        </w:rPr>
+        <w:t xml:space="preserve">5. </w:t>
+      </w:r>
+      <w:hyperlink r:id="rId27">
+        <w:r>
+          <w:rPr>
+            <w:rStyle w:val="Hyperlink"/>
+            <w:sz w:val="28"/>
+            <w:szCs w:val="28"/>
+          </w:rPr>
+          <w:t>Вантажне авто, купити вантажівку в Україні нову і б/в на OLX</w:t>
+        </w:r>
+      </w:hyperlink>
+      <w:r>
+        <w:rPr>
+          <w:sz w:val="28"/>
+          <w:szCs w:val="28"/>
+        </w:rPr>
+        <w:t xml:space="preserve">. </w:t>
+      </w:r>
+      <w:r>
+        <w:rPr>
+          <w:sz w:val="28"/>
+          <w:szCs w:val="28"/>
+          <w:lang w:val="en-US"/>
+        </w:rPr>
+        <w:t xml:space="preserve">URL: </w:t>
+      </w:r>
+      <w:hyperlink r:id="rId28">
+        <w:r>
+          <w:rPr>
+            <w:rStyle w:val="Hyperlink"/>
+            <w:sz w:val="28"/>
+            <w:szCs w:val="28"/>
+            <w:lang w:val="en-US"/>
+          </w:rPr>
+          <w:t>https://www.olx.ua/uk/transport/gruzovye-avtomobili/?currency=UAH</w:t>
+        </w:r>
+      </w:hyperlink>
+      <w:r>
+        <w:rPr>
+          <w:sz w:val="28"/>
+          <w:szCs w:val="28"/>
+          <w:lang w:val="en-US"/>
+        </w:rPr>
+        <w:t>. (</w:t>
+      </w:r>
+      <w:r>
+        <w:rPr>
+          <w:sz w:val="28"/>
+          <w:szCs w:val="28"/>
+          <w:lang w:val="uk-UA"/>
+        </w:rPr>
+        <w:t>дата звернення: 28.01.2026)</w:t>
+      </w:r>
       <w:r>
         <w:br w:type="page"/>
       </w:r>
@@ -13117,10 +13347,12 @@
       </w:r>
     </w:p>
     <w:sectPr>
-      <w:headerReference w:type="default" r:id="rId23"/>
-      <w:headerReference w:type="first" r:id="rId24"/>
-      <w:footerReference w:type="default" r:id="rId25"/>
-      <w:footerReference w:type="first" r:id="rId26"/>
+      <w:headerReference w:type="even" r:id="rId29"/>
+      <w:headerReference w:type="default" r:id="rId30"/>
+      <w:headerReference w:type="first" r:id="rId31"/>
+      <w:footerReference w:type="even" r:id="rId32"/>
+      <w:footerReference w:type="default" r:id="rId33"/>
+      <w:footerReference w:type="first" r:id="rId34"/>
       <w:type w:val="nextPage"/>
       <w:pgSz w:w="11906" w:h="16838"/>
       <w:pgMar w:left="1701" w:right="851" w:gutter="0" w:header="567" w:top="1134" w:footer="0" w:bottom="1134"/>
@@ -13177,11 +13409,61 @@
 
 <file path=word/footer4.xml><?xml version="1.0" encoding="utf-8"?>
 <w:ftr xmlns:o="urn:schemas-microsoft-com:office:office" xmlns:r="http://schemas.openxmlformats.org/officeDocument/2006/relationships" xmlns:v="urn:schemas-microsoft-com:vml" xmlns:w="http://schemas.openxmlformats.org/wordprocessingml/2006/main" xmlns:w10="urn:schemas-microsoft-com:office:word" xmlns:wp="http://schemas.openxmlformats.org/drawingml/2006/wordprocessingDrawing" xmlns:pic="http://schemas.openxmlformats.org/drawingml/2006/picture" xmlns:wps="http://schemas.microsoft.com/office/word/2010/wordprocessingShape" xmlns:wpg="http://schemas.microsoft.com/office/word/2010/wordprocessingGroup" xmlns:mc="http://schemas.openxmlformats.org/markup-compatibility/2006" xmlns:wp14="http://schemas.microsoft.com/office/word/2010/wordprocessingDrawing" xmlns:w14="http://schemas.microsoft.com/office/word/2010/wordml" xmlns:w15="http://schemas.microsoft.com/office/word/2012/wordml" mc:Ignorable="w14 wp14 w15">
-  <w:p/>
+  <w:p>
+    <w:pPr>
+      <w:pStyle w:val="Footer"/>
+      <w:rPr/>
+    </w:pPr>
+    <w:r>
+      <w:rPr/>
+    </w:r>
+  </w:p>
+</w:ftr>
+</file>
+
+<file path=word/footer5.xml><?xml version="1.0" encoding="utf-8"?>
+<w:ftr xmlns:o="urn:schemas-microsoft-com:office:office" xmlns:r="http://schemas.openxmlformats.org/officeDocument/2006/relationships" xmlns:v="urn:schemas-microsoft-com:vml" xmlns:w="http://schemas.openxmlformats.org/wordprocessingml/2006/main" xmlns:w10="urn:schemas-microsoft-com:office:word" xmlns:wp="http://schemas.openxmlformats.org/drawingml/2006/wordprocessingDrawing" xmlns:pic="http://schemas.openxmlformats.org/drawingml/2006/picture" xmlns:wps="http://schemas.microsoft.com/office/word/2010/wordprocessingShape" xmlns:wpg="http://schemas.microsoft.com/office/word/2010/wordprocessingGroup" xmlns:mc="http://schemas.openxmlformats.org/markup-compatibility/2006" xmlns:wp14="http://schemas.microsoft.com/office/word/2010/wordprocessingDrawing" xmlns:w14="http://schemas.microsoft.com/office/word/2010/wordml" xmlns:w15="http://schemas.microsoft.com/office/word/2012/wordml" mc:Ignorable="w14 wp14 w15">
+  <w:p>
+    <w:pPr>
+      <w:pStyle w:val="Footer"/>
+      <w:rPr/>
+    </w:pPr>
+    <w:r>
+      <w:rPr/>
+    </w:r>
+  </w:p>
+</w:ftr>
+</file>
+
+<file path=word/footer6.xml><?xml version="1.0" encoding="utf-8"?>
+<w:ftr xmlns:o="urn:schemas-microsoft-com:office:office" xmlns:r="http://schemas.openxmlformats.org/officeDocument/2006/relationships" xmlns:v="urn:schemas-microsoft-com:vml" xmlns:w="http://schemas.openxmlformats.org/wordprocessingml/2006/main" xmlns:w10="urn:schemas-microsoft-com:office:word" xmlns:wp="http://schemas.openxmlformats.org/drawingml/2006/wordprocessingDrawing" xmlns:pic="http://schemas.openxmlformats.org/drawingml/2006/picture" xmlns:wps="http://schemas.microsoft.com/office/word/2010/wordprocessingShape" xmlns:wpg="http://schemas.microsoft.com/office/word/2010/wordprocessingGroup" xmlns:mc="http://schemas.openxmlformats.org/markup-compatibility/2006" xmlns:wp14="http://schemas.microsoft.com/office/word/2010/wordprocessingDrawing" xmlns:w14="http://schemas.microsoft.com/office/word/2010/wordml" xmlns:w15="http://schemas.microsoft.com/office/word/2012/wordml" mc:Ignorable="w14 wp14 w15">
+  <w:p>
+    <w:pPr>
+      <w:pStyle w:val="Footer"/>
+      <w:rPr/>
+    </w:pPr>
+    <w:r>
+      <w:rPr/>
+    </w:r>
+  </w:p>
 </w:ftr>
 </file>
 
 <file path=word/header1.xml><?xml version="1.0" encoding="utf-8"?>
+<w:hdr xmlns:o="urn:schemas-microsoft-com:office:office" xmlns:r="http://schemas.openxmlformats.org/officeDocument/2006/relationships" xmlns:v="urn:schemas-microsoft-com:vml" xmlns:w="http://schemas.openxmlformats.org/wordprocessingml/2006/main" xmlns:w10="urn:schemas-microsoft-com:office:word" xmlns:wp="http://schemas.openxmlformats.org/drawingml/2006/wordprocessingDrawing" xmlns:pic="http://schemas.openxmlformats.org/drawingml/2006/picture" xmlns:wps="http://schemas.microsoft.com/office/word/2010/wordprocessingShape" xmlns:wpg="http://schemas.microsoft.com/office/word/2010/wordprocessingGroup" xmlns:mc="http://schemas.openxmlformats.org/markup-compatibility/2006" xmlns:wp14="http://schemas.microsoft.com/office/word/2010/wordprocessingDrawing" xmlns:w14="http://schemas.microsoft.com/office/word/2010/wordml" xmlns:w15="http://schemas.microsoft.com/office/word/2012/wordml" mc:Ignorable="w14 wp14 w15">
+  <w:p>
+    <w:pPr>
+      <w:pStyle w:val="Header"/>
+      <w:rPr/>
+    </w:pPr>
+    <w:r>
+      <w:rPr/>
+    </w:r>
+  </w:p>
+</w:hdr>
+</file>
+
+<file path=word/header2.xml><?xml version="1.0" encoding="utf-8"?>
 <w:hdr xmlns:o="urn:schemas-microsoft-com:office:office" xmlns:r="http://schemas.openxmlformats.org/officeDocument/2006/relationships" xmlns:v="urn:schemas-microsoft-com:vml" xmlns:w="http://schemas.openxmlformats.org/wordprocessingml/2006/main" xmlns:w10="urn:schemas-microsoft-com:office:word" xmlns:wp="http://schemas.openxmlformats.org/drawingml/2006/wordprocessingDrawing" xmlns:pic="http://schemas.openxmlformats.org/drawingml/2006/picture" xmlns:wps="http://schemas.microsoft.com/office/word/2010/wordprocessingShape" xmlns:wpg="http://schemas.microsoft.com/office/word/2010/wordprocessingGroup" xmlns:mc="http://schemas.openxmlformats.org/markup-compatibility/2006" xmlns:wp14="http://schemas.microsoft.com/office/word/2010/wordprocessingDrawing" xmlns:w14="http://schemas.microsoft.com/office/word/2010/wordml" xmlns:w15="http://schemas.microsoft.com/office/word/2012/wordml" mc:Ignorable="w14 wp14 w15">
   <w:p>
     <w:pPr>
@@ -13239,30 +13521,35 @@
                           <w:r>
                             <w:rPr>
                               <w:rStyle w:val="PageNumber"/>
+                              <w:color w:val="000000"/>
                             </w:rPr>
                             <w:fldChar w:fldCharType="begin"/>
                           </w:r>
                           <w:r>
                             <w:rPr>
                               <w:rStyle w:val="PageNumber"/>
+                              <w:color w:val="000000"/>
                             </w:rPr>
                             <w:instrText xml:space="preserve"> PAGE </w:instrText>
                           </w:r>
                           <w:r>
                             <w:rPr>
                               <w:rStyle w:val="PageNumber"/>
+                              <w:color w:val="000000"/>
                             </w:rPr>
                             <w:fldChar w:fldCharType="separate"/>
                           </w:r>
                           <w:r>
                             <w:rPr>
                               <w:rStyle w:val="PageNumber"/>
+                              <w:color w:val="000000"/>
                             </w:rPr>
                             <w:t>3</w:t>
                           </w:r>
                           <w:r>
                             <w:rPr>
                               <w:rStyle w:val="PageNumber"/>
+                              <w:color w:val="000000"/>
                             </w:rPr>
                             <w:fldChar w:fldCharType="end"/>
                           </w:r>
@@ -13280,8 +13567,8 @@
         </mc:Choice>
         <mc:Fallback>
           <w:pict>
-            <v:rect id="shape_0" ID="Рамка2" path="m0,0l-2147483645,0l-2147483645,-2147483646l0,-2147483646xe" fillcolor="white" stroked="f" o:allowincell="f" style="position:absolute;margin-left:432.25pt;margin-top:0.05pt;width:49.55pt;height:15.95pt;mso-wrap-style:square;v-text-anchor:top;mso-position-horizontal:right;mso-position-horizontal-relative:margin">
-              <v:fill o:detectmouseclick="t" type="solid" color2="black" opacity="0"/>
+            <v:rect id="shape_0" ID="Рамка2" path="m0,0l-2147483645,0l-2147483645,-2147483646l0,-2147483646xe" stroked="f" o:allowincell="f" style="position:absolute;margin-left:432.25pt;margin-top:0.05pt;width:49.55pt;height:15.95pt;mso-wrap-style:square;v-text-anchor:top;mso-position-horizontal:right;mso-position-horizontal-relative:margin">
+              <v:fill o:detectmouseclick="t" on="false"/>
               <v:stroke color="#3465a4" joinstyle="round" endcap="flat"/>
               <v:textbox>
                 <w:txbxContent>
@@ -13293,30 +13580,35 @@
                     <w:r>
                       <w:rPr>
                         <w:rStyle w:val="PageNumber"/>
+                        <w:color w:val="000000"/>
                       </w:rPr>
                       <w:fldChar w:fldCharType="begin"/>
                     </w:r>
                     <w:r>
                       <w:rPr>
                         <w:rStyle w:val="PageNumber"/>
+                        <w:color w:val="000000"/>
                       </w:rPr>
                       <w:instrText xml:space="preserve"> PAGE </w:instrText>
                     </w:r>
                     <w:r>
                       <w:rPr>
                         <w:rStyle w:val="PageNumber"/>
+                        <w:color w:val="000000"/>
                       </w:rPr>
                       <w:fldChar w:fldCharType="separate"/>
                     </w:r>
                     <w:r>
                       <w:rPr>
                         <w:rStyle w:val="PageNumber"/>
+                        <w:color w:val="000000"/>
                       </w:rPr>
                       <w:t>3</w:t>
                     </w:r>
                     <w:r>
                       <w:rPr>
                         <w:rStyle w:val="PageNumber"/>
+                        <w:color w:val="000000"/>
                       </w:rPr>
                       <w:fldChar w:fldCharType="end"/>
                     </w:r>
@@ -13333,7 +13625,7 @@
 </w:hdr>
 </file>
 
-<file path=word/header2.xml><?xml version="1.0" encoding="utf-8"?>
+<file path=word/header3.xml><?xml version="1.0" encoding="utf-8"?>
 <w:hdr xmlns:o="urn:schemas-microsoft-com:office:office" xmlns:r="http://schemas.openxmlformats.org/officeDocument/2006/relationships" xmlns:v="urn:schemas-microsoft-com:vml" xmlns:w="http://schemas.openxmlformats.org/wordprocessingml/2006/main" xmlns:w10="urn:schemas-microsoft-com:office:word" xmlns:wp="http://schemas.openxmlformats.org/drawingml/2006/wordprocessingDrawing" xmlns:pic="http://schemas.openxmlformats.org/drawingml/2006/picture" xmlns:wps="http://schemas.microsoft.com/office/word/2010/wordprocessingShape" xmlns:wpg="http://schemas.microsoft.com/office/word/2010/wordprocessingGroup" xmlns:mc="http://schemas.openxmlformats.org/markup-compatibility/2006" xmlns:wp14="http://schemas.microsoft.com/office/word/2010/wordprocessingDrawing" xmlns:w14="http://schemas.microsoft.com/office/word/2010/wordml" xmlns:w15="http://schemas.microsoft.com/office/word/2012/wordml" mc:Ignorable="w14 wp14 w15">
   <w:p>
     <w:pPr>
@@ -13347,7 +13639,21 @@
 </w:hdr>
 </file>
 
-<file path=word/header3.xml><?xml version="1.0" encoding="utf-8"?>
+<file path=word/header4.xml><?xml version="1.0" encoding="utf-8"?>
+<w:hdr xmlns:o="urn:schemas-microsoft-com:office:office" xmlns:r="http://schemas.openxmlformats.org/officeDocument/2006/relationships" xmlns:v="urn:schemas-microsoft-com:vml" xmlns:w="http://schemas.openxmlformats.org/wordprocessingml/2006/main" xmlns:w10="urn:schemas-microsoft-com:office:word" xmlns:wp="http://schemas.openxmlformats.org/drawingml/2006/wordprocessingDrawing" xmlns:pic="http://schemas.openxmlformats.org/drawingml/2006/picture" xmlns:wps="http://schemas.microsoft.com/office/word/2010/wordprocessingShape" xmlns:wpg="http://schemas.microsoft.com/office/word/2010/wordprocessingGroup" xmlns:mc="http://schemas.openxmlformats.org/markup-compatibility/2006" xmlns:wp14="http://schemas.microsoft.com/office/word/2010/wordprocessingDrawing" xmlns:w14="http://schemas.microsoft.com/office/word/2010/wordml" xmlns:w15="http://schemas.microsoft.com/office/word/2012/wordml" mc:Ignorable="w14 wp14 w15">
+  <w:p>
+    <w:pPr>
+      <w:pStyle w:val="Header"/>
+      <w:rPr/>
+    </w:pPr>
+    <w:r>
+      <w:rPr/>
+    </w:r>
+  </w:p>
+</w:hdr>
+</file>
+
+<file path=word/header5.xml><?xml version="1.0" encoding="utf-8"?>
 <w:hdr xmlns:o="urn:schemas-microsoft-com:office:office" xmlns:r="http://schemas.openxmlformats.org/officeDocument/2006/relationships" xmlns:v="urn:schemas-microsoft-com:vml" xmlns:w="http://schemas.openxmlformats.org/wordprocessingml/2006/main" xmlns:w10="urn:schemas-microsoft-com:office:word" xmlns:wp="http://schemas.openxmlformats.org/drawingml/2006/wordprocessingDrawing" xmlns:pic="http://schemas.openxmlformats.org/drawingml/2006/picture" xmlns:wps="http://schemas.microsoft.com/office/word/2010/wordprocessingShape" xmlns:wpg="http://schemas.microsoft.com/office/word/2010/wordprocessingGroup" xmlns:mc="http://schemas.openxmlformats.org/markup-compatibility/2006" xmlns:wp14="http://schemas.microsoft.com/office/word/2010/wordprocessingDrawing" xmlns:w14="http://schemas.microsoft.com/office/word/2010/wordml" xmlns:w15="http://schemas.microsoft.com/office/word/2012/wordml" mc:Ignorable="w14 wp14 w15">
   <w:p>
     <w:pPr>
@@ -13360,7 +13666,7 @@
       <mc:AlternateContent>
         <mc:Choice Requires="wps">
           <w:drawing>
-            <wp:anchor behindDoc="1" distT="0" distB="0" distL="0" distR="0" simplePos="0" locked="0" layoutInCell="0" allowOverlap="1" relativeHeight="52">
+            <wp:anchor behindDoc="1" distT="0" distB="0" distL="0" distR="0" simplePos="0" locked="0" layoutInCell="0" allowOverlap="1" relativeHeight="54">
               <wp:simplePos x="0" y="0"/>
               <wp:positionH relativeFrom="margin">
                 <wp:align>right</wp:align>
@@ -13406,30 +13712,35 @@
                           <w:r>
                             <w:rPr>
                               <w:rStyle w:val="PageNumber"/>
+                              <w:color w:val="000000"/>
                             </w:rPr>
                             <w:fldChar w:fldCharType="begin"/>
                           </w:r>
                           <w:r>
                             <w:rPr>
                               <w:rStyle w:val="PageNumber"/>
+                              <w:color w:val="000000"/>
                             </w:rPr>
                             <w:instrText xml:space="preserve"> PAGE </w:instrText>
                           </w:r>
                           <w:r>
                             <w:rPr>
                               <w:rStyle w:val="PageNumber"/>
+                              <w:color w:val="000000"/>
                             </w:rPr>
                             <w:fldChar w:fldCharType="separate"/>
                           </w:r>
                           <w:r>
                             <w:rPr>
                               <w:rStyle w:val="PageNumber"/>
+                              <w:color w:val="000000"/>
                             </w:rPr>
-                            <w:t>27</w:t>
+                            <w:t>28</w:t>
                           </w:r>
                           <w:r>
                             <w:rPr>
                               <w:rStyle w:val="PageNumber"/>
+                              <w:color w:val="000000"/>
                             </w:rPr>
                             <w:fldChar w:fldCharType="end"/>
                           </w:r>
@@ -13447,8 +13758,8 @@
         </mc:Choice>
         <mc:Fallback>
           <w:pict>
-            <v:rect id="shape_0" ID="Рамка4" path="m0,0l-2147483645,0l-2147483645,-2147483646l0,-2147483646xe" fillcolor="white" stroked="f" o:allowincell="f" style="position:absolute;margin-left:418.05pt;margin-top:0.05pt;width:49.55pt;height:15.95pt;mso-wrap-style:square;v-text-anchor:top;mso-position-horizontal:right;mso-position-horizontal-relative:margin">
-              <v:fill o:detectmouseclick="t" type="solid" color2="black" opacity="0"/>
+            <v:rect id="shape_0" ID="Рамка4" path="m0,0l-2147483645,0l-2147483645,-2147483646l0,-2147483646xe" stroked="f" o:allowincell="f" style="position:absolute;margin-left:418.05pt;margin-top:0.05pt;width:49.55pt;height:15.95pt;mso-wrap-style:square;v-text-anchor:top;mso-position-horizontal:right;mso-position-horizontal-relative:margin">
+              <v:fill o:detectmouseclick="t" on="false"/>
               <v:stroke color="#3465a4" joinstyle="round" endcap="flat"/>
               <v:textbox>
                 <w:txbxContent>
@@ -13461,30 +13772,35 @@
                     <w:r>
                       <w:rPr>
                         <w:rStyle w:val="PageNumber"/>
+                        <w:color w:val="000000"/>
                       </w:rPr>
                       <w:fldChar w:fldCharType="begin"/>
                     </w:r>
                     <w:r>
                       <w:rPr>
                         <w:rStyle w:val="PageNumber"/>
+                        <w:color w:val="000000"/>
                       </w:rPr>
                       <w:instrText xml:space="preserve"> PAGE </w:instrText>
                     </w:r>
                     <w:r>
                       <w:rPr>
                         <w:rStyle w:val="PageNumber"/>
+                        <w:color w:val="000000"/>
                       </w:rPr>
                       <w:fldChar w:fldCharType="separate"/>
                     </w:r>
                     <w:r>
                       <w:rPr>
                         <w:rStyle w:val="PageNumber"/>
+                        <w:color w:val="000000"/>
                       </w:rPr>
-                      <w:t>27</w:t>
+                      <w:t>28</w:t>
                     </w:r>
                     <w:r>
                       <w:rPr>
                         <w:rStyle w:val="PageNumber"/>
+                        <w:color w:val="000000"/>
                       </w:rPr>
                       <w:fldChar w:fldCharType="end"/>
                     </w:r>
@@ -13501,134 +13817,173 @@
 </w:hdr>
 </file>
 
-<file path=word/header4.xml><?xml version="1.0" encoding="utf-8"?>
+<file path=word/header6.xml><?xml version="1.0" encoding="utf-8"?>
 <w:hdr xmlns:o="urn:schemas-microsoft-com:office:office" xmlns:r="http://schemas.openxmlformats.org/officeDocument/2006/relationships" xmlns:v="urn:schemas-microsoft-com:vml" xmlns:w="http://schemas.openxmlformats.org/wordprocessingml/2006/main" xmlns:w10="urn:schemas-microsoft-com:office:word" xmlns:wp="http://schemas.openxmlformats.org/drawingml/2006/wordprocessingDrawing" xmlns:pic="http://schemas.openxmlformats.org/drawingml/2006/picture" xmlns:wps="http://schemas.microsoft.com/office/word/2010/wordprocessingShape" xmlns:wpg="http://schemas.microsoft.com/office/word/2010/wordprocessingGroup" xmlns:mc="http://schemas.openxmlformats.org/markup-compatibility/2006" xmlns:wp14="http://schemas.microsoft.com/office/word/2010/wordprocessingDrawing" xmlns:w14="http://schemas.microsoft.com/office/word/2010/wordml" xmlns:w15="http://schemas.microsoft.com/office/word/2012/wordml" mc:Ignorable="w14 wp14 w15">
-  <w:p/>
+  <w:p>
+    <w:pPr>
+      <w:pStyle w:val="Header"/>
+      <w:ind w:firstLine="851" w:end="360"/>
+      <w:rPr/>
+    </w:pPr>
+    <w:r>
+      <w:rPr/>
+      <mc:AlternateContent>
+        <mc:Choice Requires="wps">
+          <w:drawing>
+            <wp:anchor behindDoc="1" distT="0" distB="0" distL="0" distR="0" simplePos="0" locked="0" layoutInCell="0" allowOverlap="1" relativeHeight="54">
+              <wp:simplePos x="0" y="0"/>
+              <wp:positionH relativeFrom="margin">
+                <wp:align>right</wp:align>
+              </wp:positionH>
+              <wp:positionV relativeFrom="paragraph">
+                <wp:posOffset>635</wp:posOffset>
+              </wp:positionV>
+              <wp:extent cx="629920" cy="203200"/>
+              <wp:effectExtent l="0" t="0" r="0" b="0"/>
+              <wp:wrapSquare wrapText="bothSides"/>
+              <wp:docPr id="16" name="Рамка4"/>
+              <a:graphic xmlns:a="http://schemas.openxmlformats.org/drawingml/2006/main">
+                <a:graphicData uri="http://schemas.microsoft.com/office/word/2010/wordprocessingShape">
+                  <wps:wsp>
+                    <wps:cNvSpPr/>
+                    <wps:spPr>
+                      <a:xfrm>
+                        <a:off x="0" y="0"/>
+                        <a:ext cx="630000" cy="203040"/>
+                      </a:xfrm>
+                      <a:prstGeom prst="rect">
+                        <a:avLst/>
+                      </a:prstGeom>
+                      <a:noFill/>
+                      <a:ln w="0">
+                        <a:noFill/>
+                      </a:ln>
+                    </wps:spPr>
+                    <wps:style>
+                      <a:lnRef idx="0"/>
+                      <a:fillRef idx="0"/>
+                      <a:effectRef idx="0"/>
+                      <a:fontRef idx="minor"/>
+                    </wps:style>
+                    <wps:txbx>
+                      <w:txbxContent>
+                        <w:p>
+                          <w:pPr>
+                            <w:pStyle w:val="Header"/>
+                            <w:ind w:hanging="0" w:start="0"/>
+                            <w:rPr/>
+                          </w:pPr>
+                          <w:r>
+                            <w:rPr>
+                              <w:rStyle w:val="PageNumber"/>
+                              <w:color w:val="000000"/>
+                            </w:rPr>
+                            <w:fldChar w:fldCharType="begin"/>
+                          </w:r>
+                          <w:r>
+                            <w:rPr>
+                              <w:rStyle w:val="PageNumber"/>
+                              <w:color w:val="000000"/>
+                            </w:rPr>
+                            <w:instrText xml:space="preserve"> PAGE </w:instrText>
+                          </w:r>
+                          <w:r>
+                            <w:rPr>
+                              <w:rStyle w:val="PageNumber"/>
+                              <w:color w:val="000000"/>
+                            </w:rPr>
+                            <w:fldChar w:fldCharType="separate"/>
+                          </w:r>
+                          <w:r>
+                            <w:rPr>
+                              <w:rStyle w:val="PageNumber"/>
+                              <w:color w:val="000000"/>
+                            </w:rPr>
+                            <w:t>28</w:t>
+                          </w:r>
+                          <w:r>
+                            <w:rPr>
+                              <w:rStyle w:val="PageNumber"/>
+                              <w:color w:val="000000"/>
+                            </w:rPr>
+                            <w:fldChar w:fldCharType="end"/>
+                          </w:r>
+                        </w:p>
+                      </w:txbxContent>
+                    </wps:txbx>
+                    <wps:bodyPr lIns="0" rIns="0" tIns="0" bIns="0" anchor="t">
+                      <a:spAutoFit/>
+                    </wps:bodyPr>
+                  </wps:wsp>
+                </a:graphicData>
+              </a:graphic>
+            </wp:anchor>
+          </w:drawing>
+        </mc:Choice>
+        <mc:Fallback>
+          <w:pict>
+            <v:rect id="shape_0" ID="Рамка4" path="m0,0l-2147483645,0l-2147483645,-2147483646l0,-2147483646xe" stroked="f" o:allowincell="f" style="position:absolute;margin-left:418.05pt;margin-top:0.05pt;width:49.55pt;height:15.95pt;mso-wrap-style:square;v-text-anchor:top;mso-position-horizontal:right;mso-position-horizontal-relative:margin">
+              <v:fill o:detectmouseclick="t" on="false"/>
+              <v:stroke color="#3465a4" joinstyle="round" endcap="flat"/>
+              <v:textbox>
+                <w:txbxContent>
+                  <w:p>
+                    <w:pPr>
+                      <w:pStyle w:val="Header"/>
+                      <w:ind w:hanging="0" w:start="0"/>
+                      <w:rPr/>
+                    </w:pPr>
+                    <w:r>
+                      <w:rPr>
+                        <w:rStyle w:val="PageNumber"/>
+                        <w:color w:val="000000"/>
+                      </w:rPr>
+                      <w:fldChar w:fldCharType="begin"/>
+                    </w:r>
+                    <w:r>
+                      <w:rPr>
+                        <w:rStyle w:val="PageNumber"/>
+                        <w:color w:val="000000"/>
+                      </w:rPr>
+                      <w:instrText xml:space="preserve"> PAGE </w:instrText>
+                    </w:r>
+                    <w:r>
+                      <w:rPr>
+                        <w:rStyle w:val="PageNumber"/>
+                        <w:color w:val="000000"/>
+                      </w:rPr>
+                      <w:fldChar w:fldCharType="separate"/>
+                    </w:r>
+                    <w:r>
+                      <w:rPr>
+                        <w:rStyle w:val="PageNumber"/>
+                        <w:color w:val="000000"/>
+                      </w:rPr>
+                      <w:t>28</w:t>
+                    </w:r>
+                    <w:r>
+                      <w:rPr>
+                        <w:rStyle w:val="PageNumber"/>
+                        <w:color w:val="000000"/>
+                      </w:rPr>
+                      <w:fldChar w:fldCharType="end"/>
+                    </w:r>
+                  </w:p>
+                </w:txbxContent>
+              </v:textbox>
+              <w10:wrap type="square"/>
+            </v:rect>
+          </w:pict>
+        </mc:Fallback>
+      </mc:AlternateContent>
+    </w:r>
+  </w:p>
 </w:hdr>
 </file>
 
 <file path=word/numbering.xml><?xml version="1.0" encoding="utf-8"?>
 <w:numbering xmlns:w="http://schemas.openxmlformats.org/wordprocessingml/2006/main" xmlns:o="urn:schemas-microsoft-com:office:office" xmlns:r="http://schemas.openxmlformats.org/officeDocument/2006/relationships" xmlns:v="urn:schemas-microsoft-com:vml" xmlns:mc="http://schemas.openxmlformats.org/markup-compatibility/2006" xmlns:w14="http://schemas.microsoft.com/office/word/2010/wordml" mc:Ignorable="w14">
   <w:abstractNum w:abstractNumId="1">
-    <w:lvl w:ilvl="0">
-      <w:start w:val="1"/>
-      <w:numFmt w:val="none"/>
-      <w:suff w:val="nothing"/>
-      <w:lvlText w:val="%1"/>
-      <w:lvlJc w:val="start"/>
-      <w:pPr>
-        <w:tabs>
-          <w:tab w:val="num" w:pos="0"/>
-        </w:tabs>
-        <w:ind w:start="0" w:hanging="0"/>
-      </w:pPr>
-    </w:lvl>
-    <w:lvl w:ilvl="1">
-      <w:start w:val="1"/>
-      <w:numFmt w:val="none"/>
-      <w:suff w:val="nothing"/>
-      <w:lvlText w:val="%2"/>
-      <w:lvlJc w:val="start"/>
-      <w:pPr>
-        <w:tabs>
-          <w:tab w:val="num" w:pos="0"/>
-        </w:tabs>
-        <w:ind w:start="0" w:hanging="0"/>
-      </w:pPr>
-    </w:lvl>
-    <w:lvl w:ilvl="2">
-      <w:start w:val="1"/>
-      <w:numFmt w:val="none"/>
-      <w:suff w:val="nothing"/>
-      <w:lvlText w:val="%3"/>
-      <w:lvlJc w:val="start"/>
-      <w:pPr>
-        <w:tabs>
-          <w:tab w:val="num" w:pos="0"/>
-        </w:tabs>
-        <w:ind w:start="0" w:hanging="0"/>
-      </w:pPr>
-    </w:lvl>
-    <w:lvl w:ilvl="3">
-      <w:start w:val="1"/>
-      <w:numFmt w:val="none"/>
-      <w:suff w:val="nothing"/>
-      <w:lvlText w:val="%4"/>
-      <w:lvlJc w:val="start"/>
-      <w:pPr>
-        <w:tabs>
-          <w:tab w:val="num" w:pos="0"/>
-        </w:tabs>
-        <w:ind w:start="0" w:hanging="0"/>
-      </w:pPr>
-    </w:lvl>
-    <w:lvl w:ilvl="4">
-      <w:start w:val="1"/>
-      <w:numFmt w:val="none"/>
-      <w:suff w:val="nothing"/>
-      <w:lvlText w:val="%5"/>
-      <w:lvlJc w:val="start"/>
-      <w:pPr>
-        <w:tabs>
-          <w:tab w:val="num" w:pos="0"/>
-        </w:tabs>
-        <w:ind w:start="0" w:hanging="0"/>
-      </w:pPr>
-    </w:lvl>
-    <w:lvl w:ilvl="5">
-      <w:start w:val="1"/>
-      <w:numFmt w:val="none"/>
-      <w:suff w:val="nothing"/>
-      <w:lvlText w:val="%6"/>
-      <w:lvlJc w:val="start"/>
-      <w:pPr>
-        <w:tabs>
-          <w:tab w:val="num" w:pos="0"/>
-        </w:tabs>
-        <w:ind w:start="0" w:hanging="0"/>
-      </w:pPr>
-    </w:lvl>
-    <w:lvl w:ilvl="6">
-      <w:start w:val="1"/>
-      <w:numFmt w:val="none"/>
-      <w:suff w:val="nothing"/>
-      <w:lvlText w:val="%7"/>
-      <w:lvlJc w:val="start"/>
-      <w:pPr>
-        <w:tabs>
-          <w:tab w:val="num" w:pos="0"/>
-        </w:tabs>
-        <w:ind w:start="0" w:hanging="0"/>
-      </w:pPr>
-    </w:lvl>
-    <w:lvl w:ilvl="7">
-      <w:start w:val="1"/>
-      <w:numFmt w:val="none"/>
-      <w:suff w:val="nothing"/>
-      <w:lvlText w:val="%8"/>
-      <w:lvlJc w:val="start"/>
-      <w:pPr>
-        <w:tabs>
-          <w:tab w:val="num" w:pos="0"/>
-        </w:tabs>
-        <w:ind w:start="0" w:hanging="0"/>
-      </w:pPr>
-    </w:lvl>
-    <w:lvl w:ilvl="8">
-      <w:start w:val="1"/>
-      <w:numFmt w:val="none"/>
-      <w:suff w:val="nothing"/>
-      <w:lvlText w:val="%9"/>
-      <w:lvlJc w:val="start"/>
-      <w:pPr>
-        <w:tabs>
-          <w:tab w:val="num" w:pos="0"/>
-        </w:tabs>
-        <w:ind w:start="0" w:hanging="0"/>
-      </w:pPr>
-    </w:lvl>
-  </w:abstractNum>
-  <w:abstractNum w:abstractNumId="2">
     <w:lvl w:ilvl="0">
       <w:start w:val="1"/>
       <w:numFmt w:val="bullet"/>
@@ -13747,6 +14102,125 @@
         <w:ind w:start="3600" w:hanging="360"/>
       </w:pPr>
       <w:rPr/>
+    </w:lvl>
+  </w:abstractNum>
+  <w:abstractNum w:abstractNumId="2">
+    <w:lvl w:ilvl="0">
+      <w:start w:val="1"/>
+      <w:numFmt w:val="none"/>
+      <w:suff w:val="nothing"/>
+      <w:lvlText w:val=""/>
+      <w:lvlJc w:val="start"/>
+      <w:pPr>
+        <w:tabs>
+          <w:tab w:val="num" w:pos="0"/>
+        </w:tabs>
+        <w:ind w:start="0" w:hanging="0"/>
+      </w:pPr>
+    </w:lvl>
+    <w:lvl w:ilvl="1">
+      <w:start w:val="1"/>
+      <w:numFmt w:val="none"/>
+      <w:suff w:val="nothing"/>
+      <w:lvlText w:val=""/>
+      <w:lvlJc w:val="start"/>
+      <w:pPr>
+        <w:tabs>
+          <w:tab w:val="num" w:pos="0"/>
+        </w:tabs>
+        <w:ind w:start="0" w:hanging="0"/>
+      </w:pPr>
+    </w:lvl>
+    <w:lvl w:ilvl="2">
+      <w:start w:val="1"/>
+      <w:numFmt w:val="none"/>
+      <w:suff w:val="nothing"/>
+      <w:lvlText w:val=""/>
+      <w:lvlJc w:val="start"/>
+      <w:pPr>
+        <w:tabs>
+          <w:tab w:val="num" w:pos="0"/>
+        </w:tabs>
+        <w:ind w:start="0" w:hanging="0"/>
+      </w:pPr>
+    </w:lvl>
+    <w:lvl w:ilvl="3">
+      <w:start w:val="1"/>
+      <w:numFmt w:val="none"/>
+      <w:suff w:val="nothing"/>
+      <w:lvlText w:val=""/>
+      <w:lvlJc w:val="start"/>
+      <w:pPr>
+        <w:tabs>
+          <w:tab w:val="num" w:pos="0"/>
+        </w:tabs>
+        <w:ind w:start="0" w:hanging="0"/>
+      </w:pPr>
+    </w:lvl>
+    <w:lvl w:ilvl="4">
+      <w:start w:val="1"/>
+      <w:numFmt w:val="none"/>
+      <w:suff w:val="nothing"/>
+      <w:lvlText w:val=""/>
+      <w:lvlJc w:val="start"/>
+      <w:pPr>
+        <w:tabs>
+          <w:tab w:val="num" w:pos="0"/>
+        </w:tabs>
+        <w:ind w:start="0" w:hanging="0"/>
+      </w:pPr>
+    </w:lvl>
+    <w:lvl w:ilvl="5">
+      <w:start w:val="1"/>
+      <w:numFmt w:val="none"/>
+      <w:suff w:val="nothing"/>
+      <w:lvlText w:val=""/>
+      <w:lvlJc w:val="start"/>
+      <w:pPr>
+        <w:tabs>
+          <w:tab w:val="num" w:pos="0"/>
+        </w:tabs>
+        <w:ind w:start="0" w:hanging="0"/>
+      </w:pPr>
+    </w:lvl>
+    <w:lvl w:ilvl="6">
+      <w:start w:val="1"/>
+      <w:numFmt w:val="none"/>
+      <w:suff w:val="nothing"/>
+      <w:lvlText w:val=""/>
+      <w:lvlJc w:val="start"/>
+      <w:pPr>
+        <w:tabs>
+          <w:tab w:val="num" w:pos="0"/>
+        </w:tabs>
+        <w:ind w:start="0" w:hanging="0"/>
+      </w:pPr>
+    </w:lvl>
+    <w:lvl w:ilvl="7">
+      <w:start w:val="1"/>
+      <w:numFmt w:val="none"/>
+      <w:suff w:val="nothing"/>
+      <w:lvlText w:val=""/>
+      <w:lvlJc w:val="start"/>
+      <w:pPr>
+        <w:tabs>
+          <w:tab w:val="num" w:pos="0"/>
+        </w:tabs>
+        <w:ind w:start="0" w:hanging="0"/>
+      </w:pPr>
+    </w:lvl>
+    <w:lvl w:ilvl="8">
+      <w:start w:val="1"/>
+      <w:numFmt w:val="none"/>
+      <w:suff w:val="nothing"/>
+      <w:lvlText w:val=""/>
+      <w:lvlJc w:val="start"/>
+      <w:pPr>
+        <w:tabs>
+          <w:tab w:val="num" w:pos="0"/>
+        </w:tabs>
+        <w:ind w:start="0" w:hanging="0"/>
+      </w:pPr>
     </w:lvl>
   </w:abstractNum>
   <w:num w:numId="1">
@@ -13779,9 +14253,7 @@
     <w:pPr>
       <w:widowControl/>
       <w:suppressAutoHyphens w:val="true"/>
-      <w:kinsoku w:val="true"/>
-      <w:overflowPunct w:val="true"/>
-      <w:autoSpaceDE w:val="true"/>
+      <w:overflowPunct w:val="false"/>
       <w:bidi w:val="0"/>
       <w:spacing w:lineRule="auto" w:line="360" w:before="0" w:after="0"/>
       <w:ind w:firstLine="851"/>
@@ -13945,13 +14417,13 @@
     <w:qFormat/>
     <w:rPr/>
   </w:style>
-  <w:style w:type="character" w:styleId="user">
-    <w:name w:val="Посилання покажчика (user)"/>
+  <w:style w:type="character" w:styleId="Style9">
+    <w:name w:val="Посилання покажчика"/>
     <w:qFormat/>
     <w:rPr/>
   </w:style>
-  <w:style w:type="character" w:styleId="Style9">
-    <w:name w:val="Посилання покажчика"/>
+  <w:style w:type="character" w:styleId="user">
+    <w:name w:val="Посилання покажчика (user)"/>
     <w:qFormat/>
     <w:rPr/>
   </w:style>
@@ -14052,15 +14524,15 @@
       <w:rFonts w:cs="Lucida Sans"/>
     </w:rPr>
   </w:style>
-  <w:style w:type="paragraph" w:styleId="user3">
-    <w:name w:val="Верхній і нижній колонтитули (user)"/>
+  <w:style w:type="paragraph" w:styleId="Style12">
+    <w:name w:val="Верхній і нижній колонтитули"/>
     <w:basedOn w:val="Normal"/>
     <w:qFormat/>
     <w:pPr/>
     <w:rPr/>
   </w:style>
-  <w:style w:type="paragraph" w:styleId="Style12">
-    <w:name w:val="Верхній і нижній колонтитули"/>
+  <w:style w:type="paragraph" w:styleId="user3">
+    <w:name w:val="Верхній і нижній колонтитули (user)"/>
     <w:basedOn w:val="Normal"/>
     <w:qFormat/>
     <w:pPr/>
@@ -14096,9 +14568,7 @@
     <w:pPr>
       <w:widowControl w:val="false"/>
       <w:suppressAutoHyphens w:val="true"/>
-      <w:kinsoku w:val="true"/>
-      <w:overflowPunct w:val="true"/>
-      <w:autoSpaceDE w:val="true"/>
+      <w:overflowPunct w:val="false"/>
       <w:bidi w:val="0"/>
       <w:spacing w:before="220" w:after="0"/>
       <w:ind w:hanging="20" w:start="40"/>
@@ -14118,7 +14588,7 @@
     <w:basedOn w:val="Normal"/>
     <w:qFormat/>
     <w:pPr>
-      <w:shd w:fill="000080" w:val="clear"/>
+      <w:shd w:val="clear" w:fill="000080"/>
     </w:pPr>
     <w:rPr>
       <w:rFonts w:ascii="Tahoma" w:hAnsi="Tahoma" w:cs="Tahoma"/>
@@ -14167,7 +14637,7 @@
     <w:pPr>
       <w:numPr>
         <w:ilvl w:val="0"/>
-        <w:numId w:val="2"/>
+        <w:numId w:val="1"/>
       </w:numPr>
     </w:pPr>
     <w:rPr>
@@ -14206,9 +14676,7 @@
     <w:pPr>
       <w:widowControl/>
       <w:suppressAutoHyphens w:val="true"/>
-      <w:kinsoku w:val="true"/>
-      <w:overflowPunct w:val="true"/>
-      <w:autoSpaceDE w:val="true"/>
+      <w:overflowPunct w:val="false"/>
       <w:bidi w:val="0"/>
       <w:spacing w:before="0" w:after="0"/>
       <w:jc w:val="start"/>
@@ -14279,6 +14747,13 @@
       <w:sz w:val="24"/>
     </w:rPr>
   </w:style>
+  <w:style w:type="paragraph" w:styleId="Style13">
+    <w:name w:val="Вміст рамки"/>
+    <w:basedOn w:val="Normal"/>
+    <w:qFormat/>
+    <w:pPr/>
+    <w:rPr/>
+  </w:style>
   <w:style w:type="paragraph" w:styleId="user4">
     <w:name w:val="Вміст рамки (user)"/>
     <w:basedOn w:val="Normal"/>
@@ -14286,15 +14761,8 @@
     <w:pPr/>
     <w:rPr/>
   </w:style>
-  <w:style w:type="paragraph" w:styleId="Style13">
-    <w:name w:val="Вміст рамки"/>
-    <w:basedOn w:val="Normal"/>
-    <w:qFormat/>
-    <w:pPr/>
-    <w:rPr/>
-  </w:style>
-  <w:style w:type="paragraph" w:styleId="Style14">
-    <w:name w:val="Вміст таблиці"/>
+  <w:style w:type="paragraph" w:styleId="user5">
+    <w:name w:val="Вміст таблиці (user)"/>
     <w:basedOn w:val="Normal"/>
     <w:qFormat/>
     <w:pPr>
@@ -14331,8 +14799,8 @@
       <w:sz w:val="28"/>
     </w:rPr>
   </w:style>
-  <w:style w:type="numbering" w:styleId="user5">
-    <w:name w:val="Без маркерів (user)"/>
+  <w:style w:type="numbering" w:styleId="Style14">
+    <w:name w:val="Без маркерів"/>
     <w:qFormat/>
   </w:style>
 </w:styles>

</xml_diff>